<commit_message>
Add cover page, move repository link to Resources, fix page breaks
- Cover page: title, submitted to Imtiaz Riad (Co-Founder, Authentic Four
  Technology), submitted by Rimjhim Dey, date
- Repository link moved from the top to a Resources section at the end,
  with the dataset and WHO catalogue links and reproduction steps
- Appendix starts on a new page so its heading stays with the table;
  headings and captions kept with the content that follows (PDF and Word)
- Appendix table columns renamed to match the other tables
</commit_message>
<xml_diff>
--- a/report/report.docx
+++ b/report/report.docx
@@ -2,10 +2,23 @@
 <file path=word/document.xml><?xml version="1.0" encoding="utf-8"?>
 <w:document xmlns:w="http://schemas.openxmlformats.org/wordprocessingml/2006/main" xmlns:m="http://schemas.openxmlformats.org/officeDocument/2006/math" xmlns:r="http://schemas.openxmlformats.org/officeDocument/2006/relationships" xmlns:o="urn:schemas-microsoft-com:office:office" xmlns:v="urn:schemas-microsoft-com:vml" xmlns:w10="urn:schemas-microsoft-com:office:word" xmlns:a="http://schemas.openxmlformats.org/drawingml/2006/main" xmlns:pic="http://schemas.openxmlformats.org/drawingml/2006/picture" xmlns:wp="http://schemas.openxmlformats.org/drawingml/2006/wordprocessingDrawing">
   <w:body>
-    <w:bookmarkStart w:id="46" w:name="X29b884abb6868d6f67506f8aa2f6381a63affbf"/>
+    <w:p>
+      <w:pPr>
+        <w:pStyle w:val="FirstParagraph"/>
+        <w:spacing w:after="120" w:before="1600"/>
+        <w:jc w:val="center"/>
+      </w:pPr>
+      <w:r>
+        <w:t xml:space="preserve">Research Report</w:t>
+      </w:r>
+    </w:p>
+    <w:bookmarkStart w:id="9" w:name="X29b884abb6868d6f67506f8aa2f6381a63affbf"/>
     <w:p>
       <w:pPr>
         <w:pStyle w:val="Heading1"/>
+        <w:keepNext/>
+        <w:spacing w:after="120"/>
+        <w:jc w:val="center"/>
       </w:pPr>
       <w:r>
         <w:t xml:space="preserve">Geographic Transportability of Genome-Based Antibiotic Resistance Prediction in</w:t>
@@ -27,27 +40,99 @@
     <w:p>
       <w:pPr>
         <w:pStyle w:val="FirstParagraph"/>
+        <w:spacing w:after="1200"/>
+        <w:jc w:val="center"/>
       </w:pPr>
       <w:r>
-        <w:t xml:space="preserve">Rimjhim Dey · Thesis Course, 8th Semester · October 2026</w:t>
+        <w:t xml:space="preserve">Research Track</w:t>
+      </w:r>
+    </w:p>
+    <w:p>
+      <w:pPr>
+        <w:pStyle w:val="BodyText"/>
+        <w:spacing w:after="120" w:before="720"/>
+        <w:jc w:val="center"/>
+      </w:pPr>
+      <w:r>
+        <w:rPr>
+          <w:caps/>
+          <w:sz w:val="20"/>
+        </w:rPr>
+        <w:t xml:space="preserve">Submitted to</w:t>
+      </w:r>
+    </w:p>
+    <w:p>
+      <w:pPr>
+        <w:pStyle w:val="BodyText"/>
+        <w:spacing w:after="120"/>
+        <w:jc w:val="center"/>
+      </w:pPr>
+      <w:r>
+        <w:rPr>
+          <w:b/>
+          <w:bCs/>
+        </w:rPr>
+        <w:t xml:space="preserve">Imtiaz Riad</w:t>
       </w:r>
       <w:r>
         <w:br/>
       </w:r>
       <w:r>
-        <w:t xml:space="preserve">Code and data pipeline:</w:t>
-      </w:r>
-      <w:r>
-        <w:t xml:space="preserve"> </w:t>
-      </w:r>
-      <w:hyperlink r:id="rId9">
-        <w:r>
-          <w:rPr>
-            <w:rStyle w:val="Hyperlink"/>
-          </w:rPr>
-          <w:t xml:space="preserve">github.com/RimjhimD/Genome-Based-Antibiotic-Resistance-Prediction-TB</w:t>
-        </w:r>
-      </w:hyperlink>
+        <w:t xml:space="preserve">Co-Founder</w:t>
+      </w:r>
+      <w:r>
+        <w:br/>
+      </w:r>
+      <w:r>
+        <w:t xml:space="preserve">Authentic Four Technology</w:t>
+      </w:r>
+    </w:p>
+    <w:p>
+      <w:pPr>
+        <w:pStyle w:val="BodyText"/>
+        <w:spacing w:after="120" w:before="720"/>
+        <w:jc w:val="center"/>
+      </w:pPr>
+      <w:r>
+        <w:rPr>
+          <w:caps/>
+          <w:sz w:val="20"/>
+        </w:rPr>
+        <w:t xml:space="preserve">Submitted by</w:t>
+      </w:r>
+    </w:p>
+    <w:p>
+      <w:pPr>
+        <w:pStyle w:val="BodyText"/>
+        <w:spacing w:after="120"/>
+        <w:jc w:val="center"/>
+      </w:pPr>
+      <w:r>
+        <w:rPr>
+          <w:b/>
+          <w:bCs/>
+        </w:rPr>
+        <w:t xml:space="preserve">Rimjhim Dey</w:t>
+      </w:r>
+    </w:p>
+    <w:p>
+      <w:pPr>
+        <w:pStyle w:val="BodyText"/>
+        <w:spacing w:after="120" w:before="1400"/>
+        <w:jc w:val="center"/>
+      </w:pPr>
+      <w:r>
+        <w:t xml:space="preserve">4 October 2026</w:t>
+      </w:r>
+    </w:p>
+    <w:bookmarkEnd w:id="9"/>
+    <w:p>
+      <w:pPr>
+        <w:pStyle w:val="BodyText"/>
+      </w:pPr>
+      <w:r>
+        <w:br w:type="page"/>
+      </w:r>
     </w:p>
     <w:p>
       <w:pPr>
@@ -371,6 +456,7 @@
     <w:p>
       <w:pPr>
         <w:pStyle w:val="Heading2"/>
+        <w:keepNext/>
       </w:pPr>
       <w:r>
         <w:t xml:space="preserve">1. Introduction</w:t>
@@ -533,6 +619,7 @@
     <w:p>
       <w:pPr>
         <w:pStyle w:val="Heading2"/>
+        <w:keepNext/>
       </w:pPr>
       <w:r>
         <w:t xml:space="preserve">2. Related work</w:t>
@@ -599,6 +686,7 @@
     <w:p>
       <w:pPr>
         <w:pStyle w:val="Heading2"/>
+        <w:keepNext/>
       </w:pPr>
       <w:r>
         <w:t xml:space="preserve">3. Data</w:t>
@@ -814,6 +902,7 @@
     <w:p>
       <w:pPr>
         <w:pStyle w:val="CaptionedFigure"/>
+        <w:keepNext/>
       </w:pPr>
       <w:r>
         <w:drawing>
@@ -871,6 +960,7 @@
     <w:p>
       <w:pPr>
         <w:pStyle w:val="Heading2"/>
+        <w:keepNext/>
       </w:pPr>
       <w:r>
         <w:t xml:space="preserve">4. Methods</w:t>
@@ -880,6 +970,7 @@
     <w:p>
       <w:pPr>
         <w:pStyle w:val="Heading3"/>
+        <w:keepNext/>
       </w:pPr>
       <w:r>
         <w:t xml:space="preserve">4.1 Features</w:t>
@@ -974,6 +1065,7 @@
     <w:p>
       <w:pPr>
         <w:pStyle w:val="Heading3"/>
+        <w:keepNext/>
       </w:pPr>
       <w:r>
         <w:t xml:space="preserve">4.2 Leakage control</w:t>
@@ -1034,6 +1126,7 @@
     <w:p>
       <w:pPr>
         <w:pStyle w:val="Heading3"/>
+        <w:keepNext/>
       </w:pPr>
       <w:r>
         <w:t xml:space="preserve">4.3 Models</w:t>
@@ -1076,6 +1169,7 @@
     <w:p>
       <w:pPr>
         <w:pStyle w:val="Heading3"/>
+        <w:keepNext/>
       </w:pPr>
       <w:r>
         <w:t xml:space="preserve">4.4 Evaluation protocols</w:t>
@@ -1208,6 +1302,7 @@
     <w:p>
       <w:pPr>
         <w:pStyle w:val="Heading3"/>
+        <w:keepNext/>
       </w:pPr>
       <w:r>
         <w:t xml:space="preserve">4.5 WHO catalogue benchmark</w:t>
@@ -1251,6 +1346,7 @@
     <w:p>
       <w:pPr>
         <w:pStyle w:val="Heading2"/>
+        <w:keepNext/>
       </w:pPr>
       <w:r>
         <w:t xml:space="preserve">5. Results</w:t>
@@ -1260,6 +1356,7 @@
     <w:p>
       <w:pPr>
         <w:pStyle w:val="Heading3"/>
+        <w:keepNext/>
       </w:pPr>
       <w:r>
         <w:t xml:space="preserve">5.1 Aggregate performance transfers</w:t>
@@ -1336,6 +1433,7 @@
     <w:p>
       <w:pPr>
         <w:pStyle w:val="BodyText"/>
+        <w:keepNext/>
       </w:pPr>
       <w:r>
         <w:rPr>
@@ -3028,6 +3126,7 @@
     <w:p>
       <w:pPr>
         <w:pStyle w:val="CaptionedFigure"/>
+        <w:keepNext/>
       </w:pPr>
       <w:r>
         <w:drawing>
@@ -3115,6 +3214,7 @@
     <w:p>
       <w:pPr>
         <w:pStyle w:val="CaptionedFigure"/>
+        <w:keepNext/>
       </w:pPr>
       <w:r>
         <w:drawing>
@@ -3178,6 +3278,7 @@
     <w:p>
       <w:pPr>
         <w:pStyle w:val="Heading3"/>
+        <w:keepNext/>
       </w:pPr>
       <w:r>
         <w:t xml:space="preserve">5.2 Lineages 1 and 3 are where resistance is missed</w:t>
@@ -3334,6 +3435,7 @@
     <w:p>
       <w:pPr>
         <w:pStyle w:val="BodyText"/>
+        <w:keepNext/>
       </w:pPr>
       <w:r>
         <w:rPr>
@@ -7162,6 +7264,7 @@
     <w:p>
       <w:pPr>
         <w:pStyle w:val="CaptionedFigure"/>
+        <w:keepNext/>
       </w:pPr>
       <w:r>
         <w:drawing>
@@ -7219,6 +7322,7 @@
     <w:p>
       <w:pPr>
         <w:pStyle w:val="Heading3"/>
+        <w:keepNext/>
       </w:pPr>
       <w:r>
         <w:t xml:space="preserve">5.3 Leave-one-country-out</w:t>
@@ -7283,6 +7387,7 @@
     <w:p>
       <w:pPr>
         <w:pStyle w:val="BodyText"/>
+        <w:keepNext/>
       </w:pPr>
       <w:r>
         <w:rPr>
@@ -8903,6 +9008,7 @@
     <w:p>
       <w:pPr>
         <w:pStyle w:val="CaptionedFigure"/>
+        <w:keepNext/>
       </w:pPr>
       <w:r>
         <w:drawing>
@@ -8960,6 +9066,7 @@
     <w:p>
       <w:pPr>
         <w:pStyle w:val="Heading3"/>
+        <w:keepNext/>
       </w:pPr>
       <w:r>
         <w:t xml:space="preserve">5.4 What the missed isolates carry</w:t>
@@ -9000,6 +9107,7 @@
     <w:p>
       <w:pPr>
         <w:pStyle w:val="BodyText"/>
+        <w:keepNext/>
       </w:pPr>
       <w:r>
         <w:rPr>
@@ -9931,6 +10039,7 @@
     <w:p>
       <w:pPr>
         <w:pStyle w:val="BodyText"/>
+        <w:keepNext/>
       </w:pPr>
       <w:r>
         <w:rPr>
@@ -11447,6 +11556,7 @@
     <w:p>
       <w:pPr>
         <w:pStyle w:val="Heading3"/>
+        <w:keepNext/>
       </w:pPr>
       <w:r>
         <w:t xml:space="preserve">5.5 Robustness: lineage as a feature</w:t>
@@ -11499,6 +11609,7 @@
     <w:p>
       <w:pPr>
         <w:pStyle w:val="BodyText"/>
+        <w:keepNext/>
       </w:pPr>
       <w:r>
         <w:rPr>
@@ -13855,6 +13966,7 @@
     <w:p>
       <w:pPr>
         <w:pStyle w:val="Heading2"/>
+        <w:keepNext/>
       </w:pPr>
       <w:r>
         <w:t xml:space="preserve">6. Discussion</w:t>
@@ -14023,6 +14135,7 @@
     <w:p>
       <w:pPr>
         <w:pStyle w:val="Heading2"/>
+        <w:keepNext/>
       </w:pPr>
       <w:r>
         <w:t xml:space="preserve">7. Limitations</w:t>
@@ -14165,6 +14278,7 @@
     <w:p>
       <w:pPr>
         <w:pStyle w:val="Heading2"/>
+        <w:keepNext/>
       </w:pPr>
       <w:r>
         <w:t xml:space="preserve">8. Conclusion and future work</w:t>
@@ -14237,163 +14351,11 @@
       </w:r>
     </w:p>
     <w:bookmarkEnd w:id="42"/>
-    <w:bookmarkStart w:id="43" w:name="reproducibility"/>
+    <w:bookmarkStart w:id="43" w:name="references"/>
     <w:p>
       <w:pPr>
         <w:pStyle w:val="Heading2"/>
-      </w:pPr>
-      <w:r>
-        <w:t xml:space="preserve">Reproducibility</w:t>
-      </w:r>
-    </w:p>
-    <w:p>
-      <w:pPr>
-        <w:pStyle w:val="FirstParagraph"/>
-      </w:pPr>
-      <w:r>
-        <w:t xml:space="preserve">All code is in the repository.</w:t>
-      </w:r>
-      <w:r>
-        <w:t xml:space="preserve"> </w:t>
-      </w:r>
-      <w:r>
-        <w:rPr>
-          <w:rStyle w:val="VerbatimChar"/>
-        </w:rPr>
-        <w:t xml:space="preserve">bash scripts/fetch_data.sh --mutations</w:t>
-      </w:r>
-      <w:r>
-        <w:t xml:space="preserve"> </w:t>
-      </w:r>
-      <w:r>
-        <w:t xml:space="preserve">downloads the data;</w:t>
-      </w:r>
-      <w:r>
-        <w:t xml:space="preserve"> </w:t>
-      </w:r>
-      <w:r>
-        <w:rPr>
-          <w:rStyle w:val="VerbatimChar"/>
-        </w:rPr>
-        <w:t xml:space="preserve">pip install -r requirements.txt</w:t>
-      </w:r>
-      <w:r>
-        <w:t xml:space="preserve"> </w:t>
-      </w:r>
-      <w:r>
-        <w:t xml:space="preserve">installs the exact library</w:t>
-      </w:r>
-      <w:r>
-        <w:t xml:space="preserve"> </w:t>
-      </w:r>
-      <w:r>
-        <w:t xml:space="preserve">versions; scripts</w:t>
-      </w:r>
-      <w:r>
-        <w:t xml:space="preserve"> </w:t>
-      </w:r>
-      <w:r>
-        <w:rPr>
-          <w:rStyle w:val="VerbatimChar"/>
-        </w:rPr>
-        <w:t xml:space="preserve">01_prepare.py</w:t>
-      </w:r>
-      <w:r>
-        <w:t xml:space="preserve"> </w:t>
-      </w:r>
-      <w:r>
-        <w:t xml:space="preserve">to</w:t>
-      </w:r>
-      <w:r>
-        <w:t xml:space="preserve"> </w:t>
-      </w:r>
-      <w:r>
-        <w:rPr>
-          <w:rStyle w:val="VerbatimChar"/>
-        </w:rPr>
-        <w:t xml:space="preserve">07_report.py</w:t>
-      </w:r>
-      <w:r>
-        <w:t xml:space="preserve"> </w:t>
-      </w:r>
-      <w:r>
-        <w:t xml:space="preserve">run in order on a CPU</w:t>
-      </w:r>
-      <w:r>
-        <w:t xml:space="preserve"> </w:t>
-      </w:r>
-      <w:r>
-        <w:t xml:space="preserve">(under 15 minutes of training on a 15 GB laptop), and</w:t>
-      </w:r>
-      <w:r>
-        <w:t xml:space="preserve"> </w:t>
-      </w:r>
-      <w:r>
-        <w:rPr>
-          <w:rStyle w:val="VerbatimChar"/>
-        </w:rPr>
-        <w:t xml:space="preserve">check_results.py</w:t>
-      </w:r>
-      <w:r>
-        <w:t xml:space="preserve"> </w:t>
-      </w:r>
-      <w:r>
-        <w:t xml:space="preserve">runs 31</w:t>
-      </w:r>
-      <w:r>
-        <w:t xml:space="preserve"> </w:t>
-      </w:r>
-      <w:r>
-        <w:t xml:space="preserve">checks on the outputs (counts, train/test leakage, WHO accuracy, report tables). Seeds are fixed,</w:t>
-      </w:r>
-      <w:r>
-        <w:t xml:space="preserve"> </w:t>
-      </w:r>
-      <w:r>
-        <w:t xml:space="preserve">and a run from a fresh clone reproduced every result. Data:</w:t>
-      </w:r>
-      <w:r>
-        <w:t xml:space="preserve"> </w:t>
-      </w:r>
-      <w:r>
-        <w:t xml:space="preserve">CRyPTIC release June 2022,</w:t>
-      </w:r>
-      <w:r>
-        <w:t xml:space="preserve"> </w:t>
-      </w:r>
-      <w:r>
-        <w:rPr>
-          <w:rStyle w:val="VerbatimChar"/>
-        </w:rPr>
-        <w:t xml:space="preserve">ftp.ebi.ac.uk/pub/databases/cryptic/release_june2022/</w:t>
-      </w:r>
-      <w:r>
-        <w:t xml:space="preserve">;</w:t>
-      </w:r>
-      <w:r>
-        <w:t xml:space="preserve"> </w:t>
-      </w:r>
-      <w:r>
-        <w:t xml:space="preserve">WHO catalogue v2 (GARC),</w:t>
-      </w:r>
-      <w:r>
-        <w:t xml:space="preserve"> </w:t>
-      </w:r>
-      <w:r>
-        <w:rPr>
-          <w:rStyle w:val="VerbatimChar"/>
-        </w:rPr>
-        <w:t xml:space="preserve">github.com/oxfordmmm/tuberculosis_amr_catalogues</w:t>
-      </w:r>
-      <w:r>
-        <w:t xml:space="preserve">.</w:t>
-      </w:r>
-    </w:p>
-    <w:bookmarkEnd w:id="43"/>
-    <w:bookmarkStart w:id="44" w:name="references"/>
-    <w:p>
-      <w:pPr>
-        <w:pStyle w:val="Heading2"/>
+        <w:keepNext/>
       </w:pPr>
       <w:r>
         <w:t xml:space="preserve">References</w:t>
@@ -14768,11 +14730,20 @@
         <w:t xml:space="preserve">2026. https://link.springer.com/article/10.1186/s12879-026-14318-y</w:t>
       </w:r>
     </w:p>
-    <w:bookmarkEnd w:id="44"/>
-    <w:bookmarkStart w:id="45" w:name="appendix-a.-all-models"/>
+    <w:p>
+      <w:pPr>
+        <w:pStyle w:val="FirstParagraph"/>
+      </w:pPr>
+      <w:r>
+        <w:br w:type="page"/>
+      </w:r>
+    </w:p>
+    <w:bookmarkEnd w:id="43"/>
+    <w:bookmarkStart w:id="44" w:name="appendix-a.-all-models"/>
     <w:p>
       <w:pPr>
         <w:pStyle w:val="Heading2"/>
+        <w:keepNext/>
       </w:pPr>
       <w:r>
         <w:t xml:space="preserve">Appendix A. All models</w:t>
@@ -14781,6 +14752,7 @@
     <w:p>
       <w:pPr>
         <w:pStyle w:val="FirstParagraph"/>
+        <w:keepNext/>
       </w:pPr>
       <w:r>
         <w:rPr>
@@ -14860,7 +14832,7 @@
                 <w:b/>
                 <w:sz w:val="16"/>
               </w:rPr>
-              <w:t xml:space="preserve">auc (random)</w:t>
+              <w:t xml:space="preserve">AUC random</w:t>
             </w:r>
           </w:p>
         </w:tc>
@@ -14876,7 +14848,7 @@
                 <w:b/>
                 <w:sz w:val="16"/>
               </w:rPr>
-              <w:t xml:space="preserve">auc (sa_holdout)</w:t>
+              <w:t xml:space="preserve">AUC holdout</w:t>
             </w:r>
           </w:p>
         </w:tc>
@@ -14892,7 +14864,7 @@
                 <w:b/>
                 <w:sz w:val="16"/>
               </w:rPr>
-              <w:t xml:space="preserve">sensitivity (random)</w:t>
+              <w:t xml:space="preserve">Sens. random</w:t>
             </w:r>
           </w:p>
         </w:tc>
@@ -14908,7 +14880,7 @@
                 <w:b/>
                 <w:sz w:val="16"/>
               </w:rPr>
-              <w:t xml:space="preserve">sensitivity (sa_holdout)</w:t>
+              <w:t xml:space="preserve">Sens. holdout</w:t>
             </w:r>
           </w:p>
         </w:tc>
@@ -14924,7 +14896,7 @@
                 <w:b/>
                 <w:sz w:val="16"/>
               </w:rPr>
-              <w:t xml:space="preserve">specificity (random)</w:t>
+              <w:t xml:space="preserve">Spec. random</w:t>
             </w:r>
           </w:p>
         </w:tc>
@@ -14940,7 +14912,7 @@
                 <w:b/>
                 <w:sz w:val="16"/>
               </w:rPr>
-              <w:t xml:space="preserve">specificity (sa_holdout)</w:t>
+              <w:t xml:space="preserve">Spec. holdout</w:t>
             </w:r>
           </w:p>
         </w:tc>
@@ -19730,8 +19702,228 @@
         </w:tc>
       </w:tr>
     </w:tbl>
-    <w:bookmarkEnd w:id="45"/>
-    <w:bookmarkEnd w:id="46"/>
+    <w:bookmarkEnd w:id="44"/>
+    <w:bookmarkStart w:id="48" w:name="resources"/>
+    <w:p>
+      <w:pPr>
+        <w:pStyle w:val="Heading2"/>
+        <w:keepNext/>
+      </w:pPr>
+      <w:r>
+        <w:t xml:space="preserve">Resources</w:t>
+      </w:r>
+    </w:p>
+    <w:p>
+      <w:pPr>
+        <w:pStyle w:val="Compact"/>
+        <w:numPr>
+          <w:ilvl w:val="0"/>
+          <w:numId w:val="1004"/>
+        </w:numPr>
+      </w:pPr>
+      <w:r>
+        <w:rPr>
+          <w:b/>
+          <w:bCs/>
+        </w:rPr>
+        <w:t xml:space="preserve">Code repository</w:t>
+      </w:r>
+      <w:r>
+        <w:t xml:space="preserve"> </w:t>
+      </w:r>
+      <w:r>
+        <w:t xml:space="preserve">(all scripts, results, figures and this report):</w:t>
+      </w:r>
+      <w:r>
+        <w:t xml:space="preserve"> </w:t>
+      </w:r>
+      <w:hyperlink r:id="rId45">
+        <w:r>
+          <w:rPr>
+            <w:rStyle w:val="Hyperlink"/>
+          </w:rPr>
+          <w:t xml:space="preserve">https://github.com/RimjhimD/Genome-Based-Antibiotic-Resistance-Prediction-TB</w:t>
+        </w:r>
+      </w:hyperlink>
+    </w:p>
+    <w:p>
+      <w:pPr>
+        <w:pStyle w:val="Compact"/>
+        <w:numPr>
+          <w:ilvl w:val="0"/>
+          <w:numId w:val="1004"/>
+        </w:numPr>
+      </w:pPr>
+      <w:r>
+        <w:rPr>
+          <w:b/>
+          <w:bCs/>
+        </w:rPr>
+        <w:t xml:space="preserve">Dataset:</w:t>
+      </w:r>
+      <w:r>
+        <w:t xml:space="preserve"> </w:t>
+      </w:r>
+      <w:r>
+        <w:t xml:space="preserve">CRyPTIC consortium, release June 2022 —</w:t>
+      </w:r>
+      <w:r>
+        <w:t xml:space="preserve"> </w:t>
+      </w:r>
+      <w:hyperlink r:id="rId46">
+        <w:r>
+          <w:rPr>
+            <w:rStyle w:val="Hyperlink"/>
+          </w:rPr>
+          <w:t xml:space="preserve">https://ftp.ebi.ac.uk/pub/databases/cryptic/release_june2022/</w:t>
+        </w:r>
+      </w:hyperlink>
+    </w:p>
+    <w:p>
+      <w:pPr>
+        <w:pStyle w:val="Compact"/>
+        <w:numPr>
+          <w:ilvl w:val="0"/>
+          <w:numId w:val="1004"/>
+        </w:numPr>
+      </w:pPr>
+      <w:r>
+        <w:rPr>
+          <w:b/>
+          <w:bCs/>
+        </w:rPr>
+        <w:t xml:space="preserve">WHO mutation catalogue</w:t>
+      </w:r>
+      <w:r>
+        <w:t xml:space="preserve"> </w:t>
+      </w:r>
+      <w:r>
+        <w:t xml:space="preserve">(2023, v2, GARC format) —</w:t>
+      </w:r>
+      <w:r>
+        <w:t xml:space="preserve"> </w:t>
+      </w:r>
+      <w:hyperlink r:id="rId47">
+        <w:r>
+          <w:rPr>
+            <w:rStyle w:val="Hyperlink"/>
+          </w:rPr>
+          <w:t xml:space="preserve">https://github.com/oxfordmmm/tuberculosis_amr_catalogues</w:t>
+        </w:r>
+      </w:hyperlink>
+    </w:p>
+    <w:p>
+      <w:pPr>
+        <w:pStyle w:val="FirstParagraph"/>
+      </w:pPr>
+      <w:r>
+        <w:rPr>
+          <w:b/>
+          <w:bCs/>
+        </w:rPr>
+        <w:t xml:space="preserve">Reproducing the results.</w:t>
+      </w:r>
+      <w:r>
+        <w:t xml:space="preserve"> </w:t>
+      </w:r>
+      <w:r>
+        <w:rPr>
+          <w:rStyle w:val="VerbatimChar"/>
+        </w:rPr>
+        <w:t xml:space="preserve">bash scripts/fetch_data.sh --mutations</w:t>
+      </w:r>
+      <w:r>
+        <w:t xml:space="preserve"> </w:t>
+      </w:r>
+      <w:r>
+        <w:t xml:space="preserve">downloads the data;</w:t>
+      </w:r>
+      <w:r>
+        <w:t xml:space="preserve"> </w:t>
+      </w:r>
+      <w:r>
+        <w:rPr>
+          <w:rStyle w:val="VerbatimChar"/>
+        </w:rPr>
+        <w:t xml:space="preserve">pip install -r requirements.txt</w:t>
+      </w:r>
+      <w:r>
+        <w:t xml:space="preserve"> </w:t>
+      </w:r>
+      <w:r>
+        <w:t xml:space="preserve">installs the exact library</w:t>
+      </w:r>
+      <w:r>
+        <w:t xml:space="preserve"> </w:t>
+      </w:r>
+      <w:r>
+        <w:t xml:space="preserve">versions; scripts</w:t>
+      </w:r>
+      <w:r>
+        <w:t xml:space="preserve"> </w:t>
+      </w:r>
+      <w:r>
+        <w:rPr>
+          <w:rStyle w:val="VerbatimChar"/>
+        </w:rPr>
+        <w:t xml:space="preserve">01_prepare.py</w:t>
+      </w:r>
+      <w:r>
+        <w:t xml:space="preserve"> </w:t>
+      </w:r>
+      <w:r>
+        <w:t xml:space="preserve">to</w:t>
+      </w:r>
+      <w:r>
+        <w:t xml:space="preserve"> </w:t>
+      </w:r>
+      <w:r>
+        <w:rPr>
+          <w:rStyle w:val="VerbatimChar"/>
+        </w:rPr>
+        <w:t xml:space="preserve">07_report.py</w:t>
+      </w:r>
+      <w:r>
+        <w:t xml:space="preserve"> </w:t>
+      </w:r>
+      <w:r>
+        <w:t xml:space="preserve">run in order on a CPU</w:t>
+      </w:r>
+      <w:r>
+        <w:t xml:space="preserve"> </w:t>
+      </w:r>
+      <w:r>
+        <w:t xml:space="preserve">(under 15 minutes of training on a 15 GB laptop), and</w:t>
+      </w:r>
+      <w:r>
+        <w:t xml:space="preserve"> </w:t>
+      </w:r>
+      <w:r>
+        <w:rPr>
+          <w:rStyle w:val="VerbatimChar"/>
+        </w:rPr>
+        <w:t xml:space="preserve">check_results.py</w:t>
+      </w:r>
+      <w:r>
+        <w:t xml:space="preserve"> </w:t>
+      </w:r>
+      <w:r>
+        <w:t xml:space="preserve">runs 31</w:t>
+      </w:r>
+      <w:r>
+        <w:t xml:space="preserve"> </w:t>
+      </w:r>
+      <w:r>
+        <w:t xml:space="preserve">checks on the outputs (counts, train/test leakage, WHO accuracy, report tables). Seeds are fixed,</w:t>
+      </w:r>
+      <w:r>
+        <w:t xml:space="preserve"> </w:t>
+      </w:r>
+      <w:r>
+        <w:t xml:space="preserve">and a run from a fresh clone reproduced every result.</w:t>
+      </w:r>
+    </w:p>
+    <w:bookmarkEnd w:id="48"/>
     <w:sectPr>
       <w:footnotePr>
         <w:numRestart w:val="eachSect"/>
@@ -20095,6 +20287,9 @@
     <w:lvlOverride w:ilvl="8">
       <w:startOverride w:val="1"/>
     </w:lvlOverride>
+  </w:num>
+  <w:num w:numId="1004">
+    <w:abstractNumId w:val="991"/>
   </w:num>
 </w:numbering>
 </file>

</xml_diff>

<commit_message>
Use the university cover page for the report
- scripts/make_cover.py: Premier University Chattogram project-report
  cover from the Cover-Pages template, submitted to Imtiaz Riad
  (Co-Founder, Authentic Four Technology)
- 07_report.py now builds the whole report: cover + body for both the
  PDF and the Word file; all PDF pages A4
- requirements.txt adds pypdf and docxcompose
</commit_message>
<xml_diff>
--- a/report/report.docx
+++ b/report/report.docx
@@ -1,24 +1,1302 @@
 
 <file path=word/document.xml><?xml version="1.0" encoding="utf-8"?>
-<w:document xmlns:w="http://schemas.openxmlformats.org/wordprocessingml/2006/main" xmlns:m="http://schemas.openxmlformats.org/officeDocument/2006/math" xmlns:r="http://schemas.openxmlformats.org/officeDocument/2006/relationships" xmlns:o="urn:schemas-microsoft-com:office:office" xmlns:v="urn:schemas-microsoft-com:vml" xmlns:w10="urn:schemas-microsoft-com:office:word" xmlns:a="http://schemas.openxmlformats.org/drawingml/2006/main" xmlns:pic="http://schemas.openxmlformats.org/drawingml/2006/picture" xmlns:wp="http://schemas.openxmlformats.org/drawingml/2006/wordprocessingDrawing">
+<w:document xmlns:o="urn:schemas-microsoft-com:office:office" xmlns:r="http://schemas.openxmlformats.org/officeDocument/2006/relationships" xmlns:v="urn:schemas-microsoft-com:vml" xmlns:w="http://schemas.openxmlformats.org/wordprocessingml/2006/main" xmlns:w10="urn:schemas-microsoft-com:office:word" xmlns:wp="http://schemas.openxmlformats.org/drawingml/2006/wordprocessingDrawing" xmlns:wps="http://schemas.microsoft.com/office/word/2010/wordprocessingShape" xmlns:wpg="http://schemas.microsoft.com/office/word/2010/wordprocessingGroup" xmlns:mc="http://schemas.openxmlformats.org/markup-compatibility/2006" xmlns:wp14="http://schemas.microsoft.com/office/word/2010/wordprocessingDrawing" xmlns:w14="http://schemas.microsoft.com/office/word/2010/wordml" xmlns:w15="http://schemas.microsoft.com/office/word/2012/wordml" mc:Ignorable="w14 wp14 w15">
   <w:body>
     <w:p>
       <w:pPr>
-        <w:pStyle w:val="FirstParagraph"/>
-        <w:spacing w:after="120" w:before="1600"/>
+        <w:pStyle w:val="Normal"/>
+        <w:bidi w:val="0"/>
+        <w:spacing w:before="0" w:after="259"/>
         <w:jc w:val="center"/>
+        <w:rPr/>
       </w:pPr>
       <w:r>
-        <w:t xml:space="preserve">Research Report</w:t>
+        <w:rPr/>
+        <mc:AlternateContent>
+          <mc:Choice Requires="wps">
+            <w:drawing>
+              <wp:inline distT="0" distB="0" distL="0" distR="0">
+                <wp:extent cx="2377440" cy="1709420"/>
+                <wp:effectExtent l="0" t="0" r="0" b="0"/>
+                <wp:docPr id="1" name="Shape1"/>
+                <a:graphic xmlns:a="http://schemas.openxmlformats.org/drawingml/2006/main">
+                  <a:graphicData uri="http://schemas.openxmlformats.org/drawingml/2006/picture">
+                    <pic:pic xmlns:pic="http://schemas.openxmlformats.org/drawingml/2006/picture">
+                      <pic:nvPicPr>
+                        <pic:cNvPr id="1" name="Shape1" descr=""/>
+                        <pic:cNvPicPr/>
+                      </pic:nvPicPr>
+                      <pic:blipFill>
+                        <a:blip r:embed="rId2"/>
+                        <a:stretch/>
+                      </pic:blipFill>
+                      <pic:spPr>
+                        <a:xfrm>
+                          <a:off x="0" y="0"/>
+                          <a:ext cx="2377440" cy="1709280"/>
+                        </a:xfrm>
+                        <a:prstGeom prst="rect">
+                          <a:avLst/>
+                        </a:prstGeom>
+                        <a:ln w="0">
+                          <a:noFill/>
+                        </a:ln>
+                      </pic:spPr>
+                    </pic:pic>
+                  </a:graphicData>
+                </a:graphic>
+              </wp:inline>
+            </w:drawing>
+          </mc:Choice>
+          <mc:Fallback>
+            <w:pict>
+              <v:shapetype id="_x0000_t75" coordsize="21600,21600" o:spt="75" o:preferrelative="t" path="m@4@5l@4@11@9@11@9@5xe" filled="f" stroked="f">
+                <v:stroke joinstyle="miter"/>
+                <v:formulas>
+                  <v:f eqn="if lineDrawn pixelLineWidth 0"/>
+                  <v:f eqn="sum @0 1 0"/>
+                  <v:f eqn="sum 0 0 @1"/>
+                  <v:f eqn="prod @2 1 2"/>
+                  <v:f eqn="prod @3 21600 pixelWidth"/>
+                  <v:f eqn="prod @3 21600 pixelHeight"/>
+                  <v:f eqn="sum @0 0 1"/>
+                  <v:f eqn="prod @6 1 2"/>
+                  <v:f eqn="prod @7 21600 pixelWidth"/>
+                  <v:f eqn="sum @8 21600 0"/>
+                  <v:f eqn="prod @7 21600 pixelHeight"/>
+                  <v:f eqn="sum @10 21600 0"/>
+                </v:formulas>
+                <v:path o:extrusionok="f" gradientshapeok="t" o:connecttype="rect"/>
+                <o:lock v:ext="edit" aspectratio="t"/>
+              </v:shapetype>
+              <v:shape id="shape_0" ID="Shape1" stroked="f" o:allowincell="f" style="position:absolute;margin-left:0pt;margin-top:-71.6pt;width:187.15pt;height:134.55pt;mso-wrap-style:none;v-text-anchor:middle;mso-position-horizontal:center" type="_x0000_t75">
+                <v:imagedata r:id="rId3" o:detectmouseclick="t"/>
+                <v:stroke color="#3465a4" joinstyle="round" endcap="flat"/>
+                <w10:wrap type="square"/>
+              </v:shape>
+            </w:pict>
+          </mc:Fallback>
+        </mc:AlternateContent>
       </w:r>
     </w:p>
-    <w:bookmarkStart w:id="9" w:name="X29b884abb6868d6f67506f8aa2f6381a63affbf"/>
+    <w:p>
+      <w:pPr>
+        <w:pStyle w:val="Normal"/>
+        <w:bidi w:val="0"/>
+        <w:spacing w:before="0" w:after="173"/>
+        <w:jc w:val="center"/>
+        <w:rPr>
+          <w:rFonts w:ascii="Calibri" w:hAnsi="Calibri"/>
+          <w:b/>
+          <w:sz w:val="48"/>
+        </w:rPr>
+      </w:pPr>
+      <w:r>
+        <w:rPr>
+          <w:rFonts w:ascii="Calibri" w:hAnsi="Calibri"/>
+          <w:b/>
+          <w:sz w:val="48"/>
+        </w:rPr>
+        <w:t>PREMIER  UNIVERSITY  CHATTOGRAM</w:t>
+      </w:r>
+    </w:p>
+    <w:p>
+      <w:pPr>
+        <w:pStyle w:val="Normal"/>
+        <w:pBdr>
+          <w:top w:val="single" w:sz="4" w:space="7" w:color="000000"/>
+          <w:left w:val="single" w:sz="4" w:space="4" w:color="000000"/>
+          <w:bottom w:val="single" w:sz="4" w:space="7" w:color="000000"/>
+          <w:right w:val="single" w:sz="4" w:space="4" w:color="000000"/>
+        </w:pBdr>
+        <w:bidi w:val="0"/>
+        <w:spacing w:before="0" w:after="504"/>
+        <w:jc w:val="center"/>
+        <w:rPr>
+          <w:rFonts w:ascii="Calibri" w:hAnsi="Calibri"/>
+          <w:b/>
+          <w:sz w:val="20"/>
+        </w:rPr>
+      </w:pPr>
+      <w:r>
+        <w:rPr>
+          <w:rFonts w:ascii="Calibri" w:hAnsi="Calibri"/>
+          <w:b/>
+          <w:sz w:val="20"/>
+        </w:rPr>
+        <w:t>DEPARTMENT OF COMPUTER SCIENCE AND ENGINEERING</w:t>
+      </w:r>
+    </w:p>
+    <w:p>
+      <w:pPr>
+        <w:pStyle w:val="Normal"/>
+        <w:bidi w:val="0"/>
+        <w:spacing w:before="288" w:after="461"/>
+        <w:jc w:val="center"/>
+        <w:rPr>
+          <w:rFonts w:ascii="Calibri" w:hAnsi="Calibri"/>
+          <w:b/>
+          <w:sz w:val="44"/>
+          <w:u w:val="single"/>
+        </w:rPr>
+      </w:pPr>
+      <w:r>
+        <w:rPr>
+          <w:rFonts w:ascii="Calibri" w:hAnsi="Calibri"/>
+          <w:b/>
+          <w:sz w:val="44"/>
+          <w:u w:val="single"/>
+        </w:rPr>
+        <w:t>PROJECT REPORT</w:t>
+      </w:r>
+    </w:p>
+    <w:tbl>
+      <w:tblPr>
+        <w:tblW w:w="9230" w:type="dxa"/>
+        <w:jc w:val="left"/>
+        <w:tblInd w:w="254" w:type="dxa"/>
+        <w:tblLayout w:type="fixed"/>
+        <w:tblCellMar>
+          <w:top w:w="65" w:type="dxa"/>
+          <w:left w:w="101" w:type="dxa"/>
+          <w:bottom w:w="65" w:type="dxa"/>
+          <w:right w:w="101" w:type="dxa"/>
+        </w:tblCellMar>
+      </w:tblPr>
+      <w:tblGrid>
+        <w:gridCol w:w="2462"/>
+        <w:gridCol w:w="878"/>
+        <w:gridCol w:w="648"/>
+        <w:gridCol w:w="5242"/>
+      </w:tblGrid>
+      <w:tr>
+        <w:trPr>
+          <w:trHeight w:val="403" w:hRule="atLeast"/>
+        </w:trPr>
+        <w:tc>
+          <w:tcPr>
+            <w:tcW w:w="3340" w:type="dxa"/>
+            <w:gridSpan w:val="2"/>
+            <w:tcBorders>
+              <w:top w:val="single" w:sz="4" w:space="0" w:color="000000"/>
+              <w:left w:val="single" w:sz="4" w:space="0" w:color="000000"/>
+              <w:bottom w:val="single" w:sz="4" w:space="0" w:color="000000"/>
+              <w:right w:val="single" w:sz="4" w:space="0" w:color="000000"/>
+            </w:tcBorders>
+            <w:vAlign w:val="center"/>
+          </w:tcPr>
+          <w:p>
+            <w:pPr>
+              <w:pStyle w:val="Normal"/>
+              <w:bidi w:val="0"/>
+              <w:jc w:val="center"/>
+              <w:rPr>
+                <w:rFonts w:ascii="Calibri" w:hAnsi="Calibri"/>
+                <w:b/>
+                <w:sz w:val="24"/>
+              </w:rPr>
+            </w:pPr>
+            <w:r>
+              <w:rPr>
+                <w:rFonts w:ascii="Calibri" w:hAnsi="Calibri"/>
+                <w:b/>
+                <w:sz w:val="24"/>
+              </w:rPr>
+              <w:t>COURSE NAME</w:t>
+            </w:r>
+          </w:p>
+        </w:tc>
+        <w:tc>
+          <w:tcPr>
+            <w:tcW w:w="5890" w:type="dxa"/>
+            <w:gridSpan w:val="2"/>
+            <w:tcBorders>
+              <w:top w:val="single" w:sz="4" w:space="0" w:color="000000"/>
+              <w:left w:val="single" w:sz="4" w:space="0" w:color="000000"/>
+              <w:bottom w:val="single" w:sz="4" w:space="0" w:color="000000"/>
+              <w:right w:val="single" w:sz="4" w:space="0" w:color="000000"/>
+            </w:tcBorders>
+            <w:vAlign w:val="center"/>
+          </w:tcPr>
+          <w:p>
+            <w:pPr>
+              <w:pStyle w:val="Normal"/>
+              <w:bidi w:val="0"/>
+              <w:jc w:val="left"/>
+              <w:rPr>
+                <w:rFonts w:ascii="Calibri" w:hAnsi="Calibri"/>
+                <w:sz w:val="24"/>
+              </w:rPr>
+            </w:pPr>
+            <w:r>
+              <w:rPr>
+                <w:rFonts w:ascii="Calibri" w:hAnsi="Calibri"/>
+                <w:sz w:val="24"/>
+              </w:rPr>
+              <w:t>Thesis Course</w:t>
+            </w:r>
+          </w:p>
+        </w:tc>
+      </w:tr>
+      <w:tr>
+        <w:trPr>
+          <w:trHeight w:val="403" w:hRule="atLeast"/>
+        </w:trPr>
+        <w:tc>
+          <w:tcPr>
+            <w:tcW w:w="3340" w:type="dxa"/>
+            <w:gridSpan w:val="2"/>
+            <w:tcBorders>
+              <w:top w:val="single" w:sz="4" w:space="0" w:color="000000"/>
+              <w:left w:val="single" w:sz="4" w:space="0" w:color="000000"/>
+              <w:bottom w:val="single" w:sz="4" w:space="0" w:color="000000"/>
+              <w:right w:val="single" w:sz="4" w:space="0" w:color="000000"/>
+            </w:tcBorders>
+            <w:vAlign w:val="center"/>
+          </w:tcPr>
+          <w:p>
+            <w:pPr>
+              <w:pStyle w:val="Normal"/>
+              <w:bidi w:val="0"/>
+              <w:jc w:val="center"/>
+              <w:rPr>
+                <w:rFonts w:ascii="Calibri" w:hAnsi="Calibri"/>
+                <w:b/>
+                <w:sz w:val="24"/>
+              </w:rPr>
+            </w:pPr>
+            <w:r>
+              <w:rPr>
+                <w:rFonts w:ascii="Calibri" w:hAnsi="Calibri"/>
+                <w:b/>
+                <w:sz w:val="24"/>
+              </w:rPr>
+              <w:t>COURSE CODE</w:t>
+            </w:r>
+          </w:p>
+        </w:tc>
+        <w:tc>
+          <w:tcPr>
+            <w:tcW w:w="5890" w:type="dxa"/>
+            <w:gridSpan w:val="2"/>
+            <w:tcBorders>
+              <w:top w:val="single" w:sz="4" w:space="0" w:color="000000"/>
+              <w:left w:val="single" w:sz="4" w:space="0" w:color="000000"/>
+              <w:bottom w:val="single" w:sz="4" w:space="0" w:color="000000"/>
+              <w:right w:val="single" w:sz="4" w:space="0" w:color="000000"/>
+            </w:tcBorders>
+            <w:vAlign w:val="center"/>
+          </w:tcPr>
+          <w:p>
+            <w:pPr>
+              <w:pStyle w:val="Normal"/>
+              <w:bidi w:val="0"/>
+              <w:jc w:val="left"/>
+              <w:rPr>
+                <w:rFonts w:ascii="Calibri" w:hAnsi="Calibri"/>
+                <w:sz w:val="24"/>
+              </w:rPr>
+            </w:pPr>
+            <w:r>
+              <w:rPr>
+                <w:rFonts w:ascii="Calibri" w:hAnsi="Calibri"/>
+                <w:sz w:val="24"/>
+              </w:rPr>
+            </w:r>
+          </w:p>
+        </w:tc>
+      </w:tr>
+      <w:tr>
+        <w:trPr>
+          <w:trHeight w:val="403" w:hRule="atLeast"/>
+        </w:trPr>
+        <w:tc>
+          <w:tcPr>
+            <w:tcW w:w="3340" w:type="dxa"/>
+            <w:gridSpan w:val="2"/>
+            <w:tcBorders>
+              <w:top w:val="single" w:sz="4" w:space="0" w:color="000000"/>
+              <w:left w:val="single" w:sz="4" w:space="0" w:color="000000"/>
+              <w:bottom w:val="single" w:sz="4" w:space="0" w:color="000000"/>
+              <w:right w:val="single" w:sz="4" w:space="0" w:color="000000"/>
+            </w:tcBorders>
+            <w:vAlign w:val="center"/>
+          </w:tcPr>
+          <w:p>
+            <w:pPr>
+              <w:pStyle w:val="Normal"/>
+              <w:bidi w:val="0"/>
+              <w:jc w:val="center"/>
+              <w:rPr>
+                <w:rFonts w:ascii="Calibri" w:hAnsi="Calibri"/>
+                <w:b/>
+                <w:sz w:val="24"/>
+              </w:rPr>
+            </w:pPr>
+            <w:r>
+              <w:rPr>
+                <w:rFonts w:ascii="Calibri" w:hAnsi="Calibri"/>
+                <w:b/>
+                <w:sz w:val="24"/>
+              </w:rPr>
+              <w:t>PROJECT TITLE</w:t>
+            </w:r>
+          </w:p>
+        </w:tc>
+        <w:tc>
+          <w:tcPr>
+            <w:tcW w:w="5890" w:type="dxa"/>
+            <w:gridSpan w:val="2"/>
+            <w:tcBorders>
+              <w:top w:val="single" w:sz="4" w:space="0" w:color="000000"/>
+              <w:left w:val="single" w:sz="4" w:space="0" w:color="000000"/>
+              <w:bottom w:val="single" w:sz="4" w:space="0" w:color="000000"/>
+              <w:right w:val="single" w:sz="4" w:space="0" w:color="000000"/>
+            </w:tcBorders>
+            <w:vAlign w:val="center"/>
+          </w:tcPr>
+          <w:p>
+            <w:pPr>
+              <w:pStyle w:val="Normal"/>
+              <w:bidi w:val="0"/>
+              <w:jc w:val="left"/>
+              <w:rPr>
+                <w:rFonts w:ascii="Calibri" w:hAnsi="Calibri"/>
+                <w:sz w:val="24"/>
+              </w:rPr>
+            </w:pPr>
+            <w:r>
+              <w:rPr>
+                <w:rFonts w:ascii="Calibri" w:hAnsi="Calibri"/>
+                <w:sz w:val="24"/>
+              </w:rPr>
+              <w:t xml:space="preserve">Geographic Transportability of Genome-Based Antibiotic Resistance Prediction in </w:t>
+            </w:r>
+            <w:r>
+              <w:rPr>
+                <w:rFonts w:ascii="Calibri" w:hAnsi="Calibri"/>
+                <w:i/>
+                <w:sz w:val="24"/>
+              </w:rPr>
+              <w:t>Mycobacterium tuberculosis</w:t>
+            </w:r>
+            <w:r>
+              <w:rPr>
+                <w:rFonts w:ascii="Calibri" w:hAnsi="Calibri"/>
+                <w:sz w:val="24"/>
+              </w:rPr>
+              <w:t>: A South Asian Evaluation</w:t>
+            </w:r>
+          </w:p>
+        </w:tc>
+      </w:tr>
+      <w:tr>
+        <w:trPr>
+          <w:trHeight w:val="403" w:hRule="atLeast"/>
+        </w:trPr>
+        <w:tc>
+          <w:tcPr>
+            <w:tcW w:w="3340" w:type="dxa"/>
+            <w:gridSpan w:val="2"/>
+            <w:tcBorders>
+              <w:top w:val="single" w:sz="4" w:space="0" w:color="000000"/>
+              <w:left w:val="single" w:sz="4" w:space="0" w:color="000000"/>
+              <w:bottom w:val="single" w:sz="4" w:space="0" w:color="000000"/>
+              <w:right w:val="single" w:sz="4" w:space="0" w:color="000000"/>
+            </w:tcBorders>
+            <w:vAlign w:val="center"/>
+          </w:tcPr>
+          <w:p>
+            <w:pPr>
+              <w:pStyle w:val="Normal"/>
+              <w:bidi w:val="0"/>
+              <w:jc w:val="center"/>
+              <w:rPr>
+                <w:rFonts w:ascii="Calibri" w:hAnsi="Calibri"/>
+                <w:b/>
+                <w:sz w:val="24"/>
+              </w:rPr>
+            </w:pPr>
+            <w:r>
+              <w:rPr>
+                <w:rFonts w:ascii="Calibri" w:hAnsi="Calibri"/>
+                <w:b/>
+                <w:sz w:val="24"/>
+              </w:rPr>
+              <w:t>DATE OF REPORT</w:t>
+            </w:r>
+          </w:p>
+        </w:tc>
+        <w:tc>
+          <w:tcPr>
+            <w:tcW w:w="5890" w:type="dxa"/>
+            <w:gridSpan w:val="2"/>
+            <w:tcBorders>
+              <w:top w:val="single" w:sz="4" w:space="0" w:color="000000"/>
+              <w:left w:val="single" w:sz="4" w:space="0" w:color="000000"/>
+              <w:bottom w:val="single" w:sz="4" w:space="0" w:color="000000"/>
+              <w:right w:val="single" w:sz="4" w:space="0" w:color="000000"/>
+            </w:tcBorders>
+            <w:vAlign w:val="center"/>
+          </w:tcPr>
+          <w:p>
+            <w:pPr>
+              <w:pStyle w:val="Normal"/>
+              <w:bidi w:val="0"/>
+              <w:jc w:val="left"/>
+              <w:rPr>
+                <w:rFonts w:ascii="Calibri" w:hAnsi="Calibri"/>
+                <w:sz w:val="24"/>
+              </w:rPr>
+            </w:pPr>
+            <w:r>
+              <w:rPr>
+                <w:rFonts w:ascii="Calibri" w:hAnsi="Calibri"/>
+                <w:sz w:val="24"/>
+              </w:rPr>
+              <w:t>04-10-2026</w:t>
+            </w:r>
+          </w:p>
+        </w:tc>
+      </w:tr>
+      <w:tr>
+        <w:trPr>
+          <w:trHeight w:val="403" w:hRule="atLeast"/>
+        </w:trPr>
+        <w:tc>
+          <w:tcPr>
+            <w:tcW w:w="3340" w:type="dxa"/>
+            <w:gridSpan w:val="2"/>
+            <w:tcBorders>
+              <w:top w:val="single" w:sz="4" w:space="0" w:color="000000"/>
+              <w:left w:val="single" w:sz="4" w:space="0" w:color="000000"/>
+              <w:bottom w:val="single" w:sz="4" w:space="0" w:color="000000"/>
+              <w:right w:val="single" w:sz="4" w:space="0" w:color="000000"/>
+            </w:tcBorders>
+            <w:vAlign w:val="center"/>
+          </w:tcPr>
+          <w:p>
+            <w:pPr>
+              <w:pStyle w:val="Normal"/>
+              <w:bidi w:val="0"/>
+              <w:jc w:val="center"/>
+              <w:rPr>
+                <w:rFonts w:ascii="Calibri" w:hAnsi="Calibri"/>
+                <w:b/>
+                <w:sz w:val="24"/>
+              </w:rPr>
+            </w:pPr>
+            <w:r>
+              <w:rPr>
+                <w:rFonts w:ascii="Calibri" w:hAnsi="Calibri"/>
+                <w:b/>
+                <w:sz w:val="24"/>
+              </w:rPr>
+              <w:t>DATE OF SUBMISSION</w:t>
+            </w:r>
+          </w:p>
+        </w:tc>
+        <w:tc>
+          <w:tcPr>
+            <w:tcW w:w="5890" w:type="dxa"/>
+            <w:gridSpan w:val="2"/>
+            <w:tcBorders>
+              <w:top w:val="single" w:sz="4" w:space="0" w:color="000000"/>
+              <w:left w:val="single" w:sz="4" w:space="0" w:color="000000"/>
+              <w:bottom w:val="single" w:sz="4" w:space="0" w:color="000000"/>
+              <w:right w:val="single" w:sz="4" w:space="0" w:color="000000"/>
+            </w:tcBorders>
+            <w:vAlign w:val="center"/>
+          </w:tcPr>
+          <w:p>
+            <w:pPr>
+              <w:pStyle w:val="Normal"/>
+              <w:bidi w:val="0"/>
+              <w:jc w:val="left"/>
+              <w:rPr>
+                <w:rFonts w:ascii="Calibri" w:hAnsi="Calibri"/>
+                <w:sz w:val="24"/>
+              </w:rPr>
+            </w:pPr>
+            <w:r>
+              <w:rPr>
+                <w:rFonts w:ascii="Calibri" w:hAnsi="Calibri"/>
+                <w:sz w:val="24"/>
+              </w:rPr>
+              <w:t>04-10-2026</w:t>
+            </w:r>
+          </w:p>
+        </w:tc>
+      </w:tr>
+      <w:tr>
+        <w:trPr>
+          <w:trHeight w:val="403" w:hRule="atLeast"/>
+        </w:trPr>
+        <w:tc>
+          <w:tcPr>
+            <w:tcW w:w="9230" w:type="dxa"/>
+            <w:gridSpan w:val="4"/>
+            <w:tcBorders>
+              <w:top w:val="single" w:sz="4" w:space="0" w:color="000000"/>
+              <w:left w:val="single" w:sz="4" w:space="0" w:color="000000"/>
+              <w:bottom w:val="single" w:sz="4" w:space="0" w:color="000000"/>
+              <w:right w:val="single" w:sz="4" w:space="0" w:color="000000"/>
+            </w:tcBorders>
+            <w:vAlign w:val="center"/>
+          </w:tcPr>
+          <w:p>
+            <w:pPr>
+              <w:pStyle w:val="Normal"/>
+              <w:bidi w:val="0"/>
+              <w:jc w:val="left"/>
+              <w:rPr>
+                <w:rFonts w:ascii="Calibri" w:hAnsi="Calibri"/>
+                <w:b/>
+                <w:sz w:val="26"/>
+              </w:rPr>
+            </w:pPr>
+            <w:r>
+              <w:rPr>
+                <w:rFonts w:ascii="Calibri" w:hAnsi="Calibri"/>
+                <w:b/>
+                <w:sz w:val="26"/>
+              </w:rPr>
+              <w:t>SUBMITTED TO</w:t>
+            </w:r>
+          </w:p>
+        </w:tc>
+      </w:tr>
+      <w:tr>
+        <w:trPr>
+          <w:trHeight w:val="475" w:hRule="atLeast"/>
+        </w:trPr>
+        <w:tc>
+          <w:tcPr>
+            <w:tcW w:w="9230" w:type="dxa"/>
+            <w:gridSpan w:val="4"/>
+            <w:tcBorders>
+              <w:top w:val="single" w:sz="4" w:space="0" w:color="000000"/>
+              <w:left w:val="single" w:sz="4" w:space="0" w:color="000000"/>
+              <w:bottom w:val="single" w:sz="4" w:space="0" w:color="000000"/>
+              <w:right w:val="single" w:sz="4" w:space="0" w:color="000000"/>
+            </w:tcBorders>
+            <w:vAlign w:val="center"/>
+          </w:tcPr>
+          <w:p>
+            <w:pPr>
+              <w:pStyle w:val="Normal"/>
+              <w:bidi w:val="0"/>
+              <w:jc w:val="center"/>
+              <w:rPr>
+                <w:rFonts w:ascii="Calibri" w:hAnsi="Calibri"/>
+                <w:b/>
+                <w:sz w:val="26"/>
+              </w:rPr>
+            </w:pPr>
+            <w:r>
+              <w:rPr>
+                <w:rFonts w:ascii="Calibri" w:hAnsi="Calibri"/>
+                <w:b/>
+                <w:sz w:val="26"/>
+              </w:rPr>
+              <w:t>Imtiaz Riad</w:t>
+            </w:r>
+          </w:p>
+          <w:p>
+            <w:pPr>
+              <w:pStyle w:val="Normal"/>
+              <w:bidi w:val="0"/>
+              <w:jc w:val="center"/>
+              <w:rPr>
+                <w:rFonts w:ascii="Calibri" w:hAnsi="Calibri"/>
+                <w:b/>
+                <w:sz w:val="26"/>
+              </w:rPr>
+            </w:pPr>
+            <w:r>
+              <w:rPr>
+                <w:rFonts w:ascii="Calibri" w:hAnsi="Calibri"/>
+                <w:b/>
+                <w:sz w:val="26"/>
+              </w:rPr>
+              <w:t>Co-Founder</w:t>
+            </w:r>
+          </w:p>
+          <w:p>
+            <w:pPr>
+              <w:pStyle w:val="Normal"/>
+              <w:bidi w:val="0"/>
+              <w:jc w:val="center"/>
+              <w:rPr>
+                <w:rFonts w:ascii="Calibri" w:hAnsi="Calibri"/>
+                <w:b/>
+                <w:sz w:val="26"/>
+              </w:rPr>
+            </w:pPr>
+            <w:r>
+              <w:rPr>
+                <w:rFonts w:ascii="Calibri" w:hAnsi="Calibri"/>
+                <w:b/>
+                <w:sz w:val="26"/>
+              </w:rPr>
+              <w:t>Authentic Four Technology</w:t>
+            </w:r>
+          </w:p>
+        </w:tc>
+      </w:tr>
+      <w:tr>
+        <w:trPr>
+          <w:trHeight w:val="475" w:hRule="atLeast"/>
+        </w:trPr>
+        <w:tc>
+          <w:tcPr>
+            <w:tcW w:w="2462" w:type="dxa"/>
+            <w:vMerge w:val="restart"/>
+            <w:tcBorders>
+              <w:top w:val="single" w:sz="4" w:space="0" w:color="000000"/>
+              <w:left w:val="single" w:sz="4" w:space="0" w:color="000000"/>
+              <w:bottom w:val="single" w:sz="4" w:space="0" w:color="000000"/>
+              <w:right w:val="single" w:sz="4" w:space="0" w:color="000000"/>
+            </w:tcBorders>
+            <w:vAlign w:val="center"/>
+          </w:tcPr>
+          <w:p>
+            <w:pPr>
+              <w:pStyle w:val="Normal"/>
+              <w:bidi w:val="0"/>
+              <w:jc w:val="left"/>
+              <w:rPr>
+                <w:rFonts w:ascii="Calibri" w:hAnsi="Calibri"/>
+                <w:b/>
+                <w:sz w:val="26"/>
+              </w:rPr>
+            </w:pPr>
+            <w:r>
+              <w:rPr>
+                <w:rFonts w:ascii="Calibri" w:hAnsi="Calibri"/>
+                <w:b/>
+                <w:sz w:val="26"/>
+              </w:rPr>
+              <w:t>REMARKS</w:t>
+            </w:r>
+          </w:p>
+        </w:tc>
+        <w:tc>
+          <w:tcPr>
+            <w:tcW w:w="6768" w:type="dxa"/>
+            <w:gridSpan w:val="3"/>
+            <w:tcBorders>
+              <w:top w:val="single" w:sz="4" w:space="0" w:color="000000"/>
+              <w:left w:val="single" w:sz="4" w:space="0" w:color="000000"/>
+              <w:bottom w:val="single" w:sz="4" w:space="0" w:color="000000"/>
+              <w:right w:val="single" w:sz="4" w:space="0" w:color="000000"/>
+            </w:tcBorders>
+            <w:vAlign w:val="center"/>
+          </w:tcPr>
+          <w:p>
+            <w:pPr>
+              <w:pStyle w:val="Normal"/>
+              <w:bidi w:val="0"/>
+              <w:jc w:val="left"/>
+              <w:rPr>
+                <w:rFonts w:ascii="Calibri" w:hAnsi="Calibri"/>
+                <w:b/>
+                <w:sz w:val="26"/>
+              </w:rPr>
+            </w:pPr>
+            <w:r>
+              <w:rPr>
+                <w:rFonts w:ascii="Calibri" w:hAnsi="Calibri"/>
+                <w:b/>
+                <w:sz w:val="26"/>
+              </w:rPr>
+              <w:t>SUBMITTED BY</w:t>
+            </w:r>
+          </w:p>
+        </w:tc>
+      </w:tr>
+      <w:tr>
+        <w:trPr>
+          <w:trHeight w:val="475" w:hRule="atLeast"/>
+        </w:trPr>
+        <w:tc>
+          <w:tcPr>
+            <w:tcW w:w="2462" w:type="dxa"/>
+            <w:vMerge w:val="continue"/>
+            <w:tcBorders>
+              <w:top w:val="single" w:sz="4" w:space="0" w:color="000000"/>
+              <w:left w:val="single" w:sz="4" w:space="0" w:color="000000"/>
+              <w:bottom w:val="single" w:sz="4" w:space="0" w:color="000000"/>
+              <w:right w:val="single" w:sz="4" w:space="0" w:color="000000"/>
+            </w:tcBorders>
+            <w:vAlign w:val="center"/>
+          </w:tcPr>
+          <w:p>
+            <w:pPr>
+              <w:pStyle w:val="Normal"/>
+              <w:bidi w:val="0"/>
+              <w:jc w:val="left"/>
+              <w:rPr/>
+            </w:pPr>
+            <w:r>
+              <w:rPr/>
+            </w:r>
+          </w:p>
+        </w:tc>
+        <w:tc>
+          <w:tcPr>
+            <w:tcW w:w="1526" w:type="dxa"/>
+            <w:gridSpan w:val="2"/>
+            <w:tcBorders>
+              <w:top w:val="single" w:sz="4" w:space="0" w:color="000000"/>
+              <w:left w:val="single" w:sz="4" w:space="0" w:color="000000"/>
+              <w:bottom w:val="single" w:sz="4" w:space="0" w:color="000000"/>
+              <w:right w:val="single" w:sz="4" w:space="0" w:color="000000"/>
+            </w:tcBorders>
+            <w:vAlign w:val="center"/>
+          </w:tcPr>
+          <w:p>
+            <w:pPr>
+              <w:pStyle w:val="Normal"/>
+              <w:bidi w:val="0"/>
+              <w:jc w:val="left"/>
+              <w:rPr>
+                <w:rFonts w:ascii="Calibri" w:hAnsi="Calibri"/>
+                <w:b/>
+                <w:sz w:val="26"/>
+              </w:rPr>
+            </w:pPr>
+            <w:r>
+              <w:rPr>
+                <w:rFonts w:ascii="Calibri" w:hAnsi="Calibri"/>
+                <w:b/>
+                <w:sz w:val="26"/>
+              </w:rPr>
+              <w:t>NAME</w:t>
+            </w:r>
+          </w:p>
+        </w:tc>
+        <w:tc>
+          <w:tcPr>
+            <w:tcW w:w="5242" w:type="dxa"/>
+            <w:tcBorders>
+              <w:top w:val="single" w:sz="4" w:space="0" w:color="000000"/>
+              <w:left w:val="single" w:sz="4" w:space="0" w:color="000000"/>
+              <w:bottom w:val="single" w:sz="4" w:space="0" w:color="000000"/>
+              <w:right w:val="single" w:sz="4" w:space="0" w:color="000000"/>
+            </w:tcBorders>
+            <w:vAlign w:val="center"/>
+          </w:tcPr>
+          <w:p>
+            <w:pPr>
+              <w:pStyle w:val="Normal"/>
+              <w:bidi w:val="0"/>
+              <w:jc w:val="left"/>
+              <w:rPr>
+                <w:rFonts w:ascii="Times New Roman" w:hAnsi="Times New Roman"/>
+                <w:sz w:val="24"/>
+              </w:rPr>
+            </w:pPr>
+            <w:r>
+              <w:rPr>
+                <w:rFonts w:ascii="Times New Roman" w:hAnsi="Times New Roman"/>
+                <w:sz w:val="24"/>
+              </w:rPr>
+              <w:t>Rimjhim Dey</w:t>
+            </w:r>
+          </w:p>
+        </w:tc>
+      </w:tr>
+      <w:tr>
+        <w:trPr>
+          <w:trHeight w:val="475" w:hRule="atLeast"/>
+        </w:trPr>
+        <w:tc>
+          <w:tcPr>
+            <w:tcW w:w="2462" w:type="dxa"/>
+            <w:vMerge w:val="continue"/>
+            <w:tcBorders>
+              <w:top w:val="single" w:sz="4" w:space="0" w:color="000000"/>
+              <w:left w:val="single" w:sz="4" w:space="0" w:color="000000"/>
+              <w:bottom w:val="single" w:sz="4" w:space="0" w:color="000000"/>
+              <w:right w:val="single" w:sz="4" w:space="0" w:color="000000"/>
+            </w:tcBorders>
+            <w:vAlign w:val="center"/>
+          </w:tcPr>
+          <w:p>
+            <w:pPr>
+              <w:pStyle w:val="Normal"/>
+              <w:bidi w:val="0"/>
+              <w:jc w:val="left"/>
+              <w:rPr/>
+            </w:pPr>
+            <w:r>
+              <w:rPr/>
+            </w:r>
+          </w:p>
+        </w:tc>
+        <w:tc>
+          <w:tcPr>
+            <w:tcW w:w="1526" w:type="dxa"/>
+            <w:gridSpan w:val="2"/>
+            <w:tcBorders>
+              <w:top w:val="single" w:sz="4" w:space="0" w:color="000000"/>
+              <w:left w:val="single" w:sz="4" w:space="0" w:color="000000"/>
+              <w:bottom w:val="single" w:sz="4" w:space="0" w:color="000000"/>
+              <w:right w:val="single" w:sz="4" w:space="0" w:color="000000"/>
+            </w:tcBorders>
+            <w:vAlign w:val="center"/>
+          </w:tcPr>
+          <w:p>
+            <w:pPr>
+              <w:pStyle w:val="Normal"/>
+              <w:bidi w:val="0"/>
+              <w:jc w:val="left"/>
+              <w:rPr>
+                <w:rFonts w:ascii="Calibri" w:hAnsi="Calibri"/>
+                <w:b/>
+                <w:sz w:val="26"/>
+              </w:rPr>
+            </w:pPr>
+            <w:r>
+              <w:rPr>
+                <w:rFonts w:ascii="Calibri" w:hAnsi="Calibri"/>
+                <w:b/>
+                <w:sz w:val="26"/>
+              </w:rPr>
+              <w:t>ID</w:t>
+            </w:r>
+          </w:p>
+        </w:tc>
+        <w:tc>
+          <w:tcPr>
+            <w:tcW w:w="5242" w:type="dxa"/>
+            <w:tcBorders>
+              <w:top w:val="single" w:sz="4" w:space="0" w:color="000000"/>
+              <w:left w:val="single" w:sz="4" w:space="0" w:color="000000"/>
+              <w:bottom w:val="single" w:sz="4" w:space="0" w:color="000000"/>
+              <w:right w:val="single" w:sz="4" w:space="0" w:color="000000"/>
+            </w:tcBorders>
+            <w:vAlign w:val="center"/>
+          </w:tcPr>
+          <w:p>
+            <w:pPr>
+              <w:pStyle w:val="Normal"/>
+              <w:bidi w:val="0"/>
+              <w:jc w:val="left"/>
+              <w:rPr>
+                <w:rFonts w:ascii="Times New Roman" w:hAnsi="Times New Roman"/>
+                <w:sz w:val="24"/>
+              </w:rPr>
+            </w:pPr>
+            <w:r>
+              <w:rPr>
+                <w:rFonts w:ascii="Times New Roman" w:hAnsi="Times New Roman"/>
+                <w:sz w:val="24"/>
+              </w:rPr>
+              <w:t>0222220005101039</w:t>
+            </w:r>
+          </w:p>
+        </w:tc>
+      </w:tr>
+      <w:tr>
+        <w:trPr>
+          <w:trHeight w:val="475" w:hRule="atLeast"/>
+        </w:trPr>
+        <w:tc>
+          <w:tcPr>
+            <w:tcW w:w="2462" w:type="dxa"/>
+            <w:vMerge w:val="continue"/>
+            <w:tcBorders>
+              <w:top w:val="single" w:sz="4" w:space="0" w:color="000000"/>
+              <w:left w:val="single" w:sz="4" w:space="0" w:color="000000"/>
+              <w:bottom w:val="single" w:sz="4" w:space="0" w:color="000000"/>
+              <w:right w:val="single" w:sz="4" w:space="0" w:color="000000"/>
+            </w:tcBorders>
+            <w:vAlign w:val="center"/>
+          </w:tcPr>
+          <w:p>
+            <w:pPr>
+              <w:pStyle w:val="Normal"/>
+              <w:bidi w:val="0"/>
+              <w:jc w:val="left"/>
+              <w:rPr/>
+            </w:pPr>
+            <w:r>
+              <w:rPr/>
+            </w:r>
+          </w:p>
+        </w:tc>
+        <w:tc>
+          <w:tcPr>
+            <w:tcW w:w="1526" w:type="dxa"/>
+            <w:gridSpan w:val="2"/>
+            <w:tcBorders>
+              <w:top w:val="single" w:sz="4" w:space="0" w:color="000000"/>
+              <w:left w:val="single" w:sz="4" w:space="0" w:color="000000"/>
+              <w:bottom w:val="single" w:sz="4" w:space="0" w:color="000000"/>
+              <w:right w:val="single" w:sz="4" w:space="0" w:color="000000"/>
+            </w:tcBorders>
+            <w:vAlign w:val="center"/>
+          </w:tcPr>
+          <w:p>
+            <w:pPr>
+              <w:pStyle w:val="Normal"/>
+              <w:bidi w:val="0"/>
+              <w:jc w:val="left"/>
+              <w:rPr>
+                <w:rFonts w:ascii="Calibri" w:hAnsi="Calibri"/>
+                <w:b/>
+                <w:sz w:val="26"/>
+              </w:rPr>
+            </w:pPr>
+            <w:r>
+              <w:rPr>
+                <w:rFonts w:ascii="Calibri" w:hAnsi="Calibri"/>
+                <w:b/>
+                <w:sz w:val="26"/>
+              </w:rPr>
+              <w:t>SEMESTER</w:t>
+            </w:r>
+          </w:p>
+        </w:tc>
+        <w:tc>
+          <w:tcPr>
+            <w:tcW w:w="5242" w:type="dxa"/>
+            <w:tcBorders>
+              <w:top w:val="single" w:sz="4" w:space="0" w:color="000000"/>
+              <w:left w:val="single" w:sz="4" w:space="0" w:color="000000"/>
+              <w:bottom w:val="single" w:sz="4" w:space="0" w:color="000000"/>
+              <w:right w:val="single" w:sz="4" w:space="0" w:color="000000"/>
+            </w:tcBorders>
+            <w:vAlign w:val="center"/>
+          </w:tcPr>
+          <w:p>
+            <w:pPr>
+              <w:pStyle w:val="Normal"/>
+              <w:bidi w:val="0"/>
+              <w:jc w:val="left"/>
+              <w:rPr>
+                <w:rFonts w:ascii="Calibri" w:hAnsi="Calibri"/>
+                <w:sz w:val="24"/>
+              </w:rPr>
+            </w:pPr>
+            <w:r>
+              <w:rPr>
+                <w:rFonts w:ascii="Calibri" w:hAnsi="Calibri"/>
+                <w:sz w:val="24"/>
+              </w:rPr>
+              <w:t>8th</w:t>
+            </w:r>
+          </w:p>
+        </w:tc>
+      </w:tr>
+      <w:tr>
+        <w:trPr>
+          <w:trHeight w:val="475" w:hRule="atLeast"/>
+        </w:trPr>
+        <w:tc>
+          <w:tcPr>
+            <w:tcW w:w="2462" w:type="dxa"/>
+            <w:vMerge w:val="continue"/>
+            <w:tcBorders>
+              <w:top w:val="single" w:sz="4" w:space="0" w:color="000000"/>
+              <w:left w:val="single" w:sz="4" w:space="0" w:color="000000"/>
+              <w:bottom w:val="single" w:sz="4" w:space="0" w:color="000000"/>
+              <w:right w:val="single" w:sz="4" w:space="0" w:color="000000"/>
+            </w:tcBorders>
+            <w:vAlign w:val="center"/>
+          </w:tcPr>
+          <w:p>
+            <w:pPr>
+              <w:pStyle w:val="Normal"/>
+              <w:bidi w:val="0"/>
+              <w:jc w:val="left"/>
+              <w:rPr/>
+            </w:pPr>
+            <w:r>
+              <w:rPr/>
+            </w:r>
+          </w:p>
+        </w:tc>
+        <w:tc>
+          <w:tcPr>
+            <w:tcW w:w="1526" w:type="dxa"/>
+            <w:gridSpan w:val="2"/>
+            <w:tcBorders>
+              <w:top w:val="single" w:sz="4" w:space="0" w:color="000000"/>
+              <w:left w:val="single" w:sz="4" w:space="0" w:color="000000"/>
+              <w:bottom w:val="single" w:sz="4" w:space="0" w:color="000000"/>
+              <w:right w:val="single" w:sz="4" w:space="0" w:color="000000"/>
+            </w:tcBorders>
+            <w:vAlign w:val="center"/>
+          </w:tcPr>
+          <w:p>
+            <w:pPr>
+              <w:pStyle w:val="Normal"/>
+              <w:bidi w:val="0"/>
+              <w:jc w:val="left"/>
+              <w:rPr>
+                <w:rFonts w:ascii="Calibri" w:hAnsi="Calibri"/>
+                <w:b/>
+                <w:sz w:val="26"/>
+              </w:rPr>
+            </w:pPr>
+            <w:r>
+              <w:rPr>
+                <w:rFonts w:ascii="Calibri" w:hAnsi="Calibri"/>
+                <w:b/>
+                <w:sz w:val="26"/>
+              </w:rPr>
+              <w:t>BATCH</w:t>
+            </w:r>
+          </w:p>
+        </w:tc>
+        <w:tc>
+          <w:tcPr>
+            <w:tcW w:w="5242" w:type="dxa"/>
+            <w:tcBorders>
+              <w:top w:val="single" w:sz="4" w:space="0" w:color="000000"/>
+              <w:left w:val="single" w:sz="4" w:space="0" w:color="000000"/>
+              <w:bottom w:val="single" w:sz="4" w:space="0" w:color="000000"/>
+              <w:right w:val="single" w:sz="4" w:space="0" w:color="000000"/>
+            </w:tcBorders>
+            <w:vAlign w:val="center"/>
+          </w:tcPr>
+          <w:p>
+            <w:pPr>
+              <w:pStyle w:val="Normal"/>
+              <w:bidi w:val="0"/>
+              <w:jc w:val="left"/>
+              <w:rPr>
+                <w:rFonts w:ascii="Calibri" w:hAnsi="Calibri"/>
+                <w:sz w:val="24"/>
+              </w:rPr>
+            </w:pPr>
+            <w:r>
+              <w:rPr>
+                <w:rFonts w:ascii="Calibri" w:hAnsi="Calibri"/>
+                <w:sz w:val="24"/>
+              </w:rPr>
+              <w:t>42nd</w:t>
+            </w:r>
+          </w:p>
+        </w:tc>
+      </w:tr>
+      <w:tr>
+        <w:trPr>
+          <w:trHeight w:val="475" w:hRule="atLeast"/>
+        </w:trPr>
+        <w:tc>
+          <w:tcPr>
+            <w:tcW w:w="2462" w:type="dxa"/>
+            <w:vMerge w:val="continue"/>
+            <w:tcBorders>
+              <w:top w:val="single" w:sz="4" w:space="0" w:color="000000"/>
+              <w:left w:val="single" w:sz="4" w:space="0" w:color="000000"/>
+              <w:bottom w:val="single" w:sz="4" w:space="0" w:color="000000"/>
+              <w:right w:val="single" w:sz="4" w:space="0" w:color="000000"/>
+            </w:tcBorders>
+            <w:vAlign w:val="center"/>
+          </w:tcPr>
+          <w:p>
+            <w:pPr>
+              <w:pStyle w:val="Normal"/>
+              <w:bidi w:val="0"/>
+              <w:jc w:val="left"/>
+              <w:rPr/>
+            </w:pPr>
+            <w:r>
+              <w:rPr/>
+            </w:r>
+          </w:p>
+        </w:tc>
+        <w:tc>
+          <w:tcPr>
+            <w:tcW w:w="1526" w:type="dxa"/>
+            <w:gridSpan w:val="2"/>
+            <w:tcBorders>
+              <w:top w:val="single" w:sz="4" w:space="0" w:color="000000"/>
+              <w:left w:val="single" w:sz="4" w:space="0" w:color="000000"/>
+              <w:bottom w:val="single" w:sz="4" w:space="0" w:color="000000"/>
+              <w:right w:val="single" w:sz="4" w:space="0" w:color="000000"/>
+            </w:tcBorders>
+            <w:vAlign w:val="center"/>
+          </w:tcPr>
+          <w:p>
+            <w:pPr>
+              <w:pStyle w:val="Normal"/>
+              <w:bidi w:val="0"/>
+              <w:jc w:val="left"/>
+              <w:rPr>
+                <w:rFonts w:ascii="Calibri" w:hAnsi="Calibri"/>
+                <w:b/>
+                <w:sz w:val="26"/>
+              </w:rPr>
+            </w:pPr>
+            <w:r>
+              <w:rPr>
+                <w:rFonts w:ascii="Calibri" w:hAnsi="Calibri"/>
+                <w:b/>
+                <w:sz w:val="26"/>
+              </w:rPr>
+              <w:t>SESSION</w:t>
+            </w:r>
+          </w:p>
+        </w:tc>
+        <w:tc>
+          <w:tcPr>
+            <w:tcW w:w="5242" w:type="dxa"/>
+            <w:tcBorders>
+              <w:top w:val="single" w:sz="4" w:space="0" w:color="000000"/>
+              <w:left w:val="single" w:sz="4" w:space="0" w:color="000000"/>
+              <w:bottom w:val="single" w:sz="4" w:space="0" w:color="000000"/>
+              <w:right w:val="single" w:sz="4" w:space="0" w:color="000000"/>
+            </w:tcBorders>
+            <w:vAlign w:val="center"/>
+          </w:tcPr>
+          <w:p>
+            <w:pPr>
+              <w:pStyle w:val="Normal"/>
+              <w:bidi w:val="0"/>
+              <w:jc w:val="left"/>
+              <w:rPr>
+                <w:rFonts w:ascii="Calibri" w:hAnsi="Calibri"/>
+                <w:sz w:val="24"/>
+              </w:rPr>
+            </w:pPr>
+            <w:r>
+              <w:rPr>
+                <w:rFonts w:ascii="Calibri" w:hAnsi="Calibri"/>
+                <w:sz w:val="24"/>
+              </w:rPr>
+              <w:t>Spring 2026</w:t>
+            </w:r>
+          </w:p>
+        </w:tc>
+      </w:tr>
+      <w:tr>
+        <w:trPr>
+          <w:trHeight w:val="475" w:hRule="atLeast"/>
+        </w:trPr>
+        <w:tc>
+          <w:tcPr>
+            <w:tcW w:w="2462" w:type="dxa"/>
+            <w:vMerge w:val="continue"/>
+            <w:tcBorders>
+              <w:top w:val="single" w:sz="4" w:space="0" w:color="000000"/>
+              <w:left w:val="single" w:sz="4" w:space="0" w:color="000000"/>
+              <w:bottom w:val="single" w:sz="4" w:space="0" w:color="000000"/>
+              <w:right w:val="single" w:sz="4" w:space="0" w:color="000000"/>
+            </w:tcBorders>
+            <w:vAlign w:val="center"/>
+          </w:tcPr>
+          <w:p>
+            <w:pPr>
+              <w:pStyle w:val="Normal"/>
+              <w:bidi w:val="0"/>
+              <w:jc w:val="left"/>
+              <w:rPr/>
+            </w:pPr>
+            <w:r>
+              <w:rPr/>
+            </w:r>
+          </w:p>
+        </w:tc>
+        <w:tc>
+          <w:tcPr>
+            <w:tcW w:w="1526" w:type="dxa"/>
+            <w:gridSpan w:val="2"/>
+            <w:tcBorders>
+              <w:top w:val="single" w:sz="4" w:space="0" w:color="000000"/>
+              <w:left w:val="single" w:sz="4" w:space="0" w:color="000000"/>
+              <w:bottom w:val="single" w:sz="4" w:space="0" w:color="000000"/>
+              <w:right w:val="single" w:sz="4" w:space="0" w:color="000000"/>
+            </w:tcBorders>
+            <w:vAlign w:val="center"/>
+          </w:tcPr>
+          <w:p>
+            <w:pPr>
+              <w:pStyle w:val="Normal"/>
+              <w:bidi w:val="0"/>
+              <w:jc w:val="left"/>
+              <w:rPr>
+                <w:rFonts w:ascii="Calibri" w:hAnsi="Calibri"/>
+                <w:b/>
+                <w:sz w:val="26"/>
+              </w:rPr>
+            </w:pPr>
+            <w:r>
+              <w:rPr>
+                <w:rFonts w:ascii="Calibri" w:hAnsi="Calibri"/>
+                <w:b/>
+                <w:sz w:val="26"/>
+              </w:rPr>
+              <w:t>SECTION</w:t>
+            </w:r>
+          </w:p>
+        </w:tc>
+        <w:tc>
+          <w:tcPr>
+            <w:tcW w:w="5242" w:type="dxa"/>
+            <w:tcBorders>
+              <w:top w:val="single" w:sz="4" w:space="0" w:color="000000"/>
+              <w:left w:val="single" w:sz="4" w:space="0" w:color="000000"/>
+              <w:bottom w:val="single" w:sz="4" w:space="0" w:color="000000"/>
+              <w:right w:val="single" w:sz="4" w:space="0" w:color="000000"/>
+            </w:tcBorders>
+            <w:vAlign w:val="center"/>
+          </w:tcPr>
+          <w:p>
+            <w:pPr>
+              <w:pStyle w:val="Normal"/>
+              <w:bidi w:val="0"/>
+              <w:jc w:val="left"/>
+              <w:rPr>
+                <w:rFonts w:ascii="Calibri" w:hAnsi="Calibri"/>
+                <w:sz w:val="24"/>
+              </w:rPr>
+            </w:pPr>
+            <w:r>
+              <w:rPr>
+                <w:rFonts w:ascii="Calibri" w:hAnsi="Calibri"/>
+                <w:sz w:val="24"/>
+              </w:rPr>
+              <w:t>A</w:t>
+            </w:r>
+          </w:p>
+        </w:tc>
+      </w:tr>
+    </w:tbl>
+    <w:p>
+      <w:pPr>
+        <w:pStyle w:val="Normal"/>
+        <w:bidi w:val="0"/>
+        <w:jc w:val="left"/>
+        <w:rPr/>
+      </w:pPr>
+      <w:r>
+        <w:rPr/>
+      </w:r>
+    </w:p>
+    <w:p>
+      <w:pPr>
+        <w:sectPr>
+          <w:type w:val="nextPage"/>
+          <w:pgSz w:w="11906" w:h="16838"/>
+          <w:pgMar w:left="1138" w:right="1138" w:gutter="0" w:header="0" w:top="432" w:footer="0" w:bottom="864"/>
+          <w:pgNumType w:fmt="decimal"/>
+          <w:formProt w:val="false"/>
+          <w:textDirection w:val="lrTb"/>
+          <w:docGrid w:type="default" w:linePitch="600" w:charSpace="32768"/>
+        </w:sectPr>
+      </w:pPr>
+    </w:p>
+    <w:bookmarkStart w:id="0" w:name="X29b884abb6868d6f67506f8aa2f6381a63affbf"/>
     <w:p>
       <w:pPr>
         <w:pStyle w:val="Heading1"/>
         <w:keepNext/>
-        <w:spacing w:after="120"/>
-        <w:jc w:val="center"/>
       </w:pPr>
       <w:r>
         <w:t xml:space="preserve">Geographic Transportability of Genome-Based Antibiotic Resistance Prediction in</w:t>
@@ -40,98 +1318,181 @@
     <w:p>
       <w:pPr>
         <w:pStyle w:val="FirstParagraph"/>
-        <w:spacing w:after="1200"/>
-        <w:jc w:val="center"/>
-      </w:pPr>
-      <w:r>
-        <w:t xml:space="preserve">Research Track</w:t>
-      </w:r>
-    </w:p>
-    <w:p>
-      <w:pPr>
-        <w:pStyle w:val="BodyText"/>
-        <w:spacing w:after="120" w:before="720"/>
-        <w:jc w:val="center"/>
-      </w:pPr>
-      <w:r>
-        <w:rPr>
-          <w:caps/>
-          <w:sz w:val="20"/>
-        </w:rPr>
-        <w:t xml:space="preserve">Submitted to</w:t>
-      </w:r>
-    </w:p>
-    <w:p>
-      <w:pPr>
-        <w:pStyle w:val="BodyText"/>
-        <w:spacing w:after="120"/>
-        <w:jc w:val="center"/>
       </w:pPr>
       <w:r>
         <w:rPr>
           <w:b/>
           <w:bCs/>
         </w:rPr>
-        <w:t xml:space="preserve">Imtiaz Riad</w:t>
-      </w:r>
-      <w:r>
-        <w:br/>
-      </w:r>
-      <w:r>
-        <w:t xml:space="preserve">Co-Founder</w:t>
-      </w:r>
-      <w:r>
-        <w:br/>
-      </w:r>
-      <w:r>
-        <w:t xml:space="preserve">Authentic Four Technology</w:t>
-      </w:r>
-    </w:p>
-    <w:p>
-      <w:pPr>
-        <w:pStyle w:val="BodyText"/>
-        <w:spacing w:after="120" w:before="720"/>
-        <w:jc w:val="center"/>
-      </w:pPr>
+        <w:t xml:space="preserve">Abstract.</w:t>
+      </w:r>
+      <w:r>
+        <w:t xml:space="preserve"> </w:t>
+      </w:r>
+      <w:r>
+        <w:t xml:space="preserve">Machine learning models predict antibiotic resistance in</w:t>
+      </w:r>
+      <w:r>
+        <w:t xml:space="preserve"> </w:t>
+      </w:r>
       <w:r>
         <w:rPr>
-          <w:caps/>
-          <w:sz w:val="20"/>
+          <w:i/>
+          <w:iCs/>
         </w:rPr>
-        <w:t xml:space="preserve">Submitted by</w:t>
-      </w:r>
-    </w:p>
-    <w:p>
-      <w:pPr>
-        <w:pStyle w:val="BodyText"/>
-        <w:spacing w:after="120"/>
-        <w:jc w:val="center"/>
-      </w:pPr>
+        <w:t xml:space="preserve">M. tuberculosis</w:t>
+      </w:r>
+      <w:r>
+        <w:t xml:space="preserve"> </w:t>
+      </w:r>
+      <w:r>
+        <w:t xml:space="preserve">from the genome in</w:t>
+      </w:r>
+      <w:r>
+        <w:t xml:space="preserve"> </w:t>
+      </w:r>
+      <w:r>
+        <w:t xml:space="preserve">days rather than the weeks laboratory testing needs, but they are trained mostly on lineage 2 and 4</w:t>
+      </w:r>
+      <w:r>
+        <w:t xml:space="preserve"> </w:t>
+      </w:r>
+      <w:r>
+        <w:t xml:space="preserve">strains, while lineages 1 and 3 dominate South Asia. Using the public CRyPTIC dataset of</w:t>
+      </w:r>
+      <w:r>
+        <w:t xml:space="preserve"> </w:t>
+      </w:r>
+      <w:r>
+        <w:t xml:space="preserve">12,287 isolates with laboratory-confirmed resistance, we built a binary feature matrix of</w:t>
+      </w:r>
+      <w:r>
+        <w:t xml:space="preserve"> </w:t>
+      </w:r>
+      <w:r>
+        <w:t xml:space="preserve">1,021 mutations in 23 WHO-catalogue resistance genes</w:t>
+      </w:r>
+      <w:r>
+        <w:t xml:space="preserve"> </w:t>
+      </w:r>
+      <w:r>
+        <w:t xml:space="preserve">and trained logistic regression, random forest, gradient boosting and a shallow neural network for</w:t>
+      </w:r>
+      <w:r>
+        <w:t xml:space="preserve"> </w:t>
+      </w:r>
+      <w:r>
+        <w:t xml:space="preserve">eight drugs. Models were evaluated with a random split, a South Asia holdout (trained only on</w:t>
+      </w:r>
+      <w:r>
+        <w:t xml:space="preserve"> </w:t>
+      </w:r>
+      <w:r>
+        <w:t xml:space="preserve">non-South-Asian isolates, tested on 2,162 isolates from India, Pakistan and Nepal) and</w:t>
+      </w:r>
+      <w:r>
+        <w:t xml:space="preserve"> </w:t>
+      </w:r>
+      <w:r>
+        <w:t xml:space="preserve">leave-one-country-out, with transmission clusters kept on one side of every split, and benchmarked</w:t>
+      </w:r>
+      <w:r>
+        <w:t xml:space="preserve"> </w:t>
+      </w:r>
+      <w:r>
+        <w:t xml:space="preserve">against the WHO 2023 mutation catalogue. Aggregate performance transferred well: AUC on South Asian</w:t>
+      </w:r>
+      <w:r>
+        <w:t xml:space="preserve"> </w:t>
+      </w:r>
+      <w:r>
+        <w:t xml:space="preserve">isolates fell by at most 0.018 when South Asian data were withheld from</w:t>
+      </w:r>
+      <w:r>
+        <w:t xml:space="preserve"> </w:t>
+      </w:r>
+      <w:r>
+        <w:t xml:space="preserve">training. Stratifying by lineage told a different story. Resistant lineage 1 and lineage 3 isolates</w:t>
+      </w:r>
+      <w:r>
+        <w:t xml:space="preserve"> </w:t>
+      </w:r>
+      <w:r>
+        <w:t xml:space="preserve">were detected less often than lineage 2 isolates, with non-overlapping 95% confidence intervals</w:t>
+      </w:r>
+      <w:r>
+        <w:t xml:space="preserve"> </w:t>
+      </w:r>
+      <w:r>
+        <w:t xml:space="preserve">for isoniazid, rifampicin, levofloxacin and moxifloxacin (for example levofloxacin sensitivity</w:t>
+      </w:r>
+      <w:r>
+        <w:t xml:space="preserve"> </w:t>
+      </w:r>
+      <w:r>
+        <w:t xml:space="preserve">53.6% on lineage 1 against 93.8%</w:t>
+      </w:r>
+      <w:r>
+        <w:t xml:space="preserve"> </w:t>
+      </w:r>
+      <w:r>
+        <w:t xml:space="preserve">on lineage 2), and this deficit was shared by models that had seen South Asian data and by the WHO</w:t>
+      </w:r>
+      <w:r>
+        <w:t xml:space="preserve"> </w:t>
+      </w:r>
+      <w:r>
+        <w:t xml:space="preserve">catalogue, which uses no training data at all. The weakness is therefore in what is known about</w:t>
+      </w:r>
+      <w:r>
+        <w:t xml:space="preserve"> </w:t>
+      </w:r>
+      <w:r>
+        <w:t xml:space="preserve">resistance in these lineages, not only in where the training data came from. Region-specific</w:t>
+      </w:r>
+      <w:r>
+        <w:t xml:space="preserve"> </w:t>
+      </w:r>
+      <w:r>
+        <w:t xml:space="preserve">failures were also found: ethambutol resistance in a South Asian lineage 2 group carrying</w:t>
+      </w:r>
+      <w:r>
+        <w:t xml:space="preserve"> </w:t>
+      </w:r>
       <w:r>
         <w:rPr>
-          <w:b/>
-          <w:bCs/>
+          <w:i/>
+          <w:iCs/>
         </w:rPr>
-        <w:t xml:space="preserve">Rimjhim Dey</w:t>
-      </w:r>
-    </w:p>
-    <w:p>
-      <w:pPr>
-        <w:pStyle w:val="BodyText"/>
-        <w:spacing w:after="120" w:before="1400"/>
-        <w:jc w:val="center"/>
-      </w:pPr>
-      <w:r>
-        <w:t xml:space="preserve">4 October 2026</w:t>
-      </w:r>
-    </w:p>
-    <w:bookmarkEnd w:id="9"/>
-    <w:p>
-      <w:pPr>
-        <w:pStyle w:val="BodyText"/>
-      </w:pPr>
-      <w:r>
-        <w:br w:type="page"/>
+        <w:t xml:space="preserve">embC</w:t>
+      </w:r>
+      <w:r>
+        <w:t xml:space="preserve"> </w:t>
+      </w:r>
+      <w:r>
+        <w:t xml:space="preserve">A387V and</w:t>
+      </w:r>
+      <w:r>
+        <w:t xml:space="preserve"> </w:t>
+      </w:r>
+      <w:r>
+        <w:rPr>
+          <w:i/>
+          <w:iCs/>
+        </w:rPr>
+        <w:t xml:space="preserve">embB</w:t>
+      </w:r>
+      <w:r>
+        <w:t xml:space="preserve"> </w:t>
+      </w:r>
+      <w:r>
+        <w:t xml:space="preserve">Q445R, mutations absent or nearly absent among resistant training isolates, was</w:t>
+      </w:r>
+      <w:r>
+        <w:t xml:space="preserve"> </w:t>
+      </w:r>
+      <w:r>
+        <w:t xml:space="preserve">missed in 36 isolates.</w:t>
       </w:r>
     </w:p>
     <w:p>
@@ -143,13 +1504,163 @@
           <w:b/>
           <w:bCs/>
         </w:rPr>
-        <w:t xml:space="preserve">Abstract.</w:t>
-      </w:r>
-      <w:r>
-        <w:t xml:space="preserve"> </w:t>
-      </w:r>
-      <w:r>
-        <w:t xml:space="preserve">Machine learning models predict antibiotic resistance in</w:t>
+        <w:t xml:space="preserve">Keywords:</w:t>
+      </w:r>
+      <w:r>
+        <w:t xml:space="preserve"> </w:t>
+      </w:r>
+      <w:r>
+        <w:t xml:space="preserve">antimicrobial resistance · tuberculosis · whole-genome sequencing ·</w:t>
+      </w:r>
+      <w:r>
+        <w:t xml:space="preserve"> </w:t>
+      </w:r>
+      <w:r>
+        <w:t xml:space="preserve">machine learning · lineage · model generalisation · South Asia</w:t>
+      </w:r>
+    </w:p>
+    <w:p>
+      <w:pPr>
+        <w:pStyle w:val="BodyText"/>
+      </w:pPr>
+      <w:r>
+        <w:rPr>
+          <w:b/>
+          <w:bCs/>
+        </w:rPr>
+        <w:t xml:space="preserve">Summary in plain language.</w:t>
+      </w:r>
+      <w:r>
+        <w:t xml:space="preserve"> </w:t>
+      </w:r>
+      <w:r>
+        <w:t xml:space="preserve">Tuberculosis (TB) bacteria can become resistant to antibiotics through small changes (mutations)</w:t>
+      </w:r>
+      <w:r>
+        <w:t xml:space="preserve"> </w:t>
+      </w:r>
+      <w:r>
+        <w:t xml:space="preserve">in their DNA. Computer models can read these mutations and say which drugs will fail, in days</w:t>
+      </w:r>
+      <w:r>
+        <w:t xml:space="preserve"> </w:t>
+      </w:r>
+      <w:r>
+        <w:t xml:space="preserve">instead of the weeks a laboratory test takes. TB bacteria come in families called lineages.</w:t>
+      </w:r>
+      <w:r>
+        <w:t xml:space="preserve"> </w:t>
+      </w:r>
+      <w:r>
+        <w:t xml:space="preserve">Most models were built from lineages 2 and 4, common in Europe and East Asia, while South Asia</w:t>
+      </w:r>
+      <w:r>
+        <w:t xml:space="preserve"> </w:t>
+      </w:r>
+      <w:r>
+        <w:t xml:space="preserve">(including Bangladesh) has mostly lineages 1 and 3. We asked: do these models still work on South</w:t>
+      </w:r>
+      <w:r>
+        <w:t xml:space="preserve"> </w:t>
+      </w:r>
+      <w:r>
+        <w:t xml:space="preserve">Asian TB? We trained four kinds of model only on isolates from outside South Asia</w:t>
+      </w:r>
+      <w:r>
+        <w:t xml:space="preserve"> </w:t>
+      </w:r>
+      <w:r>
+        <w:t xml:space="preserve">(5,479–7,595 per drug) and tested them on 2,162 isolates</w:t>
+      </w:r>
+      <w:r>
+        <w:t xml:space="preserve"> </w:t>
+      </w:r>
+      <w:r>
+        <w:t xml:space="preserve">from India, Pakistan and Nepal.</w:t>
+      </w:r>
+      <w:r>
+        <w:t xml:space="preserve"> </w:t>
+      </w:r>
+      <w:r>
+        <w:rPr>
+          <w:b/>
+          <w:bCs/>
+        </w:rPr>
+        <w:t xml:space="preserve">Overall they worked about</w:t>
+      </w:r>
+      <w:r>
+        <w:rPr>
+          <w:b/>
+          <w:bCs/>
+        </w:rPr>
+        <w:t xml:space="preserve"> </w:t>
+      </w:r>
+      <w:r>
+        <w:rPr>
+          <w:b/>
+          <w:bCs/>
+        </w:rPr>
+        <w:t xml:space="preserve">as well as usual. But for lineage 1 and lineage 3 bacteria they missed many more resistant cases</w:t>
+      </w:r>
+      <w:r>
+        <w:t xml:space="preserve"> </w:t>
+      </w:r>
+      <w:r>
+        <w:t xml:space="preserve">— for levofloxacin, about half of resistant lineage 1 cases were missed, against about 6% for</w:t>
+      </w:r>
+      <w:r>
+        <w:t xml:space="preserve"> </w:t>
+      </w:r>
+      <w:r>
+        <w:t xml:space="preserve">lineage 2. The official WHO mutation list misses the same cases, so the problem is that the</w:t>
+      </w:r>
+      <w:r>
+        <w:t xml:space="preserve"> </w:t>
+      </w:r>
+      <w:r>
+        <w:t xml:space="preserve">resistance mutations of these South Asian lineages are not yet well known. Missing a resistant</w:t>
+      </w:r>
+      <w:r>
+        <w:t xml:space="preserve"> </w:t>
+      </w:r>
+      <w:r>
+        <w:t xml:space="preserve">case means a patient may get a drug that will not work, so South Asia needs resistance knowledge</w:t>
+      </w:r>
+      <w:r>
+        <w:t xml:space="preserve"> </w:t>
+      </w:r>
+      <w:r>
+        <w:t xml:space="preserve">built from its own lineages.</w:t>
+      </w:r>
+    </w:p>
+    <w:bookmarkStart w:id="1" w:name="introduction"/>
+    <w:p>
+      <w:pPr>
+        <w:pStyle w:val="Heading2"/>
+        <w:keepNext/>
+      </w:pPr>
+      <w:r>
+        <w:t xml:space="preserve">1. Introduction</w:t>
+      </w:r>
+    </w:p>
+    <w:p>
+      <w:pPr>
+        <w:pStyle w:val="FirstParagraph"/>
+      </w:pPr>
+      <w:r>
+        <w:t xml:space="preserve">Tuberculosis remains among the leading infectious causes of death, and drug resistance is the</w:t>
+      </w:r>
+      <w:r>
+        <w:t xml:space="preserve"> </w:t>
+      </w:r>
+      <w:r>
+        <w:t xml:space="preserve">main obstacle to treating it. Culture-based drug-susceptibility testing takes weeks. Whole-genome</w:t>
+      </w:r>
+      <w:r>
+        <w:t xml:space="preserve"> </w:t>
+      </w:r>
+      <w:r>
+        <w:t xml:space="preserve">sequencing offers a faster route: resistance in</w:t>
       </w:r>
       <w:r>
         <w:t xml:space="preserve"> </w:t>
@@ -165,153 +1676,25 @@
         <w:t xml:space="preserve"> </w:t>
       </w:r>
       <w:r>
-        <w:t xml:space="preserve">from the genome in</w:t>
-      </w:r>
-      <w:r>
-        <w:t xml:space="preserve"> </w:t>
-      </w:r>
-      <w:r>
-        <w:t xml:space="preserve">days rather than the weeks laboratory testing needs, but they are trained mostly on lineage 2 and 4</w:t>
-      </w:r>
-      <w:r>
-        <w:t xml:space="preserve"> </w:t>
-      </w:r>
-      <w:r>
-        <w:t xml:space="preserve">strains, while lineages 1 and 3 dominate South Asia. Using the public CRyPTIC dataset of</w:t>
-      </w:r>
-      <w:r>
-        <w:t xml:space="preserve"> </w:t>
-      </w:r>
-      <w:r>
-        <w:t xml:space="preserve">12,287 isolates with laboratory-confirmed resistance, we built a binary feature matrix of</w:t>
-      </w:r>
-      <w:r>
-        <w:t xml:space="preserve"> </w:t>
-      </w:r>
-      <w:r>
-        <w:t xml:space="preserve">1,021 mutations in 23 WHO-catalogue resistance genes</w:t>
-      </w:r>
-      <w:r>
-        <w:t xml:space="preserve"> </w:t>
-      </w:r>
-      <w:r>
-        <w:t xml:space="preserve">and trained logistic regression, random forest, gradient boosting and a shallow neural network for</w:t>
-      </w:r>
-      <w:r>
-        <w:t xml:space="preserve"> </w:t>
-      </w:r>
-      <w:r>
-        <w:t xml:space="preserve">eight drugs. Models were evaluated with a random split, a South Asia holdout (trained only on</w:t>
-      </w:r>
-      <w:r>
-        <w:t xml:space="preserve"> </w:t>
-      </w:r>
-      <w:r>
-        <w:t xml:space="preserve">non-South-Asian isolates, tested on 2,162 isolates from India, Pakistan and Nepal) and</w:t>
-      </w:r>
-      <w:r>
-        <w:t xml:space="preserve"> </w:t>
-      </w:r>
-      <w:r>
-        <w:t xml:space="preserve">leave-one-country-out, with transmission clusters kept on one side of every split, and benchmarked</w:t>
-      </w:r>
-      <w:r>
-        <w:t xml:space="preserve"> </w:t>
-      </w:r>
-      <w:r>
-        <w:t xml:space="preserve">against the WHO 2023 mutation catalogue. Aggregate performance transferred well: AUC on South Asian</w:t>
-      </w:r>
-      <w:r>
-        <w:t xml:space="preserve"> </w:t>
-      </w:r>
-      <w:r>
-        <w:t xml:space="preserve">isolates fell by at most 0.018 when South Asian data were withheld from</w:t>
-      </w:r>
-      <w:r>
-        <w:t xml:space="preserve"> </w:t>
-      </w:r>
-      <w:r>
-        <w:t xml:space="preserve">training. Stratifying by lineage told a different story. Resistant lineage 1 and lineage 3 isolates</w:t>
-      </w:r>
-      <w:r>
-        <w:t xml:space="preserve"> </w:t>
-      </w:r>
-      <w:r>
-        <w:t xml:space="preserve">were detected less often than lineage 2 isolates, with non-overlapping 95% confidence intervals</w:t>
-      </w:r>
-      <w:r>
-        <w:t xml:space="preserve"> </w:t>
-      </w:r>
-      <w:r>
-        <w:t xml:space="preserve">for isoniazid, rifampicin, levofloxacin and moxifloxacin (for example levofloxacin sensitivity</w:t>
-      </w:r>
-      <w:r>
-        <w:t xml:space="preserve"> </w:t>
-      </w:r>
-      <w:r>
-        <w:t xml:space="preserve">53.6% on lineage 1 against 93.8%</w:t>
-      </w:r>
-      <w:r>
-        <w:t xml:space="preserve"> </w:t>
-      </w:r>
-      <w:r>
-        <w:t xml:space="preserve">on lineage 2), and this deficit was shared by models that had seen South Asian data and by the WHO</w:t>
-      </w:r>
-      <w:r>
-        <w:t xml:space="preserve"> </w:t>
-      </w:r>
-      <w:r>
-        <w:t xml:space="preserve">catalogue, which uses no training data at all. The weakness is therefore in what is known about</w:t>
-      </w:r>
-      <w:r>
-        <w:t xml:space="preserve"> </w:t>
-      </w:r>
-      <w:r>
-        <w:t xml:space="preserve">resistance in these lineages, not only in where the training data came from. Region-specific</w:t>
-      </w:r>
-      <w:r>
-        <w:t xml:space="preserve"> </w:t>
-      </w:r>
-      <w:r>
-        <w:t xml:space="preserve">failures were also found: ethambutol resistance in a South Asian lineage 2 group carrying</w:t>
-      </w:r>
-      <w:r>
-        <w:t xml:space="preserve"> </w:t>
-      </w:r>
-      <w:r>
-        <w:rPr>
-          <w:i/>
-          <w:iCs/>
-        </w:rPr>
-        <w:t xml:space="preserve">embC</w:t>
-      </w:r>
-      <w:r>
-        <w:t xml:space="preserve"> </w:t>
-      </w:r>
-      <w:r>
-        <w:t xml:space="preserve">A387V and</w:t>
-      </w:r>
-      <w:r>
-        <w:t xml:space="preserve"> </w:t>
-      </w:r>
-      <w:r>
-        <w:rPr>
-          <w:i/>
-          <w:iCs/>
-        </w:rPr>
-        <w:t xml:space="preserve">embB</w:t>
-      </w:r>
-      <w:r>
-        <w:t xml:space="preserve"> </w:t>
-      </w:r>
-      <w:r>
-        <w:t xml:space="preserve">Q445R, mutations absent or nearly absent among resistant training isolates, was</w:t>
-      </w:r>
-      <w:r>
-        <w:t xml:space="preserve"> </w:t>
-      </w:r>
-      <w:r>
-        <w:t xml:space="preserve">missed in 36 isolates.</w:t>
+        <w:t xml:space="preserve">arises almost entirely from</w:t>
+      </w:r>
+      <w:r>
+        <w:t xml:space="preserve"> </w:t>
+      </w:r>
+      <w:r>
+        <w:t xml:space="preserve">chromosomal mutations, so a model that knows which mutations matter can read resistance off the</w:t>
+      </w:r>
+      <w:r>
+        <w:t xml:space="preserve"> </w:t>
+      </w:r>
+      <w:r>
+        <w:t xml:space="preserve">genome. The WHO mutation catalogue (2021, updated 2023) [2] and machine learning classifiers built</w:t>
+      </w:r>
+      <w:r>
+        <w:t xml:space="preserve"> </w:t>
+      </w:r>
+      <w:r>
+        <w:t xml:space="preserve">on large collections such as CRyPTIC [1] report high accuracy for first-line drugs [11].</w:t>
       </w:r>
     </w:p>
     <w:p>
@@ -319,23 +1702,61 @@
         <w:pStyle w:val="BodyText"/>
       </w:pPr>
       <w:r>
+        <w:t xml:space="preserve">That accuracy is measured on strains like those the models were built from. The</w:t>
+      </w:r>
+      <w:r>
+        <w:t xml:space="preserve"> </w:t>
+      </w:r>
+      <w:r>
         <w:rPr>
-          <w:b/>
-          <w:bCs/>
+          <w:i/>
+          <w:iCs/>
         </w:rPr>
-        <w:t xml:space="preserve">Keywords:</w:t>
-      </w:r>
-      <w:r>
-        <w:t xml:space="preserve"> </w:t>
-      </w:r>
-      <w:r>
-        <w:t xml:space="preserve">antimicrobial resistance · tuberculosis · whole-genome sequencing ·</w:t>
-      </w:r>
-      <w:r>
-        <w:t xml:space="preserve"> </w:t>
-      </w:r>
-      <w:r>
-        <w:t xml:space="preserve">machine learning · lineage · model generalisation · South Asia</w:t>
+        <w:t xml:space="preserve">M.</w:t>
+      </w:r>
+      <w:r>
+        <w:rPr>
+          <w:i/>
+          <w:iCs/>
+        </w:rPr>
+        <w:t xml:space="preserve"> </w:t>
+      </w:r>
+      <w:r>
+        <w:rPr>
+          <w:i/>
+          <w:iCs/>
+        </w:rPr>
+        <w:t xml:space="preserve">tuberculosis</w:t>
+      </w:r>
+      <w:r>
+        <w:t xml:space="preserve"> </w:t>
+      </w:r>
+      <w:r>
+        <w:t xml:space="preserve">complex is divided into lineages with distinct geography: lineages 2 and 4</w:t>
+      </w:r>
+      <w:r>
+        <w:t xml:space="preserve"> </w:t>
+      </w:r>
+      <w:r>
+        <w:t xml:space="preserve">dominate East Asia, Europe and the Americas, while lineages 1 and 3 predominate in South Asia,</w:t>
+      </w:r>
+      <w:r>
+        <w:t xml:space="preserve"> </w:t>
+      </w:r>
+      <w:r>
+        <w:t xml:space="preserve">including India [8]. Resistance knowledge is biased toward the globally dominant</w:t>
+      </w:r>
+      <w:r>
+        <w:t xml:space="preserve"> </w:t>
+      </w:r>
+      <w:r>
+        <w:t xml:space="preserve">lineages [8], and China built a national catalogue because the global one under-performed locally</w:t>
+      </w:r>
+      <w:r>
+        <w:t xml:space="preserve"> </w:t>
+      </w:r>
+      <w:r>
+        <w:t xml:space="preserve">[6]. No comparable evaluation exists for South Asia.</w:t>
       </w:r>
     </w:p>
     <w:p>
@@ -347,119 +1768,42 @@
           <w:b/>
           <w:bCs/>
         </w:rPr>
-        <w:t xml:space="preserve">Summary in plain language.</w:t>
-      </w:r>
-      <w:r>
-        <w:t xml:space="preserve"> </w:t>
-      </w:r>
-      <w:r>
-        <w:t xml:space="preserve">Tuberculosis (TB) bacteria can become resistant to antibiotics through small changes (mutations)</w:t>
-      </w:r>
-      <w:r>
-        <w:t xml:space="preserve"> </w:t>
-      </w:r>
-      <w:r>
-        <w:t xml:space="preserve">in their DNA. Computer models can read these mutations and say which drugs will fail, in days</w:t>
-      </w:r>
-      <w:r>
-        <w:t xml:space="preserve"> </w:t>
-      </w:r>
-      <w:r>
-        <w:t xml:space="preserve">instead of the weeks a laboratory test takes. TB bacteria come in families called lineages.</w:t>
-      </w:r>
-      <w:r>
-        <w:t xml:space="preserve"> </w:t>
-      </w:r>
-      <w:r>
-        <w:t xml:space="preserve">Most models were built from lineages 2 and 4, common in Europe and East Asia, while South Asia</w:t>
-      </w:r>
-      <w:r>
-        <w:t xml:space="preserve"> </w:t>
-      </w:r>
-      <w:r>
-        <w:t xml:space="preserve">(including Bangladesh) has mostly lineages 1 and 3. We asked: do these models still work on South</w:t>
-      </w:r>
-      <w:r>
-        <w:t xml:space="preserve"> </w:t>
-      </w:r>
-      <w:r>
-        <w:t xml:space="preserve">Asian TB? We trained four kinds of model only on isolates from outside South Asia</w:t>
-      </w:r>
-      <w:r>
-        <w:t xml:space="preserve"> </w:t>
-      </w:r>
-      <w:r>
-        <w:t xml:space="preserve">(5,479–7,595 per drug) and tested them on 2,162 isolates</w:t>
-      </w:r>
-      <w:r>
-        <w:t xml:space="preserve"> </w:t>
-      </w:r>
-      <w:r>
-        <w:t xml:space="preserve">from India, Pakistan and Nepal.</w:t>
-      </w:r>
-      <w:r>
-        <w:t xml:space="preserve"> </w:t>
-      </w:r>
-      <w:r>
-        <w:rPr>
-          <w:b/>
-          <w:bCs/>
-        </w:rPr>
-        <w:t xml:space="preserve">Overall they worked about</w:t>
-      </w:r>
-      <w:r>
-        <w:rPr>
-          <w:b/>
-          <w:bCs/>
-        </w:rPr>
-        <w:t xml:space="preserve"> </w:t>
-      </w:r>
-      <w:r>
-        <w:rPr>
-          <w:b/>
-          <w:bCs/>
-        </w:rPr>
-        <w:t xml:space="preserve">as well as usual. But for lineage 1 and lineage 3 bacteria they missed many more resistant cases</w:t>
-      </w:r>
-      <w:r>
-        <w:t xml:space="preserve"> </w:t>
-      </w:r>
-      <w:r>
-        <w:t xml:space="preserve">— for levofloxacin, about half of resistant lineage 1 cases were missed, against about 6% for</w:t>
-      </w:r>
-      <w:r>
-        <w:t xml:space="preserve"> </w:t>
-      </w:r>
-      <w:r>
-        <w:t xml:space="preserve">lineage 2. The official WHO mutation list misses the same cases, so the problem is that the</w:t>
-      </w:r>
-      <w:r>
-        <w:t xml:space="preserve"> </w:t>
-      </w:r>
-      <w:r>
-        <w:t xml:space="preserve">resistance mutations of these South Asian lineages are not yet well known. Missing a resistant</w:t>
-      </w:r>
-      <w:r>
-        <w:t xml:space="preserve"> </w:t>
-      </w:r>
-      <w:r>
-        <w:t xml:space="preserve">case means a patient may get a drug that will not work, so South Asia needs resistance knowledge</w:t>
-      </w:r>
-      <w:r>
-        <w:t xml:space="preserve"> </w:t>
-      </w:r>
-      <w:r>
-        <w:t xml:space="preserve">built from its own lineages.</w:t>
+        <w:t xml:space="preserve">Research question.</w:t>
+      </w:r>
+      <w:r>
+        <w:t xml:space="preserve"> </w:t>
+      </w:r>
+      <w:r>
+        <w:t xml:space="preserve">Do genome-based resistance models still work on South Asian strains,</w:t>
+      </w:r>
+      <w:r>
+        <w:t xml:space="preserve"> </w:t>
+      </w:r>
+      <w:r>
+        <w:t xml:space="preserve">and if not, which resistance cases do they miss? This report presents the full pilot study: data</w:t>
+      </w:r>
+      <w:r>
+        <w:t xml:space="preserve"> </w:t>
+      </w:r>
+      <w:r>
+        <w:t xml:space="preserve">preparation, feature construction, leakage-controlled evaluation under three protocols, a WHO</w:t>
+      </w:r>
+      <w:r>
+        <w:t xml:space="preserve"> </w:t>
+      </w:r>
+      <w:r>
+        <w:t xml:space="preserve">catalogue benchmark and an error analysis by lineage.</w:t>
       </w:r>
     </w:p>
-    <w:bookmarkStart w:id="10" w:name="introduction"/>
+    <w:bookmarkEnd w:id="0"/>
+    <w:bookmarkStart w:id="2" w:name="related-work"/>
     <w:p>
       <w:pPr>
         <w:pStyle w:val="Heading2"/>
         <w:keepNext/>
       </w:pPr>
       <w:r>
-        <w:t xml:space="preserve">1. Introduction</w:t>
+        <w:t xml:space="preserve">2. Related work</w:t>
       </w:r>
     </w:p>
     <w:p>
@@ -467,53 +1811,111 @@
         <w:pStyle w:val="FirstParagraph"/>
       </w:pPr>
       <w:r>
-        <w:t xml:space="preserve">Tuberculosis remains among the leading infectious causes of death, and drug resistance is the</w:t>
-      </w:r>
-      <w:r>
-        <w:t xml:space="preserve"> </w:t>
-      </w:r>
-      <w:r>
-        <w:t xml:space="preserve">main obstacle to treating it. Culture-based drug-susceptibility testing takes weeks. Whole-genome</w:t>
-      </w:r>
-      <w:r>
-        <w:t xml:space="preserve"> </w:t>
-      </w:r>
-      <w:r>
-        <w:t xml:space="preserve">sequencing offers a faster route: resistance in</w:t>
-      </w:r>
-      <w:r>
-        <w:t xml:space="preserve"> </w:t>
-      </w:r>
+        <w:t xml:space="preserve">First-line prediction is mature: published models reach AUC of about 0.99 for rifampicin and</w:t>
+      </w:r>
+      <w:r>
+        <w:t xml:space="preserve"> </w:t>
+      </w:r>
+      <w:r>
+        <w:t xml:space="preserve">0.98 for isoniazid, and most report at least 90% sensitivity for isoniazid [11]. The WHO catalogue</w:t>
+      </w:r>
+      <w:r>
+        <w:t xml:space="preserve"> </w:t>
+      </w:r>
+      <w:r>
+        <w:t xml:space="preserve">[2] is the clinical reference, implemented in tools such as TB-Profiler and Mykrobe. MIC</w:t>
+      </w:r>
+      <w:r>
+        <w:t xml:space="preserve"> </w:t>
+      </w:r>
+      <w:r>
+        <w:t xml:space="preserve">regression on CRyPTIC has been published for 13 drugs [7]. The Farhat group's GenTB [3] and their</w:t>
+      </w:r>
+      <w:r>
+        <w:t xml:space="preserve"> </w:t>
+      </w:r>
+      <w:r>
+        <w:t xml:space="preserve">study of geographic heterogeneity [4] are the closest prior work on cross-region transfer.</w:t>
+      </w:r>
+      <w:r>
+        <w:t xml:space="preserve"> </w:t>
+      </w:r>
+      <w:r>
+        <w:t xml:space="preserve">Lineage dependence has been addressed by feature reweighting (FW-RF) [5] and by China's national</w:t>
+      </w:r>
+      <w:r>
+        <w:t xml:space="preserve"> </w:t>
+      </w:r>
+      <w:r>
+        <w:t xml:space="preserve">catalogue [6]. Recent benchmarks [9, 10] name second-line and newer drugs as the open</w:t>
+      </w:r>
+      <w:r>
+        <w:t xml:space="preserve"> </w:t>
+      </w:r>
+      <w:r>
+        <w:t xml:space="preserve">problems. What remains untested is a lineage-resolved evaluation on South Asian isolates with</w:t>
+      </w:r>
+      <w:r>
+        <w:t xml:space="preserve"> </w:t>
+      </w:r>
+      <w:r>
+        <w:t xml:space="preserve">transmission-aware splits, and that is the contribution here.</w:t>
+      </w:r>
+    </w:p>
+    <w:bookmarkEnd w:id="1"/>
+    <w:bookmarkStart w:id="3" w:name="data"/>
+    <w:p>
+      <w:pPr>
+        <w:pStyle w:val="Heading2"/>
+        <w:keepNext/>
+      </w:pPr>
+      <w:r>
+        <w:t xml:space="preserve">3. Data</w:t>
+      </w:r>
+    </w:p>
+    <w:p>
+      <w:pPr>
+        <w:pStyle w:val="FirstParagraph"/>
+      </w:pPr>
       <w:r>
         <w:rPr>
-          <w:i/>
-          <w:iCs/>
+          <w:b/>
+          <w:bCs/>
         </w:rPr>
-        <w:t xml:space="preserve">M. tuberculosis</w:t>
-      </w:r>
-      <w:r>
-        <w:t xml:space="preserve"> </w:t>
-      </w:r>
-      <w:r>
-        <w:t xml:space="preserve">arises almost entirely from</w:t>
-      </w:r>
-      <w:r>
-        <w:t xml:space="preserve"> </w:t>
-      </w:r>
-      <w:r>
-        <w:t xml:space="preserve">chromosomal mutations, so a model that knows which mutations matter can read resistance off the</w:t>
-      </w:r>
-      <w:r>
-        <w:t xml:space="preserve"> </w:t>
-      </w:r>
-      <w:r>
-        <w:t xml:space="preserve">genome. The WHO mutation catalogue (2021, updated 2023) [2] and machine learning classifiers built</w:t>
-      </w:r>
-      <w:r>
-        <w:t xml:space="preserve"> </w:t>
-      </w:r>
-      <w:r>
-        <w:t xml:space="preserve">on large collections such as CRyPTIC [1] report high accuracy for first-line drugs [11].</w:t>
+        <w:t xml:space="preserve">Source.</w:t>
+      </w:r>
+      <w:r>
+        <w:t xml:space="preserve"> </w:t>
+      </w:r>
+      <w:r>
+        <w:t xml:space="preserve">CRyPTIC consortium, release June 2022 [1], public EBI FTP. We used the reuse table of 12,287 isolates with binary resistant/susceptible phenotypes</w:t>
+      </w:r>
+      <w:r>
+        <w:t xml:space="preserve"> </w:t>
+      </w:r>
+      <w:r>
+        <w:t xml:space="preserve">from UKMYC microtitre plates, the per-isolate mutation table (</w:t>
+      </w:r>
+      <w:r>
+        <w:rPr>
+          <w:rStyle w:val="VerbatimChar"/>
+        </w:rPr>
+        <w:t xml:space="preserve">MUTATIONS_GPI</w:t>
+      </w:r>
+      <w:r>
+        <w:t xml:space="preserve">), sample</w:t>
+      </w:r>
+      <w:r>
+        <w:t xml:space="preserve"> </w:t>
+      </w:r>
+      <w:r>
+        <w:t xml:space="preserve">metadata for country, Mykrobe lineage calls and the consortium's precomputed pairwise SNP</w:t>
+      </w:r>
+      <w:r>
+        <w:t xml:space="preserve"> </w:t>
+      </w:r>
+      <w:r>
+        <w:t xml:space="preserve">distances.</w:t>
       </w:r>
     </w:p>
     <w:p>
@@ -521,61 +1923,41 @@
         <w:pStyle w:val="BodyText"/>
       </w:pPr>
       <w:r>
-        <w:t xml:space="preserve">That accuracy is measured on strains like those the models were built from. The</w:t>
-      </w:r>
-      <w:r>
-        <w:t xml:space="preserve"> </w:t>
-      </w:r>
-      <w:r>
         <w:rPr>
-          <w:i/>
-          <w:iCs/>
+          <w:b/>
+          <w:bCs/>
         </w:rPr>
-        <w:t xml:space="preserve">M.</w:t>
-      </w:r>
-      <w:r>
-        <w:rPr>
-          <w:i/>
-          <w:iCs/>
-        </w:rPr>
-        <w:t xml:space="preserve"> </w:t>
-      </w:r>
-      <w:r>
-        <w:rPr>
-          <w:i/>
-          <w:iCs/>
-        </w:rPr>
-        <w:t xml:space="preserve">tuberculosis</w:t>
-      </w:r>
-      <w:r>
-        <w:t xml:space="preserve"> </w:t>
-      </w:r>
-      <w:r>
-        <w:t xml:space="preserve">complex is divided into lineages with distinct geography: lineages 2 and 4</w:t>
-      </w:r>
-      <w:r>
-        <w:t xml:space="preserve"> </w:t>
-      </w:r>
-      <w:r>
-        <w:t xml:space="preserve">dominate East Asia, Europe and the Americas, while lineages 1 and 3 predominate in South Asia,</w:t>
-      </w:r>
-      <w:r>
-        <w:t xml:space="preserve"> </w:t>
-      </w:r>
-      <w:r>
-        <w:t xml:space="preserve">including India [8]. Resistance knowledge is biased toward the globally dominant</w:t>
-      </w:r>
-      <w:r>
-        <w:t xml:space="preserve"> </w:t>
-      </w:r>
-      <w:r>
-        <w:t xml:space="preserve">lineages [8], and China built a national catalogue because the global one under-performed locally</w:t>
-      </w:r>
-      <w:r>
-        <w:t xml:space="preserve"> </w:t>
-      </w:r>
-      <w:r>
-        <w:t xml:space="preserve">[6]. No comparable evaluation exists for South Asia.</w:t>
+        <w:t xml:space="preserve">Labels.</w:t>
+      </w:r>
+      <w:r>
+        <w:t xml:space="preserve"> </w:t>
+      </w:r>
+      <w:r>
+        <w:t xml:space="preserve">Phenotypes with LOW reading quality, intermediate (I) calls and missing values</w:t>
+      </w:r>
+      <w:r>
+        <w:t xml:space="preserve"> </w:t>
+      </w:r>
+      <w:r>
+        <w:t xml:space="preserve">were excluded per drug. Eight drugs had enough resistant isolates in both regions: isoniazid (INH),</w:t>
+      </w:r>
+      <w:r>
+        <w:t xml:space="preserve"> </w:t>
+      </w:r>
+      <w:r>
+        <w:t xml:space="preserve">rifampicin (RIF), ethambutol (EMB), ethionamide (ETH), levofloxacin (LEV), moxifloxacin (MXF),</w:t>
+      </w:r>
+      <w:r>
+        <w:t xml:space="preserve"> </w:t>
+      </w:r>
+      <w:r>
+        <w:t xml:space="preserve">kanamycin (KAN) and amikacin (AMI). Bedaquiline, delamanid, linezolid and clofazimine were dropped</w:t>
+      </w:r>
+      <w:r>
+        <w:t xml:space="preserve"> </w:t>
+      </w:r>
+      <w:r>
+        <w:t xml:space="preserve">for too few resistant cases.</w:t>
       </w:r>
     </w:p>
     <w:p>
@@ -587,154 +1969,43 @@
           <w:b/>
           <w:bCs/>
         </w:rPr>
-        <w:t xml:space="preserve">Research question.</w:t>
-      </w:r>
-      <w:r>
-        <w:t xml:space="preserve"> </w:t>
-      </w:r>
-      <w:r>
-        <w:t xml:space="preserve">Do genome-based resistance models still work on South Asian strains,</w:t>
-      </w:r>
-      <w:r>
-        <w:t xml:space="preserve"> </w:t>
-      </w:r>
-      <w:r>
-        <w:t xml:space="preserve">and if not, which resistance cases do they miss? This report presents the full pilot study: data</w:t>
-      </w:r>
-      <w:r>
-        <w:t xml:space="preserve"> </w:t>
-      </w:r>
-      <w:r>
-        <w:t xml:space="preserve">preparation, feature construction, leakage-controlled evaluation under three protocols, a WHO</w:t>
-      </w:r>
-      <w:r>
-        <w:t xml:space="preserve"> </w:t>
-      </w:r>
-      <w:r>
-        <w:t xml:space="preserve">catalogue benchmark and an error analysis by lineage.</w:t>
-      </w:r>
-    </w:p>
-    <w:bookmarkEnd w:id="10"/>
-    <w:bookmarkStart w:id="11" w:name="related-work"/>
-    <w:p>
-      <w:pPr>
-        <w:pStyle w:val="Heading2"/>
-        <w:keepNext/>
-      </w:pPr>
-      <w:r>
-        <w:t xml:space="preserve">2. Related work</w:t>
-      </w:r>
-    </w:p>
-    <w:p>
-      <w:pPr>
-        <w:pStyle w:val="FirstParagraph"/>
-      </w:pPr>
-      <w:r>
-        <w:t xml:space="preserve">First-line prediction is mature: published models reach AUC of about 0.99 for rifampicin and</w:t>
-      </w:r>
-      <w:r>
-        <w:t xml:space="preserve"> </w:t>
-      </w:r>
-      <w:r>
-        <w:t xml:space="preserve">0.98 for isoniazid, and most report at least 90% sensitivity for isoniazid [11]. The WHO catalogue</w:t>
-      </w:r>
-      <w:r>
-        <w:t xml:space="preserve"> </w:t>
-      </w:r>
-      <w:r>
-        <w:t xml:space="preserve">[2] is the clinical reference, implemented in tools such as TB-Profiler and Mykrobe. MIC</w:t>
-      </w:r>
-      <w:r>
-        <w:t xml:space="preserve"> </w:t>
-      </w:r>
-      <w:r>
-        <w:t xml:space="preserve">regression on CRyPTIC has been published for 13 drugs [7]. The Farhat group's GenTB [3] and their</w:t>
-      </w:r>
-      <w:r>
-        <w:t xml:space="preserve"> </w:t>
-      </w:r>
-      <w:r>
-        <w:t xml:space="preserve">study of geographic heterogeneity [4] are the closest prior work on cross-region transfer.</w:t>
-      </w:r>
-      <w:r>
-        <w:t xml:space="preserve"> </w:t>
-      </w:r>
-      <w:r>
-        <w:t xml:space="preserve">Lineage dependence has been addressed by feature reweighting (FW-RF) [5] and by China's national</w:t>
-      </w:r>
-      <w:r>
-        <w:t xml:space="preserve"> </w:t>
-      </w:r>
-      <w:r>
-        <w:t xml:space="preserve">catalogue [6]. Recent benchmarks [9, 10] name second-line and newer drugs as the open</w:t>
-      </w:r>
-      <w:r>
-        <w:t xml:space="preserve"> </w:t>
-      </w:r>
-      <w:r>
-        <w:t xml:space="preserve">problems. What remains untested is a lineage-resolved evaluation on South Asian isolates with</w:t>
-      </w:r>
-      <w:r>
-        <w:t xml:space="preserve"> </w:t>
-      </w:r>
-      <w:r>
-        <w:t xml:space="preserve">transmission-aware splits, and that is the contribution here.</w:t>
-      </w:r>
-    </w:p>
-    <w:bookmarkEnd w:id="11"/>
-    <w:bookmarkStart w:id="15" w:name="data"/>
-    <w:p>
-      <w:pPr>
-        <w:pStyle w:val="Heading2"/>
-        <w:keepNext/>
-      </w:pPr>
-      <w:r>
-        <w:t xml:space="preserve">3. Data</w:t>
-      </w:r>
-    </w:p>
-    <w:p>
-      <w:pPr>
-        <w:pStyle w:val="FirstParagraph"/>
-      </w:pPr>
-      <w:r>
-        <w:rPr>
-          <w:b/>
-          <w:bCs/>
-        </w:rPr>
-        <w:t xml:space="preserve">Source.</w:t>
-      </w:r>
-      <w:r>
-        <w:t xml:space="preserve"> </w:t>
-      </w:r>
-      <w:r>
-        <w:t xml:space="preserve">CRyPTIC consortium, release June 2022 [1], public EBI FTP. We used the reuse table of 12,287 isolates with binary resistant/susceptible phenotypes</w:t>
-      </w:r>
-      <w:r>
-        <w:t xml:space="preserve"> </w:t>
-      </w:r>
-      <w:r>
-        <w:t xml:space="preserve">from UKMYC microtitre plates, the per-isolate mutation table (</w:t>
-      </w:r>
-      <w:r>
-        <w:rPr>
-          <w:rStyle w:val="VerbatimChar"/>
-        </w:rPr>
-        <w:t xml:space="preserve">MUTATIONS_GPI</w:t>
-      </w:r>
-      <w:r>
-        <w:t xml:space="preserve">), sample</w:t>
-      </w:r>
-      <w:r>
-        <w:t xml:space="preserve"> </w:t>
-      </w:r>
-      <w:r>
-        <w:t xml:space="preserve">metadata for country, Mykrobe lineage calls and the consortium's precomputed pairwise SNP</w:t>
-      </w:r>
-      <w:r>
-        <w:t xml:space="preserve"> </w:t>
-      </w:r>
-      <w:r>
-        <w:t xml:space="preserve">distances.</w:t>
+        <w:t xml:space="preserve">Country.</w:t>
+      </w:r>
+      <w:r>
+        <w:t xml:space="preserve"> </w:t>
+      </w:r>
+      <w:r>
+        <w:t xml:space="preserve">Country of sampling was taken from the sample table, falling back to the</w:t>
+      </w:r>
+      <w:r>
+        <w:t xml:space="preserve"> </w:t>
+      </w:r>
+      <w:r>
+        <w:t xml:space="preserve">collecting site where that site only serves its own country. Isolates collected by the</w:t>
+      </w:r>
+      <w:r>
+        <w:t xml:space="preserve"> </w:t>
+      </w:r>
+      <w:r>
+        <w:t xml:space="preserve">multi-country reference laboratories in Gauting and Milan without a recorded country</w:t>
+      </w:r>
+      <w:r>
+        <w:t xml:space="preserve"> </w:t>
+      </w:r>
+      <w:r>
+        <w:t xml:space="preserve">(1,137) were excluded from every protocol, leaving 11,150.</w:t>
+      </w:r>
+      <w:r>
+        <w:t xml:space="preserve"> </w:t>
+      </w:r>
+      <w:r>
+        <w:t xml:space="preserve">The South Asian test set is 2,162 isolates: India 1,476,</w:t>
+      </w:r>
+      <w:r>
+        <w:t xml:space="preserve"> </w:t>
+      </w:r>
+      <w:r>
+        <w:t xml:space="preserve">Pakistan 489 and Nepal 197.</w:t>
       </w:r>
     </w:p>
     <w:p>
@@ -746,37 +2017,31 @@
           <w:b/>
           <w:bCs/>
         </w:rPr>
-        <w:t xml:space="preserve">Labels.</w:t>
-      </w:r>
-      <w:r>
-        <w:t xml:space="preserve"> </w:t>
-      </w:r>
-      <w:r>
-        <w:t xml:space="preserve">Phenotypes with LOW reading quality, intermediate (I) calls and missing values</w:t>
-      </w:r>
-      <w:r>
-        <w:t xml:space="preserve"> </w:t>
-      </w:r>
-      <w:r>
-        <w:t xml:space="preserve">were excluded per drug. Eight drugs had enough resistant isolates in both regions: isoniazid (INH),</w:t>
-      </w:r>
-      <w:r>
-        <w:t xml:space="preserve"> </w:t>
-      </w:r>
-      <w:r>
-        <w:t xml:space="preserve">rifampicin (RIF), ethambutol (EMB), ethionamide (ETH), levofloxacin (LEV), moxifloxacin (MXF),</w:t>
-      </w:r>
-      <w:r>
-        <w:t xml:space="preserve"> </w:t>
-      </w:r>
-      <w:r>
-        <w:t xml:space="preserve">kanamycin (KAN) and amikacin (AMI). Bedaquiline, delamanid, linezolid and clofazimine were dropped</w:t>
-      </w:r>
-      <w:r>
-        <w:t xml:space="preserve"> </w:t>
-      </w:r>
-      <w:r>
-        <w:t xml:space="preserve">for too few resistant cases.</w:t>
+        <w:t xml:space="preserve">Correction to the topic form.</w:t>
+      </w:r>
+      <w:r>
+        <w:t xml:space="preserve"> </w:t>
+      </w:r>
+      <w:r>
+        <w:t xml:space="preserve">The topic form quoted 5,907 South Asian</w:t>
+      </w:r>
+      <w:r>
+        <w:t xml:space="preserve"> </w:t>
+      </w:r>
+      <w:r>
+        <w:t xml:space="preserve">isolates. That figure counted every South Asian sample in the CRyPTIC metadata, including samples</w:t>
+      </w:r>
+      <w:r>
+        <w:t xml:space="preserve"> </w:t>
+      </w:r>
+      <w:r>
+        <w:t xml:space="preserve">with no resistance phenotype. The isolates with laboratory resistance labels number</w:t>
+      </w:r>
+      <w:r>
+        <w:t xml:space="preserve"> </w:t>
+      </w:r>
+      <w:r>
+        <w:t xml:space="preserve">2,162, and all results here use that set.</w:t>
       </w:r>
     </w:p>
     <w:p>
@@ -788,118 +2053,34 @@
           <w:b/>
           <w:bCs/>
         </w:rPr>
-        <w:t xml:space="preserve">Country.</w:t>
-      </w:r>
-      <w:r>
-        <w:t xml:space="preserve"> </w:t>
-      </w:r>
-      <w:r>
-        <w:t xml:space="preserve">Country of sampling was taken from the sample table, falling back to the</w:t>
-      </w:r>
-      <w:r>
-        <w:t xml:space="preserve"> </w:t>
-      </w:r>
-      <w:r>
-        <w:t xml:space="preserve">collecting site where that site only serves its own country. Isolates collected by the</w:t>
-      </w:r>
-      <w:r>
-        <w:t xml:space="preserve"> </w:t>
-      </w:r>
-      <w:r>
-        <w:t xml:space="preserve">multi-country reference laboratories in Gauting and Milan without a recorded country</w:t>
-      </w:r>
-      <w:r>
-        <w:t xml:space="preserve"> </w:t>
-      </w:r>
-      <w:r>
-        <w:t xml:space="preserve">(1,137) were excluded from every protocol, leaving 11,150.</w:t>
-      </w:r>
-      <w:r>
-        <w:t xml:space="preserve"> </w:t>
-      </w:r>
-      <w:r>
-        <w:t xml:space="preserve">The South Asian test set is 2,162 isolates: India 1,476,</w:t>
-      </w:r>
-      <w:r>
-        <w:t xml:space="preserve"> </w:t>
-      </w:r>
-      <w:r>
-        <w:t xml:space="preserve">Pakistan 489 and Nepal 197.</w:t>
+        <w:t xml:space="preserve">Lineage shift.</w:t>
+      </w:r>
+      <w:r>
+        <w:t xml:space="preserve"> </w:t>
+      </w:r>
+      <w:r>
+        <w:t xml:space="preserve">The two populations differ sharply (Figure 1). Lineages 1 and 3 make up</w:t>
+      </w:r>
+      <w:r>
+        <w:t xml:space="preserve"> </w:t>
+      </w:r>
+      <w:r>
+        <w:t xml:space="preserve">13% and 37% of South Asian isolates, against</w:t>
+      </w:r>
+      <w:r>
+        <w:t xml:space="preserve"> </w:t>
+      </w:r>
+      <w:r>
+        <w:t xml:space="preserve">4% and 2% of the rest; lineage 4 is</w:t>
+      </w:r>
+      <w:r>
+        <w:t xml:space="preserve"> </w:t>
+      </w:r>
+      <w:r>
+        <w:t xml:space="preserve">56% of the rest but 14% of South Asia.</w:t>
       </w:r>
     </w:p>
-    <w:p>
-      <w:pPr>
-        <w:pStyle w:val="BodyText"/>
-      </w:pPr>
-      <w:r>
-        <w:rPr>
-          <w:b/>
-          <w:bCs/>
-        </w:rPr>
-        <w:t xml:space="preserve">Correction to the topic form.</w:t>
-      </w:r>
-      <w:r>
-        <w:t xml:space="preserve"> </w:t>
-      </w:r>
-      <w:r>
-        <w:t xml:space="preserve">The topic form quoted 5,907 South Asian</w:t>
-      </w:r>
-      <w:r>
-        <w:t xml:space="preserve"> </w:t>
-      </w:r>
-      <w:r>
-        <w:t xml:space="preserve">isolates. That figure counted every South Asian sample in the CRyPTIC metadata, including samples</w:t>
-      </w:r>
-      <w:r>
-        <w:t xml:space="preserve"> </w:t>
-      </w:r>
-      <w:r>
-        <w:t xml:space="preserve">with no resistance phenotype. The isolates with laboratory resistance labels number</w:t>
-      </w:r>
-      <w:r>
-        <w:t xml:space="preserve"> </w:t>
-      </w:r>
-      <w:r>
-        <w:t xml:space="preserve">2,162, and all results here use that set.</w:t>
-      </w:r>
-    </w:p>
-    <w:p>
-      <w:pPr>
-        <w:pStyle w:val="BodyText"/>
-      </w:pPr>
-      <w:r>
-        <w:rPr>
-          <w:b/>
-          <w:bCs/>
-        </w:rPr>
-        <w:t xml:space="preserve">Lineage shift.</w:t>
-      </w:r>
-      <w:r>
-        <w:t xml:space="preserve"> </w:t>
-      </w:r>
-      <w:r>
-        <w:t xml:space="preserve">The two populations differ sharply (Figure 1). Lineages 1 and 3 make up</w:t>
-      </w:r>
-      <w:r>
-        <w:t xml:space="preserve"> </w:t>
-      </w:r>
-      <w:r>
-        <w:t xml:space="preserve">13% and 37% of South Asian isolates, against</w:t>
-      </w:r>
-      <w:r>
-        <w:t xml:space="preserve"> </w:t>
-      </w:r>
-      <w:r>
-        <w:t xml:space="preserve">4% and 2% of the rest; lineage 4 is</w:t>
-      </w:r>
-      <w:r>
-        <w:t xml:space="preserve"> </w:t>
-      </w:r>
-      <w:r>
-        <w:t xml:space="preserve">56% of the rest but 14% of South Asia.</w:t>
-      </w:r>
-    </w:p>
-    <w:p>
+    <w:p xmlns:a="http://schemas.openxmlformats.org/drawingml/2006/main" xmlns:pic="http://schemas.openxmlformats.org/drawingml/2006/picture">
       <w:pPr>
         <w:pStyle w:val="CaptionedFigure"/>
         <w:keepNext/>
@@ -909,18 +2090,18 @@
           <wp:inline>
             <wp:extent cx="5334000" cy="1417594"/>
             <wp:effectExtent b="0" l="0" r="0" t="0"/>
-            <wp:docPr descr="fig_lineage_composition.png" title="" id="13" name="Picture"/>
+            <wp:docPr descr="fig_lineage_composition.png" title="" id="2" name="Picture"/>
             <a:graphic>
               <a:graphicData uri="http://schemas.openxmlformats.org/drawingml/2006/picture">
                 <pic:pic>
                   <pic:nvPicPr>
-                    <pic:cNvPr descr="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" id="14" name="Picture"/>
+                    <pic:cNvPr descr="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" id="2" name="Picture"/>
                     <pic:cNvPicPr>
                       <a:picLocks noChangeArrowheads="1" noChangeAspect="1"/>
                     </pic:cNvPicPr>
                   </pic:nvPicPr>
                   <pic:blipFill>
-                    <a:blip r:embed="rId12"/>
+                    <a:blip r:embed="rId7"/>
                     <a:stretch>
                       <a:fillRect/>
                     </a:stretch>
@@ -955,8 +2136,8 @@
         <w:t xml:space="preserve">Figure 1. Lineage composition of labelled isolates with a known country.</w:t>
       </w:r>
     </w:p>
-    <w:bookmarkEnd w:id="15"/>
-    <w:bookmarkStart w:id="21" w:name="methods"/>
+    <w:bookmarkEnd w:id="2"/>
+    <w:bookmarkStart w:id="4" w:name="methods"/>
     <w:p>
       <w:pPr>
         <w:pStyle w:val="Heading2"/>
@@ -966,7 +2147,7 @@
         <w:t xml:space="preserve">4. Methods</w:t>
       </w:r>
     </w:p>
-    <w:bookmarkStart w:id="16" w:name="features"/>
+    <w:bookmarkStart w:id="5" w:name="features"/>
     <w:p>
       <w:pPr>
         <w:pStyle w:val="Heading3"/>
@@ -1060,8 +2241,8 @@
         <w:t xml:space="preserve">were processed.</w:t>
       </w:r>
     </w:p>
-    <w:bookmarkEnd w:id="16"/>
-    <w:bookmarkStart w:id="17" w:name="leakage-control"/>
+    <w:bookmarkEnd w:id="3"/>
+    <w:bookmarkStart w:id="6" w:name="leakage-control"/>
     <w:p>
       <w:pPr>
         <w:pStyle w:val="Heading3"/>
@@ -1121,8 +2302,8 @@
         <w:t xml:space="preserve">any training isolate sharing a cluster with a test isolate is removed.</w:t>
       </w:r>
     </w:p>
-    <w:bookmarkEnd w:id="17"/>
-    <w:bookmarkStart w:id="18" w:name="models"/>
+    <w:bookmarkEnd w:id="4"/>
+    <w:bookmarkStart w:id="7" w:name="models"/>
     <w:p>
       <w:pPr>
         <w:pStyle w:val="Heading3"/>
@@ -1164,8 +2345,8 @@
         <w:t xml:space="preserve">All training ran on a CPU.</w:t>
       </w:r>
     </w:p>
-    <w:bookmarkEnd w:id="18"/>
-    <w:bookmarkStart w:id="19" w:name="evaluation-protocols"/>
+    <w:bookmarkEnd w:id="5"/>
+    <w:bookmarkStart w:id="8" w:name="evaluation-protocols"/>
     <w:p>
       <w:pPr>
         <w:pStyle w:val="Heading3"/>
@@ -1180,7 +2361,7 @@
         <w:pStyle w:val="Compact"/>
         <w:numPr>
           <w:ilvl w:val="0"/>
-          <w:numId w:val="1001"/>
+          <w:numId w:val="2"/>
         </w:numPr>
       </w:pPr>
       <w:r>
@@ -1220,7 +2401,7 @@
         <w:pStyle w:val="Compact"/>
         <w:numPr>
           <w:ilvl w:val="0"/>
-          <w:numId w:val="1001"/>
+          <w:numId w:val="2"/>
         </w:numPr>
       </w:pPr>
       <w:r>
@@ -1254,7 +2435,7 @@
         <w:pStyle w:val="Compact"/>
         <w:numPr>
           <w:ilvl w:val="0"/>
-          <w:numId w:val="1001"/>
+          <w:numId w:val="2"/>
         </w:numPr>
       </w:pPr>
       <w:r>
@@ -1297,8 +2478,8 @@
         <w:t xml:space="preserve">is the very major error rate, the clinically dangerous miss), specificity, AUC and F1.</w:t>
       </w:r>
     </w:p>
-    <w:bookmarkEnd w:id="19"/>
-    <w:bookmarkStart w:id="20" w:name="who-catalogue-benchmark"/>
+    <w:bookmarkEnd w:id="6"/>
+    <w:bookmarkStart w:id="9" w:name="who-catalogue-benchmark"/>
     <w:p>
       <w:pPr>
         <w:pStyle w:val="Heading3"/>
@@ -1340,9 +2521,9 @@
         <w:t xml:space="preserve">about 96%/95% for rifampicin and 93%/98% for isoniazid, in line with published CRyPTIC figures.</w:t>
       </w:r>
     </w:p>
-    <w:bookmarkEnd w:id="20"/>
-    <w:bookmarkEnd w:id="21"/>
-    <w:bookmarkStart w:id="39" w:name="results"/>
+    <w:bookmarkEnd w:id="7"/>
+    <w:bookmarkEnd w:id="8"/>
+    <w:bookmarkStart w:id="10" w:name="results"/>
     <w:p>
       <w:pPr>
         <w:pStyle w:val="Heading2"/>
@@ -1352,7 +2533,7 @@
         <w:t xml:space="preserve">5. Results</w:t>
       </w:r>
     </w:p>
-    <w:bookmarkStart w:id="28" w:name="aggregate-performance-transfers"/>
+    <w:bookmarkStart w:id="11" w:name="aggregate-performance-transfers"/>
     <w:p>
       <w:pPr>
         <w:pStyle w:val="Heading3"/>
@@ -3123,7 +4304,7 @@
         </w:tc>
       </w:tr>
     </w:tbl>
-    <w:p>
+    <w:p xmlns:a="http://schemas.openxmlformats.org/drawingml/2006/main" xmlns:pic="http://schemas.openxmlformats.org/drawingml/2006/picture">
       <w:pPr>
         <w:pStyle w:val="CaptionedFigure"/>
         <w:keepNext/>
@@ -3133,18 +4314,18 @@
           <wp:inline>
             <wp:extent cx="5334000" cy="2421681"/>
             <wp:effectExtent b="0" l="0" r="0" t="0"/>
-            <wp:docPr descr="fig_sensitivity_protocols.png" title="" id="23" name="Picture"/>
+            <wp:docPr descr="fig_sensitivity_protocols.png" title="" id="3" name="Picture"/>
             <a:graphic>
               <a:graphicData uri="http://schemas.openxmlformats.org/drawingml/2006/picture">
                 <pic:pic>
                   <pic:nvPicPr>
-                    <pic:cNvPr descr="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" id="24" name="Picture"/>
+                    <pic:cNvPr descr="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" id="3" name="Picture"/>
                     <pic:cNvPicPr>
                       <a:picLocks noChangeArrowheads="1" noChangeAspect="1"/>
                     </pic:cNvPicPr>
                   </pic:nvPicPr>
                   <pic:blipFill>
-                    <a:blip r:embed="rId22"/>
+                    <a:blip r:embed="rId9"/>
                     <a:stretch>
                       <a:fillRect/>
                     </a:stretch>
@@ -3211,7 +4392,7 @@
         <w:t xml:space="preserve">the specificity loss described above.</w:t>
       </w:r>
     </w:p>
-    <w:p>
+    <w:p xmlns:a="http://schemas.openxmlformats.org/drawingml/2006/main" xmlns:pic="http://schemas.openxmlformats.org/drawingml/2006/picture">
       <w:pPr>
         <w:pStyle w:val="CaptionedFigure"/>
         <w:keepNext/>
@@ -3221,18 +4402,18 @@
           <wp:inline>
             <wp:extent cx="5334000" cy="2752801"/>
             <wp:effectExtent b="0" l="0" r="0" t="0"/>
-            <wp:docPr descr="fig_confusion_matrices.png" title="" id="26" name="Picture"/>
+            <wp:docPr descr="fig_confusion_matrices.png" title="" id="4" name="Picture"/>
             <a:graphic>
               <a:graphicData uri="http://schemas.openxmlformats.org/drawingml/2006/picture">
                 <pic:pic>
                   <pic:nvPicPr>
-                    <pic:cNvPr descr="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" id="27" name="Picture"/>
+                    <pic:cNvPr descr="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" id="4" name="Picture"/>
                     <pic:cNvPicPr>
                       <a:picLocks noChangeArrowheads="1" noChangeAspect="1"/>
                     </pic:cNvPicPr>
                   </pic:nvPicPr>
                   <pic:blipFill>
-                    <a:blip r:embed="rId25"/>
+                    <a:blip r:embed="rId10"/>
                     <a:stretch>
                       <a:fillRect/>
                     </a:stretch>
@@ -3273,8 +4454,8 @@
         <w:t xml:space="preserve">with row percentages.</w:t>
       </w:r>
     </w:p>
-    <w:bookmarkEnd w:id="28"/>
-    <w:bookmarkStart w:id="32" w:name="X04fc7806c2e859f9dba5f466d02b63f049e2f74"/>
+    <w:bookmarkEnd w:id="9"/>
+    <w:bookmarkStart w:id="12" w:name="X04fc7806c2e859f9dba5f466d02b63f049e2f74"/>
     <w:p>
       <w:pPr>
         <w:pStyle w:val="Heading3"/>
@@ -7261,7 +8442,7 @@
         </w:tc>
       </w:tr>
     </w:tbl>
-    <w:p>
+    <w:p xmlns:a="http://schemas.openxmlformats.org/drawingml/2006/main" xmlns:pic="http://schemas.openxmlformats.org/drawingml/2006/picture">
       <w:pPr>
         <w:pStyle w:val="CaptionedFigure"/>
         <w:keepNext/>
@@ -7271,18 +8452,18 @@
           <wp:inline>
             <wp:extent cx="5334000" cy="2749116"/>
             <wp:effectExtent b="0" l="0" r="0" t="0"/>
-            <wp:docPr descr="fig_lineage_sensitivity.png" title="" id="30" name="Picture"/>
+            <wp:docPr descr="fig_lineage_sensitivity.png" title="" id="5" name="Picture"/>
             <a:graphic>
               <a:graphicData uri="http://schemas.openxmlformats.org/drawingml/2006/picture">
                 <pic:pic>
                   <pic:nvPicPr>
-                    <pic:cNvPr descr="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" id="31" name="Picture"/>
+                    <pic:cNvPr descr="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" id="5" name="Picture"/>
                     <pic:cNvPicPr>
                       <a:picLocks noChangeArrowheads="1" noChangeAspect="1"/>
                     </pic:cNvPicPr>
                   </pic:nvPicPr>
                   <pic:blipFill>
-                    <a:blip r:embed="rId29"/>
+                    <a:blip r:embed="rId11"/>
                     <a:stretch>
                       <a:fillRect/>
                     </a:stretch>
@@ -7317,8 +8498,8 @@
         <w:t xml:space="preserve">Figure 4. Sensitivity on resistant South Asian isolates by lineage under each setting.</w:t>
       </w:r>
     </w:p>
-    <w:bookmarkEnd w:id="32"/>
-    <w:bookmarkStart w:id="36" w:name="leave-one-country-out"/>
+    <w:bookmarkEnd w:id="10"/>
+    <w:bookmarkStart w:id="13" w:name="leave-one-country-out"/>
     <w:p>
       <w:pPr>
         <w:pStyle w:val="Heading3"/>
@@ -9005,7 +10186,7 @@
         </w:tc>
       </w:tr>
     </w:tbl>
-    <w:p>
+    <w:p xmlns:a="http://schemas.openxmlformats.org/drawingml/2006/main" xmlns:pic="http://schemas.openxmlformats.org/drawingml/2006/picture">
       <w:pPr>
         <w:pStyle w:val="CaptionedFigure"/>
         <w:keepNext/>
@@ -9015,18 +10196,18 @@
           <wp:inline>
             <wp:extent cx="5334000" cy="4123037"/>
             <wp:effectExtent b="0" l="0" r="0" t="0"/>
-            <wp:docPr descr="fig_loco_sensitivity.png" title="" id="34" name="Picture"/>
+            <wp:docPr descr="fig_loco_sensitivity.png" title="" id="6" name="Picture"/>
             <a:graphic>
               <a:graphicData uri="http://schemas.openxmlformats.org/drawingml/2006/picture">
                 <pic:pic>
                   <pic:nvPicPr>
-                    <pic:cNvPr descr="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" id="35" name="Picture"/>
+                    <pic:cNvPr descr="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" id="6" name="Picture"/>
                     <pic:cNvPicPr>
                       <a:picLocks noChangeArrowheads="1" noChangeAspect="1"/>
                     </pic:cNvPicPr>
                   </pic:nvPicPr>
                   <pic:blipFill>
-                    <a:blip r:embed="rId33"/>
+                    <a:blip r:embed="rId12"/>
                     <a:stretch>
                       <a:fillRect/>
                     </a:stretch>
@@ -9061,8 +10242,8 @@
         <w:t xml:space="preserve">Figure 5. Leave-one-country-out sensitivity.</w:t>
       </w:r>
     </w:p>
-    <w:bookmarkEnd w:id="36"/>
-    <w:bookmarkStart w:id="37" w:name="what-the-missed-isolates-carry"/>
+    <w:bookmarkEnd w:id="11"/>
+    <w:bookmarkStart w:id="14" w:name="what-the-missed-isolates-carry"/>
     <w:p>
       <w:pPr>
         <w:pStyle w:val="Heading3"/>
@@ -11551,8 +12732,8 @@
         </w:tc>
       </w:tr>
     </w:tbl>
-    <w:bookmarkEnd w:id="37"/>
-    <w:bookmarkStart w:id="38" w:name="robustness-lineage-as-a-feature"/>
+    <w:bookmarkEnd w:id="12"/>
+    <w:bookmarkStart w:id="15" w:name="robustness-lineage-as-a-feature"/>
     <w:p>
       <w:pPr>
         <w:pStyle w:val="Heading3"/>
@@ -13960,9 +15141,9 @@
         </w:tc>
       </w:tr>
     </w:tbl>
-    <w:bookmarkEnd w:id="38"/>
-    <w:bookmarkEnd w:id="39"/>
-    <w:bookmarkStart w:id="40" w:name="discussion"/>
+    <w:bookmarkEnd w:id="13"/>
+    <w:bookmarkEnd w:id="14"/>
+    <w:bookmarkStart w:id="16" w:name="discussion"/>
     <w:p>
       <w:pPr>
         <w:pStyle w:val="Heading2"/>
@@ -14130,8 +15311,8 @@
         <w:t xml:space="preserve">geography: a model never shown a local resistant clade cannot learn its mutations.</w:t>
       </w:r>
     </w:p>
-    <w:bookmarkEnd w:id="40"/>
-    <w:bookmarkStart w:id="41" w:name="limitations"/>
+    <w:bookmarkEnd w:id="15"/>
+    <w:bookmarkStart w:id="17" w:name="limitations"/>
     <w:p>
       <w:pPr>
         <w:pStyle w:val="Heading2"/>
@@ -14146,7 +15327,7 @@
         <w:pStyle w:val="Compact"/>
         <w:numPr>
           <w:ilvl w:val="0"/>
-          <w:numId w:val="1002"/>
+          <w:numId w:val="3"/>
         </w:numPr>
       </w:pPr>
       <w:r>
@@ -14170,7 +15351,7 @@
         <w:pStyle w:val="Compact"/>
         <w:numPr>
           <w:ilvl w:val="0"/>
-          <w:numId w:val="1002"/>
+          <w:numId w:val="3"/>
         </w:numPr>
       </w:pPr>
       <w:r>
@@ -14188,7 +15369,7 @@
         <w:pStyle w:val="Compact"/>
         <w:numPr>
           <w:ilvl w:val="0"/>
-          <w:numId w:val="1002"/>
+          <w:numId w:val="3"/>
         </w:numPr>
       </w:pPr>
       <w:r>
@@ -14206,7 +15387,7 @@
         <w:pStyle w:val="Compact"/>
         <w:numPr>
           <w:ilvl w:val="0"/>
-          <w:numId w:val="1002"/>
+          <w:numId w:val="3"/>
         </w:numPr>
       </w:pPr>
       <w:r>
@@ -14224,7 +15405,7 @@
         <w:pStyle w:val="Compact"/>
         <w:numPr>
           <w:ilvl w:val="0"/>
-          <w:numId w:val="1002"/>
+          <w:numId w:val="3"/>
         </w:numPr>
       </w:pPr>
       <w:r>
@@ -14242,7 +15423,7 @@
         <w:pStyle w:val="Compact"/>
         <w:numPr>
           <w:ilvl w:val="0"/>
-          <w:numId w:val="1002"/>
+          <w:numId w:val="3"/>
         </w:numPr>
       </w:pPr>
       <w:r>
@@ -14260,7 +15441,7 @@
         <w:pStyle w:val="Compact"/>
         <w:numPr>
           <w:ilvl w:val="0"/>
-          <w:numId w:val="1002"/>
+          <w:numId w:val="3"/>
         </w:numPr>
       </w:pPr>
       <w:r>
@@ -14273,8 +15454,8 @@
         <w:t xml:space="preserve">phenotype.</w:t>
       </w:r>
     </w:p>
-    <w:bookmarkEnd w:id="41"/>
-    <w:bookmarkStart w:id="42" w:name="conclusion-and-future-work"/>
+    <w:bookmarkEnd w:id="16"/>
+    <w:bookmarkStart w:id="18" w:name="conclusion-and-future-work"/>
     <w:p>
       <w:pPr>
         <w:pStyle w:val="Heading2"/>
@@ -14350,8 +15531,8 @@
         <w:t xml:space="preserve">and phenotype set becomes available through collaboration, direct validation.</w:t>
       </w:r>
     </w:p>
-    <w:bookmarkEnd w:id="42"/>
-    <w:bookmarkStart w:id="43" w:name="references"/>
+    <w:bookmarkEnd w:id="17"/>
+    <w:bookmarkStart w:id="19" w:name="references"/>
     <w:p>
       <w:pPr>
         <w:pStyle w:val="Heading2"/>
@@ -14366,7 +15547,7 @@
         <w:pStyle w:val="Compact"/>
         <w:numPr>
           <w:ilvl w:val="0"/>
-          <w:numId w:val="1003"/>
+          <w:numId w:val="4"/>
         </w:numPr>
       </w:pPr>
       <w:r>
@@ -14416,7 +15597,7 @@
         <w:pStyle w:val="Compact"/>
         <w:numPr>
           <w:ilvl w:val="0"/>
-          <w:numId w:val="1003"/>
+          <w:numId w:val="4"/>
         </w:numPr>
       </w:pPr>
       <w:r>
@@ -14450,7 +15631,7 @@
         <w:pStyle w:val="Compact"/>
         <w:numPr>
           <w:ilvl w:val="0"/>
-          <w:numId w:val="1003"/>
+          <w:numId w:val="4"/>
         </w:numPr>
       </w:pPr>
       <w:r>
@@ -14481,7 +15662,7 @@
         <w:pStyle w:val="Compact"/>
         <w:numPr>
           <w:ilvl w:val="0"/>
-          <w:numId w:val="1003"/>
+          <w:numId w:val="4"/>
         </w:numPr>
       </w:pPr>
       <w:r>
@@ -14520,7 +15701,7 @@
         <w:pStyle w:val="Compact"/>
         <w:numPr>
           <w:ilvl w:val="0"/>
-          <w:numId w:val="1003"/>
+          <w:numId w:val="4"/>
         </w:numPr>
       </w:pPr>
       <w:r>
@@ -14554,7 +15735,7 @@
         <w:pStyle w:val="Compact"/>
         <w:numPr>
           <w:ilvl w:val="0"/>
-          <w:numId w:val="1003"/>
+          <w:numId w:val="4"/>
         </w:numPr>
       </w:pPr>
       <w:r>
@@ -14609,7 +15790,7 @@
         <w:pStyle w:val="Compact"/>
         <w:numPr>
           <w:ilvl w:val="0"/>
-          <w:numId w:val="1003"/>
+          <w:numId w:val="4"/>
         </w:numPr>
       </w:pPr>
       <w:r>
@@ -14640,7 +15821,7 @@
         <w:pStyle w:val="Compact"/>
         <w:numPr>
           <w:ilvl w:val="0"/>
-          <w:numId w:val="1003"/>
+          <w:numId w:val="4"/>
         </w:numPr>
       </w:pPr>
       <w:r>
@@ -14668,7 +15849,7 @@
         <w:pStyle w:val="Compact"/>
         <w:numPr>
           <w:ilvl w:val="0"/>
-          <w:numId w:val="1003"/>
+          <w:numId w:val="4"/>
         </w:numPr>
       </w:pPr>
       <w:r>
@@ -14686,7 +15867,7 @@
         <w:pStyle w:val="Compact"/>
         <w:numPr>
           <w:ilvl w:val="0"/>
-          <w:numId w:val="1003"/>
+          <w:numId w:val="4"/>
         </w:numPr>
       </w:pPr>
       <w:r>
@@ -14704,7 +15885,7 @@
         <w:pStyle w:val="Compact"/>
         <w:numPr>
           <w:ilvl w:val="0"/>
-          <w:numId w:val="1003"/>
+          <w:numId w:val="4"/>
         </w:numPr>
       </w:pPr>
       <w:r>
@@ -14738,8 +15919,8 @@
         <w:br w:type="page"/>
       </w:r>
     </w:p>
-    <w:bookmarkEnd w:id="43"/>
-    <w:bookmarkStart w:id="44" w:name="appendix-a.-all-models"/>
+    <w:bookmarkEnd w:id="18"/>
+    <w:bookmarkStart w:id="20" w:name="appendix-a.-all-models"/>
     <w:p>
       <w:pPr>
         <w:pStyle w:val="Heading2"/>
@@ -19702,8 +20883,8 @@
         </w:tc>
       </w:tr>
     </w:tbl>
-    <w:bookmarkEnd w:id="44"/>
-    <w:bookmarkStart w:id="48" w:name="resources"/>
+    <w:bookmarkEnd w:id="19"/>
+    <w:bookmarkStart w:id="21" w:name="resources"/>
     <w:p>
       <w:pPr>
         <w:pStyle w:val="Heading2"/>
@@ -19718,7 +20899,7 @@
         <w:pStyle w:val="Compact"/>
         <w:numPr>
           <w:ilvl w:val="0"/>
-          <w:numId w:val="1004"/>
+          <w:numId w:val="5"/>
         </w:numPr>
       </w:pPr>
       <w:r>
@@ -19737,7 +20918,7 @@
       <w:r>
         <w:t xml:space="preserve"> </w:t>
       </w:r>
-      <w:hyperlink r:id="rId45">
+      <w:hyperlink r:id="rId13">
         <w:r>
           <w:rPr>
             <w:rStyle w:val="Hyperlink"/>
@@ -19751,7 +20932,7 @@
         <w:pStyle w:val="Compact"/>
         <w:numPr>
           <w:ilvl w:val="0"/>
-          <w:numId w:val="1004"/>
+          <w:numId w:val="5"/>
         </w:numPr>
       </w:pPr>
       <w:r>
@@ -19770,7 +20951,7 @@
       <w:r>
         <w:t xml:space="preserve"> </w:t>
       </w:r>
-      <w:hyperlink r:id="rId46">
+      <w:hyperlink r:id="rId14">
         <w:r>
           <w:rPr>
             <w:rStyle w:val="Hyperlink"/>
@@ -19784,7 +20965,7 @@
         <w:pStyle w:val="Compact"/>
         <w:numPr>
           <w:ilvl w:val="0"/>
-          <w:numId w:val="1004"/>
+          <w:numId w:val="5"/>
         </w:numPr>
       </w:pPr>
       <w:r>
@@ -19803,7 +20984,7 @@
       <w:r>
         <w:t xml:space="preserve"> </w:t>
       </w:r>
-      <w:hyperlink r:id="rId47">
+      <w:hyperlink r:id="rId15">
         <w:r>
           <w:rPr>
             <w:rStyle w:val="Hyperlink"/>
@@ -19923,119 +21104,24 @@
         <w:t xml:space="preserve">and a run from a fresh clone reproduced every result.</w:t>
       </w:r>
     </w:p>
-    <w:bookmarkEnd w:id="48"/>
+    <w:bookmarkEnd w:id="20"/>
+    <w:bookmarkEnd w:id="21"/>
     <w:sectPr>
-      <w:footnotePr>
-        <w:numRestart w:val="eachSect"/>
-      </w:footnotePr>
+      <w:pgSz w:w="11906" w:h="16838"/>
+      <w:pgMar w:left="1440" w:right="1440" w:gutter="0" w:header="0" w:top="1440" w:footer="0" w:bottom="1440"/>
+      <w:pgNumType w:fmt="decimal"/>
+      <w:formProt w:val="false"/>
+      <w:textDirection w:val="lrTb"/>
+      <w:docGrid w:type="default" w:linePitch="600" w:charSpace="32768"/>
     </w:sectPr>
   </w:body>
 </w:document>
 </file>
 
-<file path=word/comments.xml><?xml version="1.0" encoding="utf-8"?>
-<w:comments xmlns:w="http://schemas.openxmlformats.org/wordprocessingml/2006/main" xmlns:m="http://schemas.openxmlformats.org/officeDocument/2006/math" xmlns:r="http://schemas.openxmlformats.org/officeDocument/2006/relationships" xmlns:o="urn:schemas-microsoft-com:office:office" xmlns:v="urn:schemas-microsoft-com:vml" xmlns:w10="urn:schemas-microsoft-com:office:word" xmlns:a="http://schemas.openxmlformats.org/drawingml/2006/main" xmlns:pic="http://schemas.openxmlformats.org/drawingml/2006/picture" xmlns:wp="http://schemas.openxmlformats.org/drawingml/2006/wordprocessingDrawing"/>
-</file>
-
-<file path=word/footnotes.xml><?xml version="1.0" encoding="utf-8"?>
-<w:footnotes xmlns:w="http://schemas.openxmlformats.org/wordprocessingml/2006/main" xmlns:m="http://schemas.openxmlformats.org/officeDocument/2006/math" xmlns:r="http://schemas.openxmlformats.org/officeDocument/2006/relationships" xmlns:o="urn:schemas-microsoft-com:office:office" xmlns:v="urn:schemas-microsoft-com:vml" xmlns:w10="urn:schemas-microsoft-com:office:word" xmlns:a="http://schemas.openxmlformats.org/drawingml/2006/main" xmlns:pic="http://schemas.openxmlformats.org/drawingml/2006/picture" xmlns:wp="http://schemas.openxmlformats.org/drawingml/2006/wordprocessingDrawing">
-  <w:footnote w:type="continuationSeparator" w:id="0">
-    <w:p>
-      <w:r>
-        <w:continuationSeparator/>
-      </w:r>
-    </w:p>
-  </w:footnote>
-  <w:footnote w:type="separator" w:id="-1">
-    <w:p>
-      <w:r>
-        <w:separator/>
-      </w:r>
-    </w:p>
-  </w:footnote>
-</w:footnotes>
-</file>
-
 <file path=word/numbering.xml><?xml version="1.0" encoding="utf-8"?>
-<w:numbering xmlns:w="http://schemas.openxmlformats.org/wordprocessingml/2006/main">
-  <w:abstractNum w:abstractNumId="990">
-    <w:nsid w:val="0000A990"/>
-    <w:multiLevelType w:val="multilevel"/>
-    <w:lvl w:ilvl="0">
-      <w:numFmt w:val="bullet"/>
-      <w:lvlText w:val=" "/>
-      <w:lvlJc w:val="left"/>
-      <w:pPr>
-        <w:ind w:left="720" w:hanging="360"/>
-      </w:pPr>
-    </w:lvl>
-    <w:lvl w:ilvl="1">
-      <w:numFmt w:val="bullet"/>
-      <w:lvlText w:val=" "/>
-      <w:lvlJc w:val="left"/>
-      <w:pPr>
-        <w:ind w:left="1440" w:hanging="360"/>
-      </w:pPr>
-    </w:lvl>
-    <w:lvl w:ilvl="2">
-      <w:numFmt w:val="bullet"/>
-      <w:lvlText w:val=" "/>
-      <w:lvlJc w:val="left"/>
-      <w:pPr>
-        <w:ind w:left="2160" w:hanging="360"/>
-      </w:pPr>
-    </w:lvl>
-    <w:lvl w:ilvl="3">
-      <w:numFmt w:val="bullet"/>
-      <w:lvlText w:val=" "/>
-      <w:lvlJc w:val="left"/>
-      <w:pPr>
-        <w:ind w:left="2880" w:hanging="360"/>
-      </w:pPr>
-    </w:lvl>
-    <w:lvl w:ilvl="4">
-      <w:numFmt w:val="bullet"/>
-      <w:lvlText w:val=" "/>
-      <w:lvlJc w:val="left"/>
-      <w:pPr>
-        <w:ind w:left="3600" w:hanging="360"/>
-      </w:pPr>
-    </w:lvl>
-    <w:lvl w:ilvl="5">
-      <w:numFmt w:val="bullet"/>
-      <w:lvlText w:val=" "/>
-      <w:lvlJc w:val="left"/>
-      <w:pPr>
-        <w:ind w:left="4320" w:hanging="360"/>
-      </w:pPr>
-    </w:lvl>
-    <w:lvl w:ilvl="6">
-      <w:numFmt w:val="bullet"/>
-      <w:lvlText w:val=" "/>
-      <w:lvlJc w:val="left"/>
-      <w:pPr>
-        <w:ind w:left="5040" w:hanging="360"/>
-      </w:pPr>
-    </w:lvl>
-    <w:lvl w:ilvl="7">
-      <w:numFmt w:val="bullet"/>
-      <w:lvlText w:val=" "/>
-      <w:lvlJc w:val="left"/>
-      <w:pPr>
-        <w:ind w:left="5760" w:hanging="360"/>
-      </w:pPr>
-    </w:lvl>
-    <w:lvl w:ilvl="8">
-      <w:numFmt w:val="bullet"/>
-      <w:lvlText w:val=" "/>
-      <w:lvlJc w:val="left"/>
-      <w:pPr>
-        <w:ind w:left="6480" w:hanging="360"/>
-      </w:pPr>
-    </w:lvl>
-  </w:abstractNum>
-  <w:abstractNum w:abstractNumId="99201">
-    <w:nsid w:val="00A99201"/>
+<w:numbering xmlns:wpc="http://schemas.microsoft.com/office/word/2010/wordprocessingCanvas" xmlns:mo="http://schemas.microsoft.com/office/mac/office/2008/main" xmlns:mc="http://schemas.openxmlformats.org/markup-compatibility/2006" xmlns:mv="urn:schemas-microsoft-com:mac:vml" xmlns:o="urn:schemas-microsoft-com:office:office" xmlns:r="http://schemas.openxmlformats.org/officeDocument/2006/relationships" xmlns:m="http://schemas.openxmlformats.org/officeDocument/2006/math" xmlns:v="urn:schemas-microsoft-com:vml" xmlns:wp14="http://schemas.microsoft.com/office/word/2010/wordprocessingDrawing" xmlns:wp="http://schemas.openxmlformats.org/drawingml/2006/wordprocessingDrawing" xmlns:w10="urn:schemas-microsoft-com:office:word" xmlns:w="http://schemas.openxmlformats.org/wordprocessingml/2006/main" xmlns:w14="http://schemas.microsoft.com/office/word/2010/wordml" xmlns:w15="http://schemas.microsoft.com/office/word/2012/wordml" xmlns:wpg="http://schemas.microsoft.com/office/word/2010/wordprocessingGroup" xmlns:wpi="http://schemas.microsoft.com/office/word/2010/wordprocessingInk" xmlns:wne="http://schemas.microsoft.com/office/word/2006/wordml" xmlns:wps="http://schemas.microsoft.com/office/word/2010/wordprocessingShape" mc:Ignorable="w14 w15 wp14">
+  <w:abstractNum w:abstractNumId="0">
+    <w:nsid w:val="05DBD9DC"/>
     <w:multiLevelType w:val="multilevel"/>
     <w:lvl w:ilvl="0">
       <w:start w:val="1"/>
@@ -20119,8 +21205,8 @@
       </w:pPr>
     </w:lvl>
   </w:abstractNum>
-  <w:abstractNum w:abstractNumId="991">
-    <w:nsid w:val="0000A991"/>
+  <w:abstractNum w:abstractNumId="1">
+    <w:nsid w:val="03FB830A"/>
     <w:multiLevelType w:val="multilevel"/>
     <w:lvl w:ilvl="0">
       <w:numFmt w:val="bullet"/>
@@ -20222,11 +21308,44 @@
       </w:rPr>
     </w:lvl>
   </w:abstractNum>
-  <w:num w:numId="1000">
-    <w:abstractNumId w:val="990"/>
+  <w:num w:numId="2">
+    <w:abstractNumId w:val="0"/>
+    <w:lvlOverride w:ilvl="0">
+      <w:startOverride w:val="1"/>
+    </w:lvlOverride>
+    <w:lvlOverride w:ilvl="1">
+      <w:startOverride w:val="1"/>
+    </w:lvlOverride>
+    <w:lvlOverride w:ilvl="2">
+      <w:startOverride w:val="1"/>
+    </w:lvlOverride>
+    <w:lvlOverride w:ilvl="3">
+      <w:startOverride w:val="1"/>
+    </w:lvlOverride>
+    <w:lvlOverride w:ilvl="4">
+      <w:startOverride w:val="1"/>
+    </w:lvlOverride>
+    <w:lvlOverride w:ilvl="5">
+      <w:startOverride w:val="1"/>
+    </w:lvlOverride>
+    <w:lvlOverride w:ilvl="6">
+      <w:startOverride w:val="1"/>
+    </w:lvlOverride>
+    <w:lvlOverride w:ilvl="7">
+      <w:startOverride w:val="1"/>
+    </w:lvlOverride>
+    <w:lvlOverride w:ilvl="8">
+      <w:startOverride w:val="1"/>
+    </w:lvlOverride>
+    <w:lvlOverride w:ilvl="0">
+      <w:startOverride w:val="1"/>
+    </w:lvlOverride>
   </w:num>
-  <w:num w:numId="1001">
-    <w:abstractNumId w:val="99201"/>
+  <w:num w:numId="3">
+    <w:abstractNumId w:val="1"/>
+  </w:num>
+  <w:num w:numId="4">
+    <w:abstractNumId w:val="0"/>
     <w:lvlOverride w:ilvl="0">
       <w:startOverride w:val="1"/>
     </w:lvlOverride>
@@ -20255,11 +21374,11 @@
       <w:startOverride w:val="1"/>
     </w:lvlOverride>
   </w:num>
-  <w:num w:numId="1002">
-    <w:abstractNumId w:val="991"/>
+  <w:num w:numId="5">
+    <w:abstractNumId w:val="1"/>
   </w:num>
-  <w:num w:numId="1003">
-    <w:abstractNumId w:val="99201"/>
+  <w:num w:numId="1">
+    <w:abstractNumId w:val="0"/>
     <w:lvlOverride w:ilvl="0">
       <w:startOverride w:val="1"/>
     </w:lvlOverride>
@@ -20288,188 +21407,109 @@
       <w:startOverride w:val="1"/>
     </w:lvlOverride>
   </w:num>
-  <w:num w:numId="1004">
-    <w:abstractNumId w:val="991"/>
-  </w:num>
 </w:numbering>
 </file>
 
 <file path=word/styles.xml><?xml version="1.0" encoding="utf-8"?>
-<w:styles xmlns:r="http://schemas.openxmlformats.org/officeDocument/2006/relationships" xmlns:w="http://schemas.openxmlformats.org/wordprocessingml/2006/main">
+<w:styles xmlns:w="http://schemas.openxmlformats.org/wordprocessingml/2006/main" xmlns:w14="http://schemas.microsoft.com/office/word/2010/wordml" xmlns:mc="http://schemas.openxmlformats.org/markup-compatibility/2006" mc:Ignorable="w14">
   <w:docDefaults>
     <w:rPrDefault>
       <w:rPr>
-        <w:rFonts w:asciiTheme="minorHAnsi" w:cstheme="minorBidi" w:eastAsiaTheme="minorEastAsia" w:hAnsiTheme="minorHAnsi"/>
+        <w:rFonts w:ascii="Liberation Serif" w:hAnsi="Liberation Serif" w:eastAsia="Noto Serif CJK SC" w:cs="Noto Sans Devanagari"/>
+        <w:kern w:val="2"/>
         <w:sz w:val="24"/>
         <w:szCs w:val="24"/>
-        <w:lang w:bidi="ar-SA" w:eastAsia="zh-CN" w:val="en"/>
+        <w:lang w:val="en-US" w:eastAsia="zh-CN" w:bidi="hi-IN"/>
       </w:rPr>
     </w:rPrDefault>
     <w:pPrDefault>
       <w:pPr>
-        <w:spacing w:after="200"/>
+        <w:suppressAutoHyphens w:val="true"/>
       </w:pPr>
     </w:pPrDefault>
   </w:docDefaults>
-  <w:latentStyles w:count="276" w:defLockedState="0" w:defQFormat="0" w:defSemiHidden="0" w:defUIPriority="0" w:defUnhideWhenUsed="0"/>
-  <w:style w:default="1" w:styleId="Normal" w:type="paragraph">
+  <w:style w:type="paragraph" w:styleId="Normal">
     <w:name w:val="Normal"/>
     <w:qFormat/>
+    <w:pPr>
+      <w:widowControl w:val="false"/>
+      <w:bidi w:val="0"/>
+    </w:pPr>
+    <w:rPr>
+      <w:rFonts w:ascii="Liberation Serif" w:hAnsi="Liberation Serif" w:eastAsia="Noto Serif CJK SC" w:cs="Noto Sans Devanagari"/>
+      <w:color w:val="auto"/>
+      <w:kern w:val="2"/>
+      <w:sz w:val="24"/>
+      <w:szCs w:val="24"/>
+      <w:lang w:val="en-US" w:eastAsia="zh-CN" w:bidi="hi-IN"/>
+    </w:rPr>
   </w:style>
-  <w:style w:styleId="BodyText" w:type="paragraph">
-    <w:name w:val="Body Text"/>
+  <w:style w:type="paragraph" w:styleId="Heading">
+    <w:name w:val="Heading"/>
     <w:basedOn w:val="Normal"/>
-    <w:link w:val="BodyTextChar"/>
+    <w:next w:val="BodyText"/>
     <w:qFormat/>
     <w:pPr>
-      <w:spacing w:after="180" w:before="180"/>
-    </w:pPr>
-  </w:style>
-  <w:style w:customStyle="1" w:styleId="FirstParagraph" w:type="paragraph">
-    <w:name w:val="First Paragraph"/>
-    <w:basedOn w:val="BodyText"/>
-    <w:next w:val="BodyText"/>
-    <w:qFormat/>
-  </w:style>
-  <w:style w:customStyle="1" w:styleId="Compact" w:type="paragraph">
-    <w:name w:val="Compact"/>
-    <w:basedOn w:val="BodyText"/>
-    <w:qFormat/>
-    <w:pPr>
-      <w:spacing w:after="36" w:before="36"/>
-    </w:pPr>
-  </w:style>
-  <w:style w:styleId="Title" w:type="paragraph">
-    <w:name w:val="Title"/>
-    <w:basedOn w:val="Normal"/>
-    <w:next w:val="BodyText"/>
-    <w:link w:val="TitleChar"/>
-    <w:uiPriority w:val="10"/>
-    <w:qFormat/>
-    <w:rsid w:val="00A10FD9"/>
-    <w:pPr>
-      <w:spacing w:after="80" w:line="240" w:lineRule="auto"/>
-      <w:contextualSpacing/>
-      <w:jc w:val="center"/>
+      <w:keepNext w:val="true"/>
+      <w:spacing w:before="240" w:after="120"/>
     </w:pPr>
     <w:rPr>
-      <w:rFonts w:asciiTheme="majorHAnsi" w:cstheme="majorBidi" w:eastAsiaTheme="majorEastAsia" w:hAnsiTheme="majorHAnsi"/>
-      <w:sz w:val="56"/>
-      <w:szCs w:val="56"/>
-    </w:rPr>
-  </w:style>
-  <w:style w:customStyle="1" w:styleId="TitleChar" w:type="character">
-    <w:name w:val="Title Char"/>
-    <w:basedOn w:val="DefaultParagraphFont"/>
-    <w:link w:val="Title"/>
-    <w:uiPriority w:val="10"/>
-    <w:rsid w:val="00A10FD9"/>
-    <w:rPr>
-      <w:rFonts w:asciiTheme="majorHAnsi" w:cstheme="majorBidi" w:eastAsiaTheme="majorEastAsia" w:hAnsiTheme="majorHAnsi"/>
-      <w:sz w:val="56"/>
-      <w:szCs w:val="56"/>
-    </w:rPr>
-  </w:style>
-  <w:style w:styleId="Subtitle" w:type="paragraph">
-    <w:name w:val="Subtitle"/>
-    <w:basedOn w:val="Title"/>
-    <w:next w:val="BodyText"/>
-    <w:link w:val="SubtitleChar"/>
-    <w:uiPriority w:val="11"/>
-    <w:qFormat/>
-    <w:rsid w:val="00A10FD9"/>
-    <w:pPr>
-      <w:numPr>
-        <w:ilvl w:val="1"/>
-      </w:numPr>
-    </w:pPr>
-    <w:rPr>
-      <w:rFonts w:cstheme="majorBidi" w:eastAsiaTheme="majorEastAsia"/>
-      <w:spacing w:val="15"/>
+      <w:rFonts w:ascii="Liberation Sans" w:hAnsi="Liberation Sans" w:eastAsia="Noto Sans CJK SC" w:cs="Noto Sans Devanagari"/>
       <w:sz w:val="28"/>
       <w:szCs w:val="28"/>
     </w:rPr>
   </w:style>
-  <w:style w:customStyle="1" w:styleId="SubtitleChar" w:type="character">
-    <w:name w:val="Subtitle Char"/>
-    <w:basedOn w:val="DefaultParagraphFont"/>
-    <w:link w:val="Subtitle"/>
-    <w:uiPriority w:val="11"/>
-    <w:rsid w:val="00A10FD9"/>
+  <w:style w:type="paragraph" w:styleId="BodyText">
+    <w:name w:val="Body Text"/>
+    <w:basedOn w:val="Normal"/>
+    <w:pPr>
+      <w:spacing w:lineRule="auto" w:line="276" w:before="0" w:after="140"/>
+    </w:pPr>
+    <w:rPr/>
+  </w:style>
+  <w:style w:type="paragraph" w:styleId="List">
+    <w:name w:val="List"/>
+    <w:basedOn w:val="BodyText"/>
+    <w:pPr/>
     <w:rPr>
-      <w:rFonts w:cstheme="majorBidi" w:eastAsiaTheme="majorEastAsia"/>
-      <w:color w:themeColor="text1" w:themeTint="A6" w:val="595959"/>
-      <w:spacing w:val="15"/>
-      <w:sz w:val="28"/>
-      <w:szCs w:val="28"/>
+      <w:rFonts w:cs="Noto Sans Devanagari"/>
     </w:rPr>
   </w:style>
-  <w:style w:customStyle="1" w:styleId="Author" w:type="paragraph">
-    <w:name w:val="Author"/>
-    <w:basedOn w:val="Title"/>
-    <w:next w:val="BodyText"/>
+  <w:style w:type="paragraph" w:styleId="Caption">
+    <w:name w:val="Caption"/>
+    <w:basedOn w:val="Normal"/>
     <w:qFormat/>
     <w:pPr>
-      <w:keepNext/>
-      <w:keepLines/>
+      <w:suppressLineNumbers/>
+      <w:spacing w:before="120" w:after="120"/>
     </w:pPr>
     <w:rPr>
+      <w:rFonts w:cs="Noto Sans Devanagari"/>
+      <w:i/>
+      <w:iCs/>
       <w:sz w:val="24"/>
       <w:szCs w:val="24"/>
     </w:rPr>
   </w:style>
-  <w:style w:styleId="Date" w:type="paragraph">
-    <w:name w:val="Date"/>
-    <w:basedOn w:val="Title"/>
-    <w:next w:val="BodyText"/>
+  <w:style w:type="paragraph" w:styleId="Index">
+    <w:name w:val="Index"/>
+    <w:basedOn w:val="Normal"/>
     <w:qFormat/>
     <w:pPr>
-      <w:keepNext/>
-      <w:keepLines/>
+      <w:suppressLineNumbers/>
     </w:pPr>
     <w:rPr>
-      <w:sz w:val="24"/>
-      <w:szCs w:val="24"/>
+      <w:rFonts w:cs="Noto Sans Devanagari"/>
     </w:rPr>
   </w:style>
-  <w:style w:customStyle="1" w:styleId="AbstractTitle" w:type="paragraph">
-    <w:name w:val="Abstract Title"/>
+  <w:style w:type="paragraph" w:styleId="TableContents">
+    <w:name w:val="Table Contents"/>
     <w:basedOn w:val="Normal"/>
-    <w:next w:val="Abstract"/>
     <w:qFormat/>
     <w:pPr>
-      <w:keepNext/>
-      <w:keepLines/>
-      <w:spacing w:after="0" w:before="300"/>
-      <w:jc w:val="center"/>
+      <w:widowControl w:val="false"/>
+      <w:suppressLineNumbers/>
     </w:pPr>
-    <w:rPr>
-      <w:b/>
-      <w:sz w:val="20"/>
-      <w:szCs w:val="20"/>
-    </w:rPr>
-  </w:style>
-  <w:style w:customStyle="1" w:styleId="Abstract" w:type="paragraph">
-    <w:name w:val="Abstract"/>
-    <w:basedOn w:val="Normal"/>
-    <w:next w:val="BodyText"/>
-    <w:qFormat/>
-    <w:pPr>
-      <w:keepNext/>
-      <w:keepLines/>
-      <w:spacing w:after="300" w:before="100"/>
-    </w:pPr>
-    <w:rPr>
-      <w:sz w:val="20"/>
-      <w:szCs w:val="20"/>
-    </w:rPr>
-  </w:style>
-  <w:style w:styleId="Bibliography" w:type="paragraph">
-    <w:name w:val="Bibliography"/>
-    <w:basedOn w:val="Normal"/>
-    <w:next w:val="Bibliography"/>
-    <w:qFormat/>
-    <w:pPr/>
     <w:rPr/>
   </w:style>
   <w:style w:styleId="Heading1" w:type="paragraph">
@@ -20492,6 +21532,25 @@
       <w:sz w:val="40"/>
       <w:szCs w:val="40"/>
     </w:rPr>
+  </w:style>
+  <w:style w:customStyle="1" w:styleId="Heading1Char" w:type="character">
+    <w:name w:val="Heading 1 Char"/>
+    <w:basedOn w:val="DefaultParagraphFont"/>
+    <w:link w:val="Heading1"/>
+    <w:uiPriority w:val="9"/>
+    <w:rsid w:val="00A10FD9"/>
+    <w:rPr>
+      <w:rFonts w:asciiTheme="majorHAnsi" w:cstheme="majorBidi" w:eastAsiaTheme="majorEastAsia" w:hAnsiTheme="majorHAnsi"/>
+      <w:color w:themeColor="accent1" w:themeShade="BF" w:val="0F4761"/>
+      <w:sz w:val="40"/>
+      <w:szCs w:val="40"/>
+    </w:rPr>
+  </w:style>
+  <w:style w:customStyle="1" w:styleId="FirstParagraph" w:type="paragraph">
+    <w:name w:val="First Paragraph"/>
+    <w:basedOn w:val="BodyText"/>
+    <w:next w:val="BodyText"/>
+    <w:qFormat/>
   </w:style>
   <w:style w:styleId="Heading2" w:type="paragraph">
     <w:name w:val="heading 2"/>
@@ -20516,6 +21575,39 @@
       <w:szCs w:val="32"/>
     </w:rPr>
   </w:style>
+  <w:style w:customStyle="1" w:styleId="Heading2Char" w:type="character">
+    <w:name w:val="Heading 2 Char"/>
+    <w:basedOn w:val="DefaultParagraphFont"/>
+    <w:link w:val="Heading2"/>
+    <w:uiPriority w:val="9"/>
+    <w:semiHidden/>
+    <w:rsid w:val="00A10FD9"/>
+    <w:rPr>
+      <w:rFonts w:asciiTheme="majorHAnsi" w:cstheme="majorBidi" w:eastAsiaTheme="majorEastAsia" w:hAnsiTheme="majorHAnsi"/>
+      <w:color w:themeColor="accent1" w:themeShade="BF" w:val="0F4761"/>
+      <w:sz w:val="32"/>
+      <w:szCs w:val="32"/>
+    </w:rPr>
+  </w:style>
+  <w:style w:customStyle="1" w:styleId="VerbatimChar" w:type="character">
+    <w:name w:val="Verbatim Char"/>
+    <w:basedOn w:val="BodyTextChar"/>
+    <w:rPr>
+      <w:rFonts w:ascii="Consolas" w:hAnsi="Consolas"/>
+      <w:sz w:val="22"/>
+    </w:rPr>
+  </w:style>
+  <w:style w:customStyle="1" w:styleId="CaptionedFigure" w:type="paragraph">
+    <w:name w:val="Captioned Figure"/>
+    <w:basedOn w:val="Figure"/>
+    <w:pPr>
+      <w:keepNext/>
+    </w:pPr>
+  </w:style>
+  <w:style w:customStyle="1" w:styleId="ImageCaption" w:type="paragraph">
+    <w:name w:val="Image Caption"/>
+    <w:basedOn w:val="Caption"/>
+  </w:style>
   <w:style w:styleId="Heading3" w:type="paragraph">
     <w:name w:val="heading 3"/>
     <w:basedOn w:val="Normal"/>
@@ -20539,165 +21631,6 @@
       <w:szCs w:val="28"/>
     </w:rPr>
   </w:style>
-  <w:style w:styleId="Heading4" w:type="paragraph">
-    <w:name w:val="heading 4"/>
-    <w:basedOn w:val="Normal"/>
-    <w:next w:val="BodyText"/>
-    <w:link w:val="Heading4Char"/>
-    <w:uiPriority w:val="9"/>
-    <w:semiHidden/>
-    <w:unhideWhenUsed/>
-    <w:qFormat/>
-    <w:rsid w:val="00A10FD9"/>
-    <w:pPr>
-      <w:keepNext/>
-      <w:keepLines/>
-      <w:spacing w:after="40" w:before="80"/>
-      <w:outlineLvl w:val="3"/>
-    </w:pPr>
-    <w:rPr>
-      <w:rFonts w:cstheme="majorBidi" w:eastAsiaTheme="majorEastAsia"/>
-      <w:i/>
-      <w:iCs/>
-      <w:color w:themeColor="accent1" w:themeShade="BF" w:val="0F4761"/>
-    </w:rPr>
-  </w:style>
-  <w:style w:styleId="Heading5" w:type="paragraph">
-    <w:name w:val="heading 5"/>
-    <w:basedOn w:val="Normal"/>
-    <w:next w:val="BodyText"/>
-    <w:link w:val="Heading5Char"/>
-    <w:uiPriority w:val="9"/>
-    <w:semiHidden/>
-    <w:unhideWhenUsed/>
-    <w:qFormat/>
-    <w:rsid w:val="00A10FD9"/>
-    <w:pPr>
-      <w:keepNext/>
-      <w:keepLines/>
-      <w:spacing w:after="40" w:before="80"/>
-      <w:outlineLvl w:val="4"/>
-    </w:pPr>
-    <w:rPr>
-      <w:rFonts w:cstheme="majorBidi" w:eastAsiaTheme="majorEastAsia"/>
-      <w:color w:themeColor="accent1" w:themeShade="BF" w:val="0F4761"/>
-    </w:rPr>
-  </w:style>
-  <w:style w:styleId="Heading6" w:type="paragraph">
-    <w:name w:val="heading 6"/>
-    <w:basedOn w:val="Normal"/>
-    <w:next w:val="BodyText"/>
-    <w:link w:val="Heading6Char"/>
-    <w:uiPriority w:val="9"/>
-    <w:semiHidden/>
-    <w:unhideWhenUsed/>
-    <w:qFormat/>
-    <w:rsid w:val="00A10FD9"/>
-    <w:pPr>
-      <w:keepNext/>
-      <w:keepLines/>
-      <w:spacing w:after="0" w:before="40"/>
-      <w:outlineLvl w:val="5"/>
-    </w:pPr>
-    <w:rPr>
-      <w:rFonts w:cstheme="majorBidi" w:eastAsiaTheme="majorEastAsia"/>
-      <w:i/>
-      <w:iCs/>
-      <w:color w:themeColor="text1" w:themeTint="A6" w:val="595959"/>
-    </w:rPr>
-  </w:style>
-  <w:style w:styleId="Heading7" w:type="paragraph">
-    <w:name w:val="heading 7"/>
-    <w:basedOn w:val="Normal"/>
-    <w:next w:val="BodyText"/>
-    <w:link w:val="Heading7Char"/>
-    <w:uiPriority w:val="9"/>
-    <w:semiHidden/>
-    <w:unhideWhenUsed/>
-    <w:qFormat/>
-    <w:rsid w:val="00A10FD9"/>
-    <w:pPr>
-      <w:keepNext/>
-      <w:keepLines/>
-      <w:spacing w:after="0" w:before="40"/>
-      <w:outlineLvl w:val="6"/>
-    </w:pPr>
-    <w:rPr>
-      <w:rFonts w:cstheme="majorBidi" w:eastAsiaTheme="majorEastAsia"/>
-      <w:color w:themeColor="text1" w:themeTint="A6" w:val="595959"/>
-    </w:rPr>
-  </w:style>
-  <w:style w:styleId="Heading8" w:type="paragraph">
-    <w:name w:val="heading 8"/>
-    <w:basedOn w:val="Normal"/>
-    <w:next w:val="BodyText"/>
-    <w:link w:val="Heading8Char"/>
-    <w:uiPriority w:val="9"/>
-    <w:semiHidden/>
-    <w:unhideWhenUsed/>
-    <w:qFormat/>
-    <w:rsid w:val="00A10FD9"/>
-    <w:pPr>
-      <w:keepNext/>
-      <w:keepLines/>
-      <w:spacing w:after="0"/>
-      <w:outlineLvl w:val="7"/>
-    </w:pPr>
-    <w:rPr>
-      <w:rFonts w:cstheme="majorBidi" w:eastAsiaTheme="majorEastAsia"/>
-      <w:i/>
-      <w:iCs/>
-      <w:color w:themeColor="text1" w:themeTint="D8" w:val="272727"/>
-    </w:rPr>
-  </w:style>
-  <w:style w:styleId="Heading9" w:type="paragraph">
-    <w:name w:val="heading 9"/>
-    <w:basedOn w:val="Normal"/>
-    <w:next w:val="BodyText"/>
-    <w:link w:val="Heading9Char"/>
-    <w:uiPriority w:val="9"/>
-    <w:semiHidden/>
-    <w:unhideWhenUsed/>
-    <w:qFormat/>
-    <w:rsid w:val="00A10FD9"/>
-    <w:pPr>
-      <w:keepNext/>
-      <w:keepLines/>
-      <w:spacing w:after="0"/>
-      <w:outlineLvl w:val="8"/>
-    </w:pPr>
-    <w:rPr>
-      <w:rFonts w:cstheme="majorBidi" w:eastAsiaTheme="majorEastAsia"/>
-      <w:color w:themeColor="text1" w:themeTint="D8" w:val="272727"/>
-    </w:rPr>
-  </w:style>
-  <w:style w:customStyle="1" w:styleId="Heading1Char" w:type="character">
-    <w:name w:val="Heading 1 Char"/>
-    <w:basedOn w:val="DefaultParagraphFont"/>
-    <w:link w:val="Heading1"/>
-    <w:uiPriority w:val="9"/>
-    <w:rsid w:val="00A10FD9"/>
-    <w:rPr>
-      <w:rFonts w:asciiTheme="majorHAnsi" w:cstheme="majorBidi" w:eastAsiaTheme="majorEastAsia" w:hAnsiTheme="majorHAnsi"/>
-      <w:color w:themeColor="accent1" w:themeShade="BF" w:val="0F4761"/>
-      <w:sz w:val="40"/>
-      <w:szCs w:val="40"/>
-    </w:rPr>
-  </w:style>
-  <w:style w:customStyle="1" w:styleId="Heading2Char" w:type="character">
-    <w:name w:val="Heading 2 Char"/>
-    <w:basedOn w:val="DefaultParagraphFont"/>
-    <w:link w:val="Heading2"/>
-    <w:uiPriority w:val="9"/>
-    <w:semiHidden/>
-    <w:rsid w:val="00A10FD9"/>
-    <w:rPr>
-      <w:rFonts w:asciiTheme="majorHAnsi" w:cstheme="majorBidi" w:eastAsiaTheme="majorEastAsia" w:hAnsiTheme="majorHAnsi"/>
-      <w:color w:themeColor="accent1" w:themeShade="BF" w:val="0F4761"/>
-      <w:sz w:val="32"/>
-      <w:szCs w:val="32"/>
-    </w:rPr>
-  </w:style>
   <w:style w:customStyle="1" w:styleId="Heading3Char" w:type="character">
     <w:name w:val="Heading 3 Char"/>
     <w:basedOn w:val="DefaultParagraphFont"/>
@@ -20712,120 +21645,13 @@
       <w:szCs w:val="28"/>
     </w:rPr>
   </w:style>
-  <w:style w:customStyle="1" w:styleId="Heading4Char" w:type="character">
-    <w:name w:val="Heading 4 Char"/>
-    <w:basedOn w:val="DefaultParagraphFont"/>
-    <w:link w:val="Heading4"/>
-    <w:uiPriority w:val="9"/>
-    <w:semiHidden/>
-    <w:rsid w:val="00A10FD9"/>
-    <w:rPr>
-      <w:rFonts w:cstheme="majorBidi" w:eastAsiaTheme="majorEastAsia"/>
-      <w:i/>
-      <w:iCs/>
-      <w:color w:themeColor="accent1" w:themeShade="BF" w:val="0F4761"/>
-    </w:rPr>
-  </w:style>
-  <w:style w:customStyle="1" w:styleId="Heading5Char" w:type="character">
-    <w:name w:val="Heading 5 Char"/>
-    <w:basedOn w:val="DefaultParagraphFont"/>
-    <w:link w:val="Heading5"/>
-    <w:uiPriority w:val="9"/>
-    <w:semiHidden/>
-    <w:rsid w:val="00A10FD9"/>
-    <w:rPr>
-      <w:rFonts w:cstheme="majorBidi" w:eastAsiaTheme="majorEastAsia"/>
-      <w:color w:themeColor="accent1" w:themeShade="BF" w:val="0F4761"/>
-    </w:rPr>
-  </w:style>
-  <w:style w:customStyle="1" w:styleId="Heading6Char" w:type="character">
-    <w:name w:val="Heading 6 Char"/>
-    <w:basedOn w:val="DefaultParagraphFont"/>
-    <w:link w:val="Heading6"/>
-    <w:uiPriority w:val="9"/>
-    <w:semiHidden/>
-    <w:rsid w:val="00A10FD9"/>
-    <w:rPr>
-      <w:rFonts w:cstheme="majorBidi" w:eastAsiaTheme="majorEastAsia"/>
-      <w:i/>
-      <w:iCs/>
-      <w:color w:themeColor="text1" w:themeTint="A6" w:val="595959"/>
-    </w:rPr>
-  </w:style>
-  <w:style w:customStyle="1" w:styleId="Heading7Char" w:type="character">
-    <w:name w:val="Heading 7 Char"/>
-    <w:basedOn w:val="DefaultParagraphFont"/>
-    <w:link w:val="Heading7"/>
-    <w:uiPriority w:val="9"/>
-    <w:semiHidden/>
-    <w:rsid w:val="00A10FD9"/>
-    <w:rPr>
-      <w:rFonts w:cstheme="majorBidi" w:eastAsiaTheme="majorEastAsia"/>
-      <w:color w:themeColor="text1" w:themeTint="A6" w:val="595959"/>
-    </w:rPr>
-  </w:style>
-  <w:style w:customStyle="1" w:styleId="Heading8Char" w:type="character">
-    <w:name w:val="Heading 8 Char"/>
-    <w:basedOn w:val="DefaultParagraphFont"/>
-    <w:link w:val="Heading8"/>
-    <w:uiPriority w:val="9"/>
-    <w:semiHidden/>
-    <w:rsid w:val="00A10FD9"/>
-    <w:rPr>
-      <w:rFonts w:cstheme="majorBidi" w:eastAsiaTheme="majorEastAsia"/>
-      <w:i/>
-      <w:iCs/>
-      <w:color w:themeColor="text1" w:themeTint="D8" w:val="272727"/>
-    </w:rPr>
-  </w:style>
-  <w:style w:customStyle="1" w:styleId="Heading9Char" w:type="character">
-    <w:name w:val="Heading 9 Char"/>
-    <w:basedOn w:val="DefaultParagraphFont"/>
-    <w:link w:val="Heading9"/>
-    <w:uiPriority w:val="9"/>
-    <w:semiHidden/>
-    <w:rsid w:val="00A10FD9"/>
-    <w:rPr>
-      <w:rFonts w:cstheme="majorBidi" w:eastAsiaTheme="majorEastAsia"/>
-      <w:color w:themeColor="text1" w:themeTint="D8" w:val="272727"/>
-    </w:rPr>
-  </w:style>
-  <w:style w:styleId="BlockText" w:type="paragraph">
-    <w:name w:val="Block Text"/>
+  <w:style w:customStyle="1" w:styleId="Compact" w:type="paragraph">
+    <w:name w:val="Compact"/>
     <w:basedOn w:val="BodyText"/>
-    <w:next w:val="BodyText"/>
-    <w:uiPriority w:val="9"/>
-    <w:unhideWhenUsed/>
     <w:qFormat/>
     <w:pPr>
-      <w:spacing w:after="100" w:before="100"/>
-      <w:ind w:firstLine="0" w:left="480" w:right="480"/>
+      <w:spacing w:after="36" w:before="36"/>
     </w:pPr>
-  </w:style>
-  <w:style w:styleId="FootnoteText" w:type="paragraph">
-    <w:name w:val="Footnote Text"/>
-    <w:basedOn w:val="Normal"/>
-    <w:next w:val="FootnoteText"/>
-    <w:uiPriority w:val="9"/>
-    <w:unhideWhenUsed/>
-    <w:qFormat/>
-  </w:style>
-  <w:style w:styleId="FootnoteBlockText" w:type="paragraph">
-    <w:name w:val="Footnote Block Text"/>
-    <w:basedOn w:val="FootnoteText"/>
-    <w:next w:val="FootnoteText"/>
-    <w:uiPriority w:val="9"/>
-    <w:unhideWhenUsed/>
-    <w:qFormat/>
-    <w:pPr>
-      <w:spacing w:after="100" w:before="100"/>
-      <w:ind w:firstLine="0" w:left="480" w:right="480"/>
-    </w:pPr>
-  </w:style>
-  <w:style w:default="1" w:styleId="DefaultParagraphFont" w:type="character">
-    <w:name w:val="Default Paragraph Font"/>
-    <w:semiHidden/>
-    <w:unhideWhenUsed/>
   </w:style>
   <w:style w:default="1" w:styleId="Table" w:type="table">
     <w:name w:val="Table"/>
@@ -20851,80 +21677,6 @@
       </w:tcPr>
     </w:tblStylePr>
   </w:style>
-  <w:style w:customStyle="1" w:styleId="DefinitionTerm" w:type="paragraph">
-    <w:name w:val="Definition Term"/>
-    <w:basedOn w:val="Normal"/>
-    <w:next w:val="Definition"/>
-    <w:pPr>
-      <w:keepNext/>
-      <w:keepLines/>
-      <w:spacing w:after="0"/>
-    </w:pPr>
-    <w:rPr>
-      <w:b/>
-    </w:rPr>
-  </w:style>
-  <w:style w:customStyle="1" w:styleId="Definition" w:type="paragraph">
-    <w:name w:val="Definition"/>
-    <w:basedOn w:val="Normal"/>
-  </w:style>
-  <w:style w:styleId="Caption" w:type="paragraph">
-    <w:name w:val="Caption"/>
-    <w:basedOn w:val="Normal"/>
-    <w:link w:val="BodyTextChar"/>
-    <w:pPr>
-      <w:spacing w:after="120" w:before="0"/>
-    </w:pPr>
-    <w:rPr>
-      <w:i/>
-    </w:rPr>
-  </w:style>
-  <w:style w:customStyle="1" w:styleId="TableCaption" w:type="paragraph">
-    <w:name w:val="Table Caption"/>
-    <w:basedOn w:val="Caption"/>
-    <w:pPr>
-      <w:keepNext/>
-    </w:pPr>
-  </w:style>
-  <w:style w:customStyle="1" w:styleId="ImageCaption" w:type="paragraph">
-    <w:name w:val="Image Caption"/>
-    <w:basedOn w:val="Caption"/>
-  </w:style>
-  <w:style w:customStyle="1" w:styleId="Figure" w:type="paragraph">
-    <w:name w:val="Figure"/>
-    <w:basedOn w:val="Normal"/>
-  </w:style>
-  <w:style w:customStyle="1" w:styleId="CaptionedFigure" w:type="paragraph">
-    <w:name w:val="Captioned Figure"/>
-    <w:basedOn w:val="Figure"/>
-    <w:pPr>
-      <w:keepNext/>
-    </w:pPr>
-  </w:style>
-  <w:style w:customStyle="1" w:styleId="BodyTextChar" w:type="character">
-    <w:name w:val="Body Text Char"/>
-    <w:basedOn w:val="DefaultParagraphFont"/>
-    <w:link w:val="BodyText"/>
-  </w:style>
-  <w:style w:customStyle="1" w:styleId="VerbatimChar" w:type="character">
-    <w:name w:val="Verbatim Char"/>
-    <w:basedOn w:val="BodyTextChar"/>
-    <w:rPr>
-      <w:rFonts w:ascii="Consolas" w:hAnsi="Consolas"/>
-      <w:sz w:val="22"/>
-    </w:rPr>
-  </w:style>
-  <w:style w:customStyle="1" w:styleId="SectionNumber" w:type="character">
-    <w:name w:val="Section Number"/>
-    <w:basedOn w:val="BodyTextChar"/>
-  </w:style>
-  <w:style w:styleId="FootnoteReference" w:type="character">
-    <w:name w:val="Footnote Reference"/>
-    <w:basedOn w:val="BodyTextChar"/>
-    <w:rPr>
-      <w:vertAlign w:val="superscript"/>
-    </w:rPr>
-  </w:style>
   <w:style w:styleId="Hyperlink" w:type="character">
     <w:name w:val="Hyperlink"/>
     <w:basedOn w:val="BodyTextChar"/>
@@ -20932,487 +21684,86 @@
       <w:color w:themeColor="accent1" w:val="4F81BD"/>
     </w:rPr>
   </w:style>
-  <w:style w:styleId="TOCHeading" w:type="paragraph">
-    <w:name w:val="TOC Heading"/>
-    <w:basedOn w:val="Heading1"/>
-    <w:next w:val="BodyText"/>
-    <w:uiPriority w:val="39"/>
-    <w:unhideWhenUsed/>
-    <w:qFormat/>
-    <w:pPr>
-      <w:spacing w:before="240" w:line="259" w:lineRule="auto"/>
-      <w:outlineLvl w:val="9"/>
-    </w:pPr>
-    <w:rPr>
-      <w:rFonts w:asciiTheme="majorHAnsi" w:cstheme="majorBidi" w:eastAsiaTheme="majorEastAsia" w:hAnsiTheme="majorHAnsi"/>
-      <w:b w:val="0"/>
-      <w:bCs w:val="0"/>
-      <w:color w:themeColor="accent1" w:themeShade="BF" w:val="365F91"/>
-    </w:rPr>
-  </w:style>
-  <w:style w:type="paragraph" w:customStyle="1" w:styleId="SourceCode">
-    <w:name w:val="Source Code"/>
-    <w:basedOn w:val="Normal"/>
-    <w:link w:val="VerbatimChar"/>
-    <w:pPr>
-      <w:wordWrap w:val="off"/>
-    </w:pPr>
-  </w:style>
-  <w:style w:type="character" w:customStyle="1" w:styleId="KeywordTok">
-    <w:name w:val="KeywordTok"/>
-    <w:basedOn w:val="VerbatimChar"/>
-    <w:rPr>
-      <w:b/>
-      <w:color w:val="007020"/>
-    </w:rPr>
-  </w:style>
-  <w:style w:type="character" w:customStyle="1" w:styleId="DataTypeTok">
-    <w:name w:val="DataTypeTok"/>
-    <w:basedOn w:val="VerbatimChar"/>
-    <w:rPr>
-      <w:color w:val="902000"/>
-    </w:rPr>
-  </w:style>
-  <w:style w:type="character" w:customStyle="1" w:styleId="DecValTok">
-    <w:name w:val="DecValTok"/>
-    <w:basedOn w:val="VerbatimChar"/>
-    <w:rPr>
-      <w:color w:val="40a070"/>
-    </w:rPr>
-  </w:style>
-  <w:style w:type="character" w:customStyle="1" w:styleId="BaseNTok">
-    <w:name w:val="BaseNTok"/>
-    <w:basedOn w:val="VerbatimChar"/>
-    <w:rPr>
-      <w:color w:val="40a070"/>
-    </w:rPr>
-  </w:style>
-  <w:style w:type="character" w:customStyle="1" w:styleId="FloatTok">
-    <w:name w:val="FloatTok"/>
-    <w:basedOn w:val="VerbatimChar"/>
-    <w:rPr>
-      <w:color w:val="40a070"/>
-    </w:rPr>
-  </w:style>
-  <w:style w:type="character" w:customStyle="1" w:styleId="ConstantTok">
-    <w:name w:val="ConstantTok"/>
-    <w:basedOn w:val="VerbatimChar"/>
-    <w:rPr>
-      <w:color w:val="880000"/>
-    </w:rPr>
-  </w:style>
-  <w:style w:type="character" w:customStyle="1" w:styleId="CharTok">
-    <w:name w:val="CharTok"/>
-    <w:basedOn w:val="VerbatimChar"/>
-    <w:rPr>
-      <w:color w:val="4070a0"/>
-    </w:rPr>
-  </w:style>
-  <w:style w:type="character" w:customStyle="1" w:styleId="SpecialCharTok">
-    <w:name w:val="SpecialCharTok"/>
-    <w:basedOn w:val="VerbatimChar"/>
-    <w:rPr>
-      <w:color w:val="4070a0"/>
-    </w:rPr>
-  </w:style>
-  <w:style w:type="character" w:customStyle="1" w:styleId="StringTok">
-    <w:name w:val="StringTok"/>
-    <w:basedOn w:val="VerbatimChar"/>
-    <w:rPr>
-      <w:color w:val="4070a0"/>
-    </w:rPr>
-  </w:style>
-  <w:style w:type="character" w:customStyle="1" w:styleId="VerbatimStringTok">
-    <w:name w:val="VerbatimStringTok"/>
-    <w:basedOn w:val="VerbatimChar"/>
-    <w:rPr>
-      <w:color w:val="4070a0"/>
-    </w:rPr>
-  </w:style>
-  <w:style w:type="character" w:customStyle="1" w:styleId="SpecialStringTok">
-    <w:name w:val="SpecialStringTok"/>
-    <w:basedOn w:val="VerbatimChar"/>
-    <w:rPr>
-      <w:color w:val="bb6688"/>
-    </w:rPr>
-  </w:style>
-  <w:style w:type="character" w:customStyle="1" w:styleId="ImportTok">
-    <w:name w:val="ImportTok"/>
-    <w:basedOn w:val="VerbatimChar"/>
-    <w:rPr>
-      <w:b/>
-      <w:color w:val="008000"/>
-    </w:rPr>
-  </w:style>
-  <w:style w:type="character" w:customStyle="1" w:styleId="CommentTok">
-    <w:name w:val="CommentTok"/>
-    <w:basedOn w:val="VerbatimChar"/>
-    <w:rPr>
-      <w:i/>
-      <w:color w:val="60a0b0"/>
-    </w:rPr>
-  </w:style>
-  <w:style w:type="character" w:customStyle="1" w:styleId="DocumentationTok">
-    <w:name w:val="DocumentationTok"/>
-    <w:basedOn w:val="VerbatimChar"/>
-    <w:rPr>
-      <w:i/>
-      <w:color w:val="ba2121"/>
-    </w:rPr>
-  </w:style>
-  <w:style w:type="character" w:customStyle="1" w:styleId="AnnotationTok">
-    <w:name w:val="AnnotationTok"/>
-    <w:basedOn w:val="VerbatimChar"/>
-    <w:rPr>
-      <w:b/>
-      <w:i/>
-      <w:color w:val="60a0b0"/>
-    </w:rPr>
-  </w:style>
-  <w:style w:type="character" w:customStyle="1" w:styleId="CommentVarTok">
-    <w:name w:val="CommentVarTok"/>
-    <w:basedOn w:val="VerbatimChar"/>
-    <w:rPr>
-      <w:b/>
-      <w:i/>
-      <w:color w:val="60a0b0"/>
-    </w:rPr>
-  </w:style>
-  <w:style w:type="character" w:customStyle="1" w:styleId="OtherTok">
-    <w:name w:val="OtherTok"/>
-    <w:basedOn w:val="VerbatimChar"/>
-    <w:rPr>
-      <w:color w:val="007020"/>
-    </w:rPr>
-  </w:style>
-  <w:style w:type="character" w:customStyle="1" w:styleId="FunctionTok">
-    <w:name w:val="FunctionTok"/>
-    <w:basedOn w:val="VerbatimChar"/>
-    <w:rPr>
-      <w:color w:val="06287e"/>
-    </w:rPr>
-  </w:style>
-  <w:style w:type="character" w:customStyle="1" w:styleId="VariableTok">
-    <w:name w:val="VariableTok"/>
-    <w:basedOn w:val="VerbatimChar"/>
-    <w:rPr>
-      <w:color w:val="19177c"/>
-    </w:rPr>
-  </w:style>
-  <w:style w:type="character" w:customStyle="1" w:styleId="ControlFlowTok">
-    <w:name w:val="ControlFlowTok"/>
-    <w:basedOn w:val="VerbatimChar"/>
-    <w:rPr>
-      <w:b/>
-      <w:color w:val="007020"/>
-    </w:rPr>
-  </w:style>
-  <w:style w:type="character" w:customStyle="1" w:styleId="OperatorTok">
-    <w:name w:val="OperatorTok"/>
-    <w:basedOn w:val="VerbatimChar"/>
-    <w:rPr>
-      <w:color w:val="666666"/>
-    </w:rPr>
-  </w:style>
-  <w:style w:type="character" w:customStyle="1" w:styleId="BuiltInTok">
-    <w:name w:val="BuiltInTok"/>
-    <w:basedOn w:val="VerbatimChar"/>
-    <w:rPr>
-      <w:color w:val="008000"/>
-    </w:rPr>
-  </w:style>
-  <w:style w:type="character" w:customStyle="1" w:styleId="ExtensionTok">
-    <w:name w:val="ExtensionTok"/>
-    <w:basedOn w:val="VerbatimChar"/>
-    <w:rPr/>
-  </w:style>
-  <w:style w:type="character" w:customStyle="1" w:styleId="PreprocessorTok">
-    <w:name w:val="PreprocessorTok"/>
-    <w:basedOn w:val="VerbatimChar"/>
-    <w:rPr>
-      <w:color w:val="bc7a00"/>
-    </w:rPr>
-  </w:style>
-  <w:style w:type="character" w:customStyle="1" w:styleId="AttributeTok">
-    <w:name w:val="AttributeTok"/>
-    <w:basedOn w:val="VerbatimChar"/>
-    <w:rPr>
-      <w:color w:val="7d9029"/>
-    </w:rPr>
-  </w:style>
-  <w:style w:type="character" w:customStyle="1" w:styleId="RegionMarkerTok">
-    <w:name w:val="RegionMarkerTok"/>
-    <w:basedOn w:val="VerbatimChar"/>
-    <w:rPr/>
-  </w:style>
-  <w:style w:type="character" w:customStyle="1" w:styleId="InformationTok">
-    <w:name w:val="InformationTok"/>
-    <w:basedOn w:val="VerbatimChar"/>
-    <w:rPr>
-      <w:b/>
-      <w:i/>
-      <w:color w:val="60a0b0"/>
-    </w:rPr>
-  </w:style>
-  <w:style w:type="character" w:customStyle="1" w:styleId="WarningTok">
-    <w:name w:val="WarningTok"/>
-    <w:basedOn w:val="VerbatimChar"/>
-    <w:rPr>
-      <w:b/>
-      <w:i/>
-      <w:color w:val="60a0b0"/>
-    </w:rPr>
-  </w:style>
-  <w:style w:type="character" w:customStyle="1" w:styleId="AlertTok">
-    <w:name w:val="AlertTok"/>
-    <w:basedOn w:val="VerbatimChar"/>
-    <w:rPr>
-      <w:b/>
-      <w:color w:val="ff0000"/>
-    </w:rPr>
-  </w:style>
-  <w:style w:type="character" w:customStyle="1" w:styleId="ErrorTok">
-    <w:name w:val="ErrorTok"/>
-    <w:basedOn w:val="VerbatimChar"/>
-    <w:rPr>
-      <w:b/>
-      <w:color w:val="ff0000"/>
-    </w:rPr>
-  </w:style>
-  <w:style w:type="character" w:customStyle="1" w:styleId="NormalTok">
-    <w:name w:val="NormalTok"/>
-    <w:basedOn w:val="VerbatimChar"/>
-    <w:rPr/>
-  </w:style>
 </w:styles>
 </file>
 
 <file path=word/theme/theme1.xml><?xml version="1.0" encoding="utf-8"?>
-<a:theme xmlns:a="http://schemas.openxmlformats.org/drawingml/2006/main" name="Office Theme">
+<a:theme xmlns:a="http://schemas.openxmlformats.org/drawingml/2006/main" xmlns:r="http://schemas.openxmlformats.org/officeDocument/2006/relationships" name="Office">
   <a:themeElements>
-    <a:clrScheme name="Office">
+    <a:clrScheme name="LibreOffice">
       <a:dk1>
-        <a:sysClr val="windowText" lastClr="000000"/>
+        <a:srgbClr val="000000"/>
       </a:dk1>
       <a:lt1>
-        <a:sysClr val="window" lastClr="FFFFFF"/>
+        <a:srgbClr val="ffffff"/>
       </a:lt1>
       <a:dk2>
-        <a:srgbClr val="0E2841"/>
+        <a:srgbClr val="000000"/>
       </a:dk2>
       <a:lt2>
-        <a:srgbClr val="E8E8E8"/>
+        <a:srgbClr val="ffffff"/>
       </a:lt2>
       <a:accent1>
-        <a:srgbClr val="156082"/>
+        <a:srgbClr val="18a303"/>
       </a:accent1>
       <a:accent2>
-        <a:srgbClr val="E97132"/>
+        <a:srgbClr val="0369a3"/>
       </a:accent2>
       <a:accent3>
-        <a:srgbClr val="196B24"/>
+        <a:srgbClr val="a33e03"/>
       </a:accent3>
       <a:accent4>
-        <a:srgbClr val="0F9ED5"/>
+        <a:srgbClr val="8e03a3"/>
       </a:accent4>
       <a:accent5>
-        <a:srgbClr val="A02B93"/>
+        <a:srgbClr val="c99c00"/>
       </a:accent5>
       <a:accent6>
-        <a:srgbClr val="4EA72E"/>
+        <a:srgbClr val="c9211e"/>
       </a:accent6>
       <a:hlink>
-        <a:srgbClr val="467886"/>
+        <a:srgbClr val="0000ee"/>
       </a:hlink>
       <a:folHlink>
-        <a:srgbClr val="96607D"/>
+        <a:srgbClr val="551a8b"/>
       </a:folHlink>
     </a:clrScheme>
     <a:fontScheme name="Office">
       <a:majorFont>
-        <a:latin typeface="Aptos Display" panose="02110004020202020204"/>
-        <a:ea typeface=""/>
-        <a:cs typeface=""/>
-        <a:font script="Jpan" typeface="游ゴシック Light"/>
-        <a:font script="Hang" typeface="맑은 고딕"/>
-        <a:font script="Hans" typeface="等线 Light"/>
-        <a:font script="Hant" typeface="新細明體"/>
-        <a:font script="Arab" typeface="Times New Roman"/>
-        <a:font script="Hebr" typeface="Times New Roman"/>
-        <a:font script="Thai" typeface="Angsana New"/>
-        <a:font script="Ethi" typeface="Nyala"/>
-        <a:font script="Beng" typeface="Vrinda"/>
-        <a:font script="Gujr" typeface="Shruti"/>
-        <a:font script="Khmr" typeface="MoolBoran"/>
-        <a:font script="Knda" typeface="Tunga"/>
-        <a:font script="Guru" typeface="Raavi"/>
-        <a:font script="Cans" typeface="Euphemia"/>
-        <a:font script="Cher" typeface="Plantagenet Cherokee"/>
-        <a:font script="Yiii" typeface="Microsoft Yi Baiti"/>
-        <a:font script="Tibt" typeface="Microsoft Himalaya"/>
-        <a:font script="Thaa" typeface="MV Boli"/>
-        <a:font script="Deva" typeface="Mangal"/>
-        <a:font script="Telu" typeface="Gautami"/>
-        <a:font script="Taml" typeface="Latha"/>
-        <a:font script="Syrc" typeface="Estrangelo Edessa"/>
-        <a:font script="Orya" typeface="Kalinga"/>
-        <a:font script="Mlym" typeface="Kartika"/>
-        <a:font script="Laoo" typeface="DokChampa"/>
-        <a:font script="Sinh" typeface="Iskoola Pota"/>
-        <a:font script="Mong" typeface="Mongolian Baiti"/>
-        <a:font script="Viet" typeface="Times New Roman"/>
-        <a:font script="Uigh" typeface="Microsoft Uighur"/>
-        <a:font script="Geor" typeface="Sylfaen"/>
-        <a:font script="Armn" typeface="Arial"/>
-        <a:font script="Bugi" typeface="Leelawadee UI"/>
-        <a:font script="Bopo" typeface="Microsoft JhengHei"/>
-        <a:font script="Java" typeface="Javanese Text"/>
-        <a:font script="Lisu" typeface="Segoe UI"/>
-        <a:font script="Mymr" typeface="Myanmar Text"/>
-        <a:font script="Nkoo" typeface="Ebrima"/>
-        <a:font script="Olck" typeface="Nirmala UI"/>
-        <a:font script="Osma" typeface="Ebrima"/>
-        <a:font script="Phag" typeface="Phagspa"/>
-        <a:font script="Syrn" typeface="Estrangelo Edessa"/>
-        <a:font script="Syrj" typeface="Estrangelo Edessa"/>
-        <a:font script="Syre" typeface="Estrangelo Edessa"/>
-        <a:font script="Sora" typeface="Nirmala UI"/>
-        <a:font script="Tale" typeface="Microsoft Tai Le"/>
-        <a:font script="Talu" typeface="Microsoft New Tai Lue"/>
-        <a:font script="Tfng" typeface="Ebrima"/>
+        <a:latin typeface="Arial" pitchFamily="0" charset="1"/>
+        <a:ea typeface="DejaVu Sans" pitchFamily="0" charset="1"/>
+        <a:cs typeface="DejaVu Sans" pitchFamily="0" charset="1"/>
       </a:majorFont>
       <a:minorFont>
-        <a:latin typeface="Aptos" panose="02110004020202020204"/>
-        <a:ea typeface=""/>
-        <a:cs typeface=""/>
-        <a:font script="Jpan" typeface="游明朝"/>
-        <a:font script="Hang" typeface="맑은 고딕"/>
-        <a:font script="Hans" typeface="等线"/>
-        <a:font script="Hant" typeface="新細明體"/>
-        <a:font script="Arab" typeface="Arial"/>
-        <a:font script="Hebr" typeface="Arial"/>
-        <a:font script="Thai" typeface="Cordia New"/>
-        <a:font script="Ethi" typeface="Nyala"/>
-        <a:font script="Beng" typeface="Vrinda"/>
-        <a:font script="Gujr" typeface="Shruti"/>
-        <a:font script="Khmr" typeface="DaunPenh"/>
-        <a:font script="Knda" typeface="Tunga"/>
-        <a:font script="Guru" typeface="Raavi"/>
-        <a:font script="Cans" typeface="Euphemia"/>
-        <a:font script="Cher" typeface="Plantagenet Cherokee"/>
-        <a:font script="Yiii" typeface="Microsoft Yi Baiti"/>
-        <a:font script="Tibt" typeface="Microsoft Himalaya"/>
-        <a:font script="Thaa" typeface="MV Boli"/>
-        <a:font script="Deva" typeface="Mangal"/>
-        <a:font script="Telu" typeface="Gautami"/>
-        <a:font script="Taml" typeface="Latha"/>
-        <a:font script="Syrc" typeface="Estrangelo Edessa"/>
-        <a:font script="Orya" typeface="Kalinga"/>
-        <a:font script="Mlym" typeface="Kartika"/>
-        <a:font script="Laoo" typeface="DokChampa"/>
-        <a:font script="Sinh" typeface="Iskoola Pota"/>
-        <a:font script="Mong" typeface="Mongolian Baiti"/>
-        <a:font script="Viet" typeface="Arial"/>
-        <a:font script="Uigh" typeface="Microsoft Uighur"/>
-        <a:font script="Geor" typeface="Sylfaen"/>
-        <a:font script="Armn" typeface="Arial"/>
-        <a:font script="Bugi" typeface="Leelawadee UI"/>
-        <a:font script="Bopo" typeface="Microsoft JhengHei"/>
-        <a:font script="Java" typeface="Javanese Text"/>
-        <a:font script="Lisu" typeface="Segoe UI"/>
-        <a:font script="Mymr" typeface="Myanmar Text"/>
-        <a:font script="Nkoo" typeface="Ebrima"/>
-        <a:font script="Olck" typeface="Nirmala UI"/>
-        <a:font script="Osma" typeface="Ebrima"/>
-        <a:font script="Phag" typeface="Phagspa"/>
-        <a:font script="Syrn" typeface="Estrangelo Edessa"/>
-        <a:font script="Syrj" typeface="Estrangelo Edessa"/>
-        <a:font script="Syre" typeface="Estrangelo Edessa"/>
-        <a:font script="Sora" typeface="Nirmala UI"/>
-        <a:font script="Tale" typeface="Microsoft Tai Le"/>
-        <a:font script="Talu" typeface="Microsoft New Tai Lue"/>
-        <a:font script="Tfng" typeface="Ebrima"/>
+        <a:latin typeface="Arial" pitchFamily="0" charset="1"/>
+        <a:ea typeface="DejaVu Sans" pitchFamily="0" charset="1"/>
+        <a:cs typeface="DejaVu Sans" pitchFamily="0" charset="1"/>
       </a:minorFont>
     </a:fontScheme>
-    <a:fmtScheme name="Office">
+    <a:fmtScheme>
       <a:fillStyleLst>
         <a:solidFill>
           <a:schemeClr val="phClr"/>
         </a:solidFill>
-        <a:gradFill rotWithShape="1">
-          <a:gsLst>
-            <a:gs pos="0">
-              <a:schemeClr val="phClr">
-                <a:lumMod val="110000"/>
-                <a:satMod val="105000"/>
-                <a:tint val="67000"/>
-              </a:schemeClr>
-            </a:gs>
-            <a:gs pos="50000">
-              <a:schemeClr val="phClr">
-                <a:lumMod val="105000"/>
-                <a:satMod val="103000"/>
-                <a:tint val="73000"/>
-              </a:schemeClr>
-            </a:gs>
-            <a:gs pos="100000">
-              <a:schemeClr val="phClr">
-                <a:lumMod val="105000"/>
-                <a:satMod val="109000"/>
-                <a:tint val="81000"/>
-              </a:schemeClr>
-            </a:gs>
-          </a:gsLst>
-          <a:lin ang="5400000" scaled="0"/>
-        </a:gradFill>
-        <a:gradFill rotWithShape="1">
-          <a:gsLst>
-            <a:gs pos="0">
-              <a:schemeClr val="phClr">
-                <a:satMod val="103000"/>
-                <a:lumMod val="102000"/>
-                <a:tint val="94000"/>
-              </a:schemeClr>
-            </a:gs>
-            <a:gs pos="50000">
-              <a:schemeClr val="phClr">
-                <a:satMod val="110000"/>
-                <a:lumMod val="100000"/>
-                <a:shade val="100000"/>
-              </a:schemeClr>
-            </a:gs>
-            <a:gs pos="100000">
-              <a:schemeClr val="phClr">
-                <a:lumMod val="99000"/>
-                <a:satMod val="120000"/>
-                <a:shade val="78000"/>
-              </a:schemeClr>
-            </a:gs>
-          </a:gsLst>
-          <a:lin ang="5400000" scaled="0"/>
-        </a:gradFill>
+        <a:solidFill>
+          <a:schemeClr val="phClr"/>
+        </a:solidFill>
+        <a:solidFill>
+          <a:schemeClr val="phClr"/>
+        </a:solidFill>
       </a:fillStyleLst>
       <a:lnStyleLst>
         <a:ln w="6350" cap="flat" cmpd="sng" algn="ctr">
-          <a:solidFill>
-            <a:schemeClr val="phClr"/>
-          </a:solidFill>
           <a:prstDash val="solid"/>
-          <a:miter lim="800000"/>
+          <a:miter/>
         </a:ln>
-        <a:ln w="12700" cap="flat" cmpd="sng" algn="ctr">
-          <a:solidFill>
-            <a:schemeClr val="phClr"/>
-          </a:solidFill>
+        <a:ln w="6350" cap="flat" cmpd="sng" algn="ctr">
           <a:prstDash val="solid"/>
-          <a:miter lim="800000"/>
+          <a:miter/>
         </a:ln>
-        <a:ln w="19050" cap="flat" cmpd="sng" algn="ctr">
-          <a:solidFill>
-            <a:schemeClr val="phClr"/>
-          </a:solidFill>
+        <a:ln w="6350" cap="flat" cmpd="sng" algn="ctr">
           <a:prstDash val="solid"/>
-          <a:miter lim="800000"/>
+          <a:miter/>
         </a:ln>
       </a:lnStyleLst>
       <a:effectStyleLst>
@@ -21423,13 +21774,7 @@
           <a:effectLst/>
         </a:effectStyle>
         <a:effectStyle>
-          <a:effectLst>
-            <a:outerShdw blurRad="57150" dist="19050" dir="5400000" algn="ctr" rotWithShape="0">
-              <a:srgbClr val="000000">
-                <a:alpha val="63000"/>
-              </a:srgbClr>
-            </a:outerShdw>
-          </a:effectLst>
+          <a:effectLst/>
         </a:effectStyle>
       </a:effectStyleLst>
       <a:bgFillStyleLst>
@@ -21437,47 +21782,13 @@
           <a:schemeClr val="phClr"/>
         </a:solidFill>
         <a:solidFill>
-          <a:schemeClr val="phClr">
-            <a:tint val="95000"/>
-            <a:satMod val="170000"/>
-          </a:schemeClr>
+          <a:schemeClr val="phClr"/>
         </a:solidFill>
-        <a:gradFill rotWithShape="1">
-          <a:gsLst>
-            <a:gs pos="0">
-              <a:schemeClr val="phClr">
-                <a:tint val="93000"/>
-                <a:satMod val="150000"/>
-                <a:shade val="98000"/>
-                <a:lumMod val="102000"/>
-              </a:schemeClr>
-            </a:gs>
-            <a:gs pos="50000">
-              <a:schemeClr val="phClr">
-                <a:tint val="98000"/>
-                <a:satMod val="130000"/>
-                <a:shade val="90000"/>
-                <a:lumMod val="103000"/>
-              </a:schemeClr>
-            </a:gs>
-            <a:gs pos="100000">
-              <a:schemeClr val="phClr">
-                <a:shade val="63000"/>
-                <a:satMod val="120000"/>
-              </a:schemeClr>
-            </a:gs>
-          </a:gsLst>
-          <a:lin ang="5400000" scaled="0"/>
-        </a:gradFill>
+        <a:solidFill>
+          <a:schemeClr val="phClr"/>
+        </a:solidFill>
       </a:bgFillStyleLst>
     </a:fmtScheme>
   </a:themeElements>
-  <a:objectDefaults/>
-  <a:extraClrSchemeLst/>
-  <a:extLst>
-    <a:ext uri="{05A4C25C-085E-4340-85A3-A5531E510DB2}">
-      <thm15:themeFamily xmlns:thm15="http://schemas.microsoft.com/office/thememl/2012/main" name="Office Theme" id="{2E142A2C-CD16-42D6-873A-C26D2A0506FA}" vid="{1BDDFF52-6CD6-40A5-AB3C-68EB2F1E4D0A}"/>
-    </a:ext>
-  </a:extLst>
 </a:theme>
 </file>
</xml_diff>

<commit_message>
Add the data and document where it comes from
- data/cryptic/: the CRyPTIC tables under GitHub's 100 MB limit (labels,
  samples, lineage, sites, lookups), downloaded from the EMBL-EBI FTP
- data/processed/: the exact tables the models used (isolate table,
  filtered mutation calls, feature matrix, transmission clusters)
- data/README.md: source, citation, terms of use, download dates and the
  upstream path of every file; the two large files (273 MB, 464 MB) and
  the WHO catalogue copy are linked and fetched by fetch_data.sh
- Report: Data section now states source, access link, download dates
  and citation terms; README data section expanded
</commit_message>
<xml_diff>
--- a/report/report.docx
+++ b/report/report.docx
@@ -2448,13 +2448,97 @@
           <w:b/>
           <w:bCs/>
         </w:rPr>
-        <w:t xml:space="preserve">Source.</w:t>
-      </w:r>
-      <w:r>
-        <w:t xml:space="preserve"> </w:t>
-      </w:r>
-      <w:r>
-        <w:t xml:space="preserve">CRyPTIC consortium, release June 2022 [1], public EBI FTP. We used the reuse table of 12,287 isolates with binary resistant/susceptible phenotypes</w:t>
+        <w:t xml:space="preserve">Source and access.</w:t>
+      </w:r>
+      <w:r>
+        <w:t xml:space="preserve"> </w:t>
+      </w:r>
+      <w:r>
+        <w:t xml:space="preserve">All data are public; no data were collected for this study and</w:t>
+      </w:r>
+      <w:r>
+        <w:t xml:space="preserve"> </w:t>
+      </w:r>
+      <w:r>
+        <w:t xml:space="preserve">no patient information is involved. The primary dataset is the CRyPTIC consortium data release of</w:t>
+      </w:r>
+      <w:r>
+        <w:t xml:space="preserve"> </w:t>
+      </w:r>
+      <w:r>
+        <w:t xml:space="preserve">June 2022 [1], downloaded from the EMBL-EBI public FTP server</w:t>
+      </w:r>
+      <w:r>
+        <w:t xml:space="preserve"> </w:t>
+      </w:r>
+      <w:r>
+        <w:t xml:space="preserve">(https://ftp.ebi.ac.uk/pub/databases/cryptic/release_june2022/) on 20 September and 4 October</w:t>
+      </w:r>
+      <w:r>
+        <w:t xml:space="preserve"> </w:t>
+      </w:r>
+      <w:r>
+        <w:t xml:space="preserve">2026. CRyPTIC provides these data for reuse on condition that its data paper [1] is cited. The</w:t>
+      </w:r>
+      <w:r>
+        <w:t xml:space="preserve"> </w:t>
+      </w:r>
+      <w:r>
+        <w:t xml:space="preserve">WHO 2023 mutation catalogue [2] was taken in machine-readable form from</w:t>
+      </w:r>
+      <w:r>
+        <w:t xml:space="preserve"> </w:t>
+      </w:r>
+      <w:r>
+        <w:t xml:space="preserve">https://github.com/oxfordmmm/tuberculosis_amr_catalogues and used only as a benchmark. The</w:t>
+      </w:r>
+      <w:r>
+        <w:t xml:space="preserve"> </w:t>
+      </w:r>
+      <w:r>
+        <w:t xml:space="preserve">exact files, their upstream paths and the processed tables are listed in the repository's</w:t>
+      </w:r>
+      <w:r>
+        <w:t xml:space="preserve"> </w:t>
+      </w:r>
+      <w:r>
+        <w:rPr>
+          <w:rStyle w:val="VerbatimChar"/>
+        </w:rPr>
+        <w:t xml:space="preserve">data/README.md</w:t>
+      </w:r>
+      <w:r>
+        <w:t xml:space="preserve"> </w:t>
+      </w:r>
+      <w:r>
+        <w:t xml:space="preserve">(see Resources).</w:t>
+      </w:r>
+    </w:p>
+    <w:p>
+      <w:pPr>
+        <w:pStyle w:val="BodyText"/>
+      </w:pPr>
+      <w:r>
+        <w:rPr>
+          <w:b/>
+          <w:bCs/>
+        </w:rPr>
+        <w:t xml:space="preserve">Tables used.</w:t>
+      </w:r>
+      <w:r>
+        <w:t xml:space="preserve"> </w:t>
+      </w:r>
+      <w:r>
+        <w:t xml:space="preserve">We used the reuse table (</w:t>
+      </w:r>
+      <w:r>
+        <w:rPr>
+          <w:rStyle w:val="VerbatimChar"/>
+        </w:rPr>
+        <w:t xml:space="preserve">CRyPTIC_reuse_table_20240917.csv</w:t>
+      </w:r>
+      <w:r>
+        <w:t xml:space="preserve">) of 12,287 isolates with binary resistant/susceptible phenotypes</w:t>
       </w:r>
       <w:r>
         <w:t xml:space="preserve"> </w:t>
@@ -21512,7 +21596,28 @@
         <w:t xml:space="preserve"> </w:t>
       </w:r>
       <w:r>
-        <w:t xml:space="preserve">CRyPTIC consortium, release June 2022 —</w:t>
+        <w:t xml:space="preserve">CRyPTIC consortium, data release June 2022 (cite [1]); the files used and</w:t>
+      </w:r>
+      <w:r>
+        <w:t xml:space="preserve"> </w:t>
+      </w:r>
+      <w:r>
+        <w:t xml:space="preserve">their upstream paths are listed in</w:t>
+      </w:r>
+      <w:r>
+        <w:t xml:space="preserve"> </w:t>
+      </w:r>
+      <w:r>
+        <w:rPr>
+          <w:rStyle w:val="VerbatimChar"/>
+        </w:rPr>
+        <w:t xml:space="preserve">data/README.md</w:t>
+      </w:r>
+      <w:r>
+        <w:t xml:space="preserve"> </w:t>
+      </w:r>
+      <w:r>
+        <w:t xml:space="preserve">in the code repository —</w:t>
       </w:r>
       <w:r>
         <w:t xml:space="preserve"> </w:t>
@@ -21687,7 +21792,7 @@
 <file path=word/numbering.xml><?xml version="1.0" encoding="utf-8"?>
 <w:numbering xmlns:wpc="http://schemas.microsoft.com/office/word/2010/wordprocessingCanvas" xmlns:mo="http://schemas.microsoft.com/office/mac/office/2008/main" xmlns:mc="http://schemas.openxmlformats.org/markup-compatibility/2006" xmlns:mv="urn:schemas-microsoft-com:mac:vml" xmlns:o="urn:schemas-microsoft-com:office:office" xmlns:r="http://schemas.openxmlformats.org/officeDocument/2006/relationships" xmlns:m="http://schemas.openxmlformats.org/officeDocument/2006/math" xmlns:v="urn:schemas-microsoft-com:vml" xmlns:wp14="http://schemas.microsoft.com/office/word/2010/wordprocessingDrawing" xmlns:wp="http://schemas.openxmlformats.org/drawingml/2006/wordprocessingDrawing" xmlns:w10="urn:schemas-microsoft-com:office:word" xmlns:w="http://schemas.openxmlformats.org/wordprocessingml/2006/main" xmlns:w14="http://schemas.microsoft.com/office/word/2010/wordml" xmlns:w15="http://schemas.microsoft.com/office/word/2012/wordml" xmlns:wpg="http://schemas.microsoft.com/office/word/2010/wordprocessingGroup" xmlns:wpi="http://schemas.microsoft.com/office/word/2010/wordprocessingInk" xmlns:wne="http://schemas.microsoft.com/office/word/2006/wordml" xmlns:wps="http://schemas.microsoft.com/office/word/2010/wordprocessingShape" mc:Ignorable="w14 w15 wp14">
   <w:abstractNum w:abstractNumId="0">
-    <w:nsid w:val="00B73145"/>
+    <w:nsid w:val="04FAAFC7"/>
     <w:multiLevelType w:val="multilevel"/>
     <w:lvl w:ilvl="0">
       <w:start w:val="1"/>
@@ -21772,7 +21877,7 @@
     </w:lvl>
   </w:abstractNum>
   <w:abstractNum w:abstractNumId="1">
-    <w:nsid w:val="0144A60D"/>
+    <w:nsid w:val="0498B1DB"/>
     <w:multiLevelType w:val="multilevel"/>
     <w:lvl w:ilvl="0">
       <w:numFmt w:val="bullet"/>

</xml_diff>

<commit_message>
Write the report in first person singular
Solo project: "What We Did and What We Achieved" becomes "What I Did and
What I Achieved", and the remaining "we"/"our" in the report and
data/README.md are reworded.
</commit_message>
<xml_diff>
--- a/report/report.docx
+++ b/report/report.docx
@@ -1365,7 +1365,7 @@
         <w:t xml:space="preserve"> </w:t>
       </w:r>
       <w:r>
-        <w:t xml:space="preserve">12,287 isolates with laboratory-confirmed resistance, we built a binary feature matrix of</w:t>
+        <w:t xml:space="preserve">12,287 isolates with laboratory-confirmed resistance, I built a binary feature matrix of</w:t>
       </w:r>
       <w:r>
         <w:t xml:space="preserve"> </w:t>
@@ -1559,13 +1559,13 @@
         <w:t xml:space="preserve"> </w:t>
       </w:r>
       <w:r>
-        <w:t xml:space="preserve">(including Bangladesh) has mostly lineages 1 and 3. We asked: do these models still work on South</w:t>
-      </w:r>
-      <w:r>
-        <w:t xml:space="preserve"> </w:t>
-      </w:r>
-      <w:r>
-        <w:t xml:space="preserve">Asian TB? We trained four kinds of model only on isolates from outside South Asia</w:t>
+        <w:t xml:space="preserve">(including Bangladesh) has mostly lineages 1 and 3. I asked: do these models still work on South</w:t>
+      </w:r>
+      <w:r>
+        <w:t xml:space="preserve"> </w:t>
+      </w:r>
+      <w:r>
+        <w:t xml:space="preserve">Asian TB? I trained four kinds of model only on isolates from outside South Asia</w:t>
       </w:r>
       <w:r>
         <w:t xml:space="preserve"> </w:t>
@@ -1634,24 +1634,24 @@
         <w:t xml:space="preserve">built from its own lineages.</w:t>
       </w:r>
     </w:p>
-    <w:bookmarkStart w:id="1" w:name="X3fa15ddfd5577bd02a8489a8e2097ee0f1f5841"/>
+    <w:bookmarkStart w:id="1" w:name="X5ca201800c9784942896aa6e7bf9fcd36c0c144"/>
     <w:p>
       <w:pPr>
         <w:pStyle w:val="Heading2"/>
         <w:keepNext/>
       </w:pPr>
       <w:r>
-        <w:t xml:space="preserve">Work Summary: What We Did and What We Achieved</w:t>
+        <w:t xml:space="preserve">Work Summary: What I Did and What I Achieved</w:t>
       </w:r>
     </w:p>
-    <w:bookmarkStart w:id="2" w:name="what-we-did"/>
+    <w:bookmarkStart w:id="2" w:name="what-i-did"/>
     <w:p>
       <w:pPr>
         <w:pStyle w:val="Heading3"/>
         <w:keepNext/>
       </w:pPr>
       <w:r>
-        <w:t xml:space="preserve">What we did</w:t>
+        <w:t xml:space="preserve">What I did</w:t>
       </w:r>
     </w:p>
     <w:p>
@@ -1937,14 +1937,14 @@
       </w:r>
     </w:p>
     <w:bookmarkEnd w:id="0"/>
-    <w:bookmarkStart w:id="3" w:name="what-we-achieved"/>
+    <w:bookmarkStart w:id="3" w:name="what-i-achieved"/>
     <w:p>
       <w:pPr>
         <w:pStyle w:val="Heading3"/>
         <w:keepNext/>
       </w:pPr>
       <w:r>
-        <w:t xml:space="preserve">What we achieved</w:t>
+        <w:t xml:space="preserve">What I achieved</w:t>
       </w:r>
     </w:p>
     <w:p>
@@ -2454,7 +2454,7 @@
         <w:t xml:space="preserve"> </w:t>
       </w:r>
       <w:r>
-        <w:t xml:space="preserve">All data are public; no data were collected for this study and</w:t>
+        <w:t xml:space="preserve">All data are public; no new data were collected for this study and</w:t>
       </w:r>
       <w:r>
         <w:t xml:space="preserve"> </w:t>
@@ -2529,7 +2529,7 @@
         <w:t xml:space="preserve"> </w:t>
       </w:r>
       <w:r>
-        <w:t xml:space="preserve">We used the reuse table (</w:t>
+        <w:t xml:space="preserve">I used the reuse table (</w:t>
       </w:r>
       <w:r>
         <w:rPr>
@@ -3162,7 +3162,7 @@
         <w:t xml:space="preserve"> </w:t>
       </w:r>
       <w:r>
-        <w:t xml:space="preserve">and indel rules. Applied to all isolates, our implementation gives sensitivity/specificity of</w:t>
+        <w:t xml:space="preserve">and indel rules. Applied to all isolates, my implementation gives sensitivity/specificity of</w:t>
       </w:r>
       <w:r>
         <w:t xml:space="preserve"> </w:t>
@@ -21792,7 +21792,7 @@
 <file path=word/numbering.xml><?xml version="1.0" encoding="utf-8"?>
 <w:numbering xmlns:wpc="http://schemas.microsoft.com/office/word/2010/wordprocessingCanvas" xmlns:mo="http://schemas.microsoft.com/office/mac/office/2008/main" xmlns:mc="http://schemas.openxmlformats.org/markup-compatibility/2006" xmlns:mv="urn:schemas-microsoft-com:mac:vml" xmlns:o="urn:schemas-microsoft-com:office:office" xmlns:r="http://schemas.openxmlformats.org/officeDocument/2006/relationships" xmlns:m="http://schemas.openxmlformats.org/officeDocument/2006/math" xmlns:v="urn:schemas-microsoft-com:vml" xmlns:wp14="http://schemas.microsoft.com/office/word/2010/wordprocessingDrawing" xmlns:wp="http://schemas.openxmlformats.org/drawingml/2006/wordprocessingDrawing" xmlns:w10="urn:schemas-microsoft-com:office:word" xmlns:w="http://schemas.openxmlformats.org/wordprocessingml/2006/main" xmlns:w14="http://schemas.microsoft.com/office/word/2010/wordml" xmlns:w15="http://schemas.microsoft.com/office/word/2012/wordml" xmlns:wpg="http://schemas.microsoft.com/office/word/2010/wordprocessingGroup" xmlns:wpi="http://schemas.microsoft.com/office/word/2010/wordprocessingInk" xmlns:wne="http://schemas.microsoft.com/office/word/2006/wordml" xmlns:wps="http://schemas.microsoft.com/office/word/2010/wordprocessingShape" mc:Ignorable="w14 w15 wp14">
   <w:abstractNum w:abstractNumId="0">
-    <w:nsid w:val="04FAAFC7"/>
+    <w:nsid w:val="0593CEE7"/>
     <w:multiLevelType w:val="multilevel"/>
     <w:lvl w:ilvl="0">
       <w:start w:val="1"/>
@@ -21877,7 +21877,7 @@
     </w:lvl>
   </w:abstractNum>
   <w:abstractNum w:abstractNumId="1">
-    <w:nsid w:val="0498B1DB"/>
+    <w:nsid w:val="01FFA923"/>
     <w:multiLevelType w:val="multilevel"/>
     <w:lvl w:ilvl="0">
       <w:numFmt w:val="bullet"/>

</xml_diff>